<commit_message>
Informe, inciso 4 y5
Se agrega al informe los resultados del inciso 4 y 5
</commit_message>
<xml_diff>
--- a/INFORME.docx
+++ b/INFORME.docx
@@ -647,25 +647,7 @@
               <w:rPr>
                 <w:lang w:val="en-US"/>
               </w:rPr>
-              <w:t>pen</w:t>
-            </w:r>
-            <w:r>
-              <w:rPr>
-                <w:lang w:val="en-US"/>
-              </w:rPr>
-              <w:t>alty:</w:t>
-            </w:r>
-            <w:r>
-              <w:rPr>
-                <w:lang w:val="en-US"/>
-              </w:rPr>
-              <w:t xml:space="preserve"> </w:t>
-            </w:r>
-            <w:r>
-              <w:rPr>
-                <w:lang w:val="en-US"/>
-              </w:rPr>
-              <w:t>l2</w:t>
+              <w:t>penalty: l2</w:t>
             </w:r>
           </w:p>
           <w:p>
@@ -724,13 +706,22 @@
           <w:p>
             <w:pPr>
               <w:jc w:val="center"/>
+              <w:rPr>
+                <w:lang w:val="en-US"/>
+              </w:rPr>
             </w:pPr>
             <w:proofErr w:type="spellStart"/>
             <w:r>
+              <w:rPr>
+                <w:lang w:val="en-US"/>
+              </w:rPr>
               <w:t>max_depth</w:t>
             </w:r>
             <w:proofErr w:type="spellEnd"/>
             <w:r>
+              <w:rPr>
+                <w:lang w:val="en-US"/>
+              </w:rPr>
               <w:t>: 7</w:t>
             </w:r>
           </w:p>
@@ -858,13 +849,7 @@
               <w:rPr>
                 <w:lang w:val="en-US"/>
               </w:rPr>
-              <w:t>:</w:t>
-            </w:r>
-            <w:r>
-              <w:rPr>
-                <w:lang w:val="en-US"/>
-              </w:rPr>
-              <w:t xml:space="preserve"> 1</w:t>
+              <w:t>: 1</w:t>
             </w:r>
           </w:p>
           <w:p>
@@ -1012,13 +997,19 @@
         <w:rPr>
           <w:lang w:val="es-US"/>
         </w:rPr>
-        <w:t xml:space="preserve"> Métricas de los m</w:t>
-      </w:r>
-      <w:r>
-        <w:rPr>
-          <w:lang w:val="es-US"/>
-        </w:rPr>
-        <w:t>odelos usados en la predicción de presencia alta y baja de cianobacterias, en píxeles originales</w:t>
+        <w:t xml:space="preserve"> Métricas de los modelos usados en la predicción de presencia alta y baja de cianobacterias</w:t>
+      </w:r>
+      <w:r>
+        <w:rPr>
+          <w:lang w:val="es-US"/>
+        </w:rPr>
+        <w:t xml:space="preserve"> co</w:t>
+      </w:r>
+      <w:r>
+        <w:rPr>
+          <w:lang w:val="es-US"/>
+        </w:rPr>
+        <w:t>n píxeles originales</w:t>
       </w:r>
       <w:r>
         <w:rPr>
@@ -1040,15 +1031,16 @@
         <w:tblLook w:val="04A0" w:firstRow="1" w:lastRow="0" w:firstColumn="1" w:lastColumn="0" w:noHBand="0" w:noVBand="1"/>
       </w:tblPr>
       <w:tblGrid>
-        <w:gridCol w:w="2207"/>
-        <w:gridCol w:w="2207"/>
-        <w:gridCol w:w="2207"/>
-        <w:gridCol w:w="2207"/>
+        <w:gridCol w:w="2263"/>
+        <w:gridCol w:w="1701"/>
+        <w:gridCol w:w="1843"/>
+        <w:gridCol w:w="1490"/>
+        <w:gridCol w:w="1531"/>
       </w:tblGrid>
       <w:tr>
         <w:tc>
           <w:tcPr>
-            <w:tcW w:w="2207" w:type="dxa"/>
+            <w:tcW w:w="2263" w:type="dxa"/>
           </w:tcPr>
           <w:p>
             <w:pPr>
@@ -1071,7 +1063,7 @@
         </w:tc>
         <w:tc>
           <w:tcPr>
-            <w:tcW w:w="2207" w:type="dxa"/>
+            <w:tcW w:w="1701" w:type="dxa"/>
           </w:tcPr>
           <w:p>
             <w:pPr>
@@ -1096,7 +1088,7 @@
         </w:tc>
         <w:tc>
           <w:tcPr>
-            <w:tcW w:w="2207" w:type="dxa"/>
+            <w:tcW w:w="1843" w:type="dxa"/>
           </w:tcPr>
           <w:p>
             <w:pPr>
@@ -1121,7 +1113,7 @@
         </w:tc>
         <w:tc>
           <w:tcPr>
-            <w:tcW w:w="2207" w:type="dxa"/>
+            <w:tcW w:w="1490" w:type="dxa"/>
           </w:tcPr>
           <w:p>
             <w:pPr>
@@ -1139,6 +1131,29 @@
                 <w:lang w:val="es-US"/>
               </w:rPr>
               <w:t>F1-score</w:t>
+            </w:r>
+          </w:p>
+        </w:tc>
+        <w:tc>
+          <w:tcPr>
+            <w:tcW w:w="1531" w:type="dxa"/>
+          </w:tcPr>
+          <w:p>
+            <w:pPr>
+              <w:jc w:val="center"/>
+              <w:rPr>
+                <w:b/>
+                <w:bCs/>
+                <w:lang w:val="es-US"/>
+              </w:rPr>
+            </w:pPr>
+            <w:r>
+              <w:rPr>
+                <w:b/>
+                <w:bCs/>
+                <w:lang w:val="es-US"/>
+              </w:rPr>
+              <w:t>ROC-AUC</w:t>
             </w:r>
           </w:p>
         </w:tc>
@@ -1146,7 +1161,7 @@
       <w:tr>
         <w:tc>
           <w:tcPr>
-            <w:tcW w:w="2207" w:type="dxa"/>
+            <w:tcW w:w="2263" w:type="dxa"/>
           </w:tcPr>
           <w:p>
             <w:pPr>
@@ -1165,7 +1180,7 @@
         </w:tc>
         <w:tc>
           <w:tcPr>
-            <w:tcW w:w="2207" w:type="dxa"/>
+            <w:tcW w:w="1701" w:type="dxa"/>
           </w:tcPr>
           <w:p>
             <w:pPr>
@@ -1184,7 +1199,7 @@
         </w:tc>
         <w:tc>
           <w:tcPr>
-            <w:tcW w:w="2207" w:type="dxa"/>
+            <w:tcW w:w="1843" w:type="dxa"/>
           </w:tcPr>
           <w:p>
             <w:pPr>
@@ -1203,7 +1218,7 @@
         </w:tc>
         <w:tc>
           <w:tcPr>
-            <w:tcW w:w="2207" w:type="dxa"/>
+            <w:tcW w:w="1490" w:type="dxa"/>
           </w:tcPr>
           <w:p>
             <w:pPr>
@@ -1217,6 +1232,25 @@
                 <w:lang w:val="es-US"/>
               </w:rPr>
               <w:t>0.9218</w:t>
+            </w:r>
+          </w:p>
+        </w:tc>
+        <w:tc>
+          <w:tcPr>
+            <w:tcW w:w="1531" w:type="dxa"/>
+          </w:tcPr>
+          <w:p>
+            <w:pPr>
+              <w:jc w:val="center"/>
+              <w:rPr>
+                <w:lang w:val="es-US"/>
+              </w:rPr>
+            </w:pPr>
+            <w:r>
+              <w:rPr>
+                <w:lang w:val="es-US"/>
+              </w:rPr>
+              <w:t>0.9692</w:t>
             </w:r>
           </w:p>
         </w:tc>
@@ -1224,7 +1258,7 @@
       <w:tr>
         <w:tc>
           <w:tcPr>
-            <w:tcW w:w="2207" w:type="dxa"/>
+            <w:tcW w:w="2263" w:type="dxa"/>
           </w:tcPr>
           <w:p>
             <w:pPr>
@@ -1243,7 +1277,7 @@
         </w:tc>
         <w:tc>
           <w:tcPr>
-            <w:tcW w:w="2207" w:type="dxa"/>
+            <w:tcW w:w="1701" w:type="dxa"/>
           </w:tcPr>
           <w:p>
             <w:pPr>
@@ -1262,7 +1296,7 @@
         </w:tc>
         <w:tc>
           <w:tcPr>
-            <w:tcW w:w="2207" w:type="dxa"/>
+            <w:tcW w:w="1843" w:type="dxa"/>
           </w:tcPr>
           <w:p>
             <w:pPr>
@@ -1281,7 +1315,7 @@
         </w:tc>
         <w:tc>
           <w:tcPr>
-            <w:tcW w:w="2207" w:type="dxa"/>
+            <w:tcW w:w="1490" w:type="dxa"/>
           </w:tcPr>
           <w:p>
             <w:pPr>
@@ -1295,6 +1329,25 @@
                 <w:lang w:val="es-US"/>
               </w:rPr>
               <w:t>0.9251</w:t>
+            </w:r>
+          </w:p>
+        </w:tc>
+        <w:tc>
+          <w:tcPr>
+            <w:tcW w:w="1531" w:type="dxa"/>
+          </w:tcPr>
+          <w:p>
+            <w:pPr>
+              <w:jc w:val="center"/>
+              <w:rPr>
+                <w:lang w:val="es-US"/>
+              </w:rPr>
+            </w:pPr>
+            <w:r>
+              <w:rPr>
+                <w:lang w:val="es-US"/>
+              </w:rPr>
+              <w:t>0.9717</w:t>
             </w:r>
           </w:p>
         </w:tc>
@@ -1302,7 +1355,7 @@
       <w:tr>
         <w:tc>
           <w:tcPr>
-            <w:tcW w:w="2207" w:type="dxa"/>
+            <w:tcW w:w="2263" w:type="dxa"/>
           </w:tcPr>
           <w:p>
             <w:pPr>
@@ -1323,7 +1376,7 @@
         </w:tc>
         <w:tc>
           <w:tcPr>
-            <w:tcW w:w="2207" w:type="dxa"/>
+            <w:tcW w:w="1701" w:type="dxa"/>
           </w:tcPr>
           <w:p>
             <w:pPr>
@@ -1342,7 +1395,7 @@
         </w:tc>
         <w:tc>
           <w:tcPr>
-            <w:tcW w:w="2207" w:type="dxa"/>
+            <w:tcW w:w="1843" w:type="dxa"/>
           </w:tcPr>
           <w:p>
             <w:pPr>
@@ -1361,7 +1414,7 @@
         </w:tc>
         <w:tc>
           <w:tcPr>
-            <w:tcW w:w="2207" w:type="dxa"/>
+            <w:tcW w:w="1490" w:type="dxa"/>
           </w:tcPr>
           <w:p>
             <w:pPr>
@@ -1378,6 +1431,25 @@
             </w:r>
           </w:p>
         </w:tc>
+        <w:tc>
+          <w:tcPr>
+            <w:tcW w:w="1531" w:type="dxa"/>
+          </w:tcPr>
+          <w:p>
+            <w:pPr>
+              <w:jc w:val="center"/>
+              <w:rPr>
+                <w:lang w:val="es-US"/>
+              </w:rPr>
+            </w:pPr>
+            <w:r>
+              <w:rPr>
+                <w:lang w:val="es-US"/>
+              </w:rPr>
+              <w:t>0.9801</w:t>
+            </w:r>
+          </w:p>
+        </w:tc>
       </w:tr>
     </w:tbl>
     <w:p>
@@ -1417,6 +1489,7 @@
       </w:pPr>
       <w:r>
         <w:rPr>
+          <w:noProof/>
           <w:lang w:val="es-US"/>
         </w:rPr>
         <w:drawing>
@@ -1549,6 +1622,7 @@
       </w:pPr>
       <w:r>
         <w:rPr>
+          <w:noProof/>
           <w:lang w:val="es-US"/>
         </w:rPr>
         <w:drawing>
@@ -1627,19 +1701,7 @@
         <w:rPr>
           <w:lang w:val="es-US"/>
         </w:rPr>
-        <w:t xml:space="preserve"> Matriz de confusión del algoritmo </w:t>
-      </w:r>
-      <w:r>
-        <w:rPr>
-          <w:lang w:val="es-US"/>
-        </w:rPr>
-        <w:t>de Random Forest</w:t>
-      </w:r>
-      <w:r>
-        <w:rPr>
-          <w:lang w:val="es-US"/>
-        </w:rPr>
-        <w:t xml:space="preserve"> para el modelo entrenado con píxeles originales.</w:t>
+        <w:t xml:space="preserve"> Matriz de confusión del algoritmo de Random Forest para el modelo entrenado con píxeles originales.</w:t>
       </w:r>
     </w:p>
     <w:p>
@@ -1736,6 +1798,7 @@
       </w:pPr>
       <w:r>
         <w:rPr>
+          <w:noProof/>
           <w:lang w:val="es-US"/>
         </w:rPr>
         <w:drawing>
@@ -1889,6 +1952,173 @@
     </w:p>
     <w:p>
       <w:pPr>
+        <w:jc w:val="both"/>
+        <w:rPr>
+          <w:lang w:val="es-US"/>
+        </w:rPr>
+      </w:pPr>
+      <w:r>
+        <w:rPr>
+          <w:lang w:val="es-US"/>
+        </w:rPr>
+        <w:t>De los modelos generados para la predicción</w:t>
+      </w:r>
+      <w:r>
+        <w:rPr>
+          <w:lang w:val="es-US"/>
+        </w:rPr>
+        <w:t xml:space="preserve"> </w:t>
+      </w:r>
+      <w:r>
+        <w:rPr>
+          <w:lang w:val="es-US"/>
+        </w:rPr>
+        <w:t xml:space="preserve">de presencia alta y baja de cianobacterias con píxeles originales, el que mejor capacidad predictiva presentó fue el modelo de </w:t>
+      </w:r>
+      <w:proofErr w:type="spellStart"/>
+      <w:r>
+        <w:rPr>
+          <w:lang w:val="es-US"/>
+        </w:rPr>
+        <w:t>XGBost</w:t>
+      </w:r>
+      <w:proofErr w:type="spellEnd"/>
+      <w:r>
+        <w:rPr>
+          <w:lang w:val="es-US"/>
+        </w:rPr>
+        <w:t xml:space="preserve">, respecto a la métrica F1-score, la cual fue elegida debido a que se tenía un desbalance leve entre las etiquetas y se les decidió dar el mismo valor a ambas. </w:t>
+      </w:r>
+    </w:p>
+    <w:p>
+      <w:pPr>
+        <w:jc w:val="both"/>
+        <w:rPr>
+          <w:lang w:val="es-US"/>
+        </w:rPr>
+      </w:pPr>
+      <w:r>
+        <w:rPr>
+          <w:lang w:val="es-US"/>
+        </w:rPr>
+        <w:t xml:space="preserve">En todas las métricas y en la matriz de confusión analizadas el mejor modelo fue el </w:t>
+      </w:r>
+      <w:proofErr w:type="spellStart"/>
+      <w:r>
+        <w:rPr>
+          <w:lang w:val="es-US"/>
+        </w:rPr>
+        <w:t>XGBoost</w:t>
+      </w:r>
+      <w:proofErr w:type="spellEnd"/>
+      <w:r>
+        <w:rPr>
+          <w:lang w:val="es-US"/>
+        </w:rPr>
+        <w:t xml:space="preserve">, el cual demostró tener una mejor capacidad de predicción. El resultado tampoco fue mucho mejor que los otros modelos, por lo que si se </w:t>
+      </w:r>
+      <w:proofErr w:type="spellStart"/>
+      <w:r>
+        <w:rPr>
+          <w:lang w:val="es-US"/>
+        </w:rPr>
+        <w:t>requier</w:t>
+      </w:r>
+      <w:proofErr w:type="spellEnd"/>
+      <w:r>
+        <w:rPr>
+          <w:lang w:val="es-US"/>
+        </w:rPr>
+        <w:t xml:space="preserve"> </w:t>
+      </w:r>
+      <w:proofErr w:type="spellStart"/>
+      <w:r>
+        <w:rPr>
+          <w:lang w:val="es-US"/>
+        </w:rPr>
+        <w:t>explicabilidad</w:t>
+      </w:r>
+      <w:proofErr w:type="spellEnd"/>
+      <w:r>
+        <w:rPr>
+          <w:lang w:val="es-US"/>
+        </w:rPr>
+        <w:t xml:space="preserve">, la regresión logística puede ser una excelente opción, ya que tiene un f1-score solo 0.023 por debajo del </w:t>
+      </w:r>
+      <w:proofErr w:type="spellStart"/>
+      <w:r>
+        <w:rPr>
+          <w:lang w:val="es-US"/>
+        </w:rPr>
+        <w:t>XGBoost</w:t>
+      </w:r>
+      <w:proofErr w:type="spellEnd"/>
+      <w:r>
+        <w:rPr>
+          <w:lang w:val="es-US"/>
+        </w:rPr>
+        <w:t>.</w:t>
+      </w:r>
+    </w:p>
+    <w:p>
+      <w:pPr>
+        <w:jc w:val="both"/>
+        <w:rPr>
+          <w:lang w:val="es-US"/>
+        </w:rPr>
+      </w:pPr>
+      <w:r>
+        <w:rPr>
+          <w:lang w:val="es-US"/>
+        </w:rPr>
+        <w:t>Si se desea generar un plan de limpieza, catalogar incorrectamente una zona de baja presencia como si fuera de alta presencia, puede generar inversión más elevada de la necesaria para los procesos de limpieza. El caso contrario, puede evitar que zonas realmente afectadas sean consideradas para la limpieza, generando aún más acumulación elevada que no sea tratada, generando así problemas para la salud de las poblaciones cercanas o la flora y fauna.</w:t>
+      </w:r>
+    </w:p>
+    <w:p>
+      <w:pPr>
+        <w:jc w:val="both"/>
+        <w:rPr>
+          <w:lang w:val="es-US"/>
+        </w:rPr>
+      </w:pPr>
+      <w:r>
+        <w:rPr>
+          <w:lang w:val="es-US"/>
+        </w:rPr>
+        <w:lastRenderedPageBreak/>
+        <w:t xml:space="preserve">Consideramos que se debe dar más importancia a no predecir incorrectamente las zonas de alta presencia, ya que estas pueden ocasionar problemas de salud o de pérdida de flora y fauna. La métrica más útil sería el </w:t>
+      </w:r>
+      <w:proofErr w:type="spellStart"/>
+      <w:r>
+        <w:rPr>
+          <w:lang w:val="es-US"/>
+        </w:rPr>
+        <w:t>recall</w:t>
+      </w:r>
+      <w:proofErr w:type="spellEnd"/>
+      <w:r>
+        <w:rPr>
+          <w:lang w:val="es-US"/>
+        </w:rPr>
+        <w:t xml:space="preserve">, (tomando alta presencia como positiva), en este caso el modelo </w:t>
+      </w:r>
+      <w:proofErr w:type="spellStart"/>
+      <w:r>
+        <w:rPr>
+          <w:lang w:val="es-US"/>
+        </w:rPr>
+        <w:t>XGBoost</w:t>
+      </w:r>
+      <w:proofErr w:type="spellEnd"/>
+      <w:r>
+        <w:rPr>
+          <w:lang w:val="es-US"/>
+        </w:rPr>
+        <w:t xml:space="preserve"> es considerado el mejor.</w:t>
+      </w:r>
+    </w:p>
+    <w:p>
+      <w:pPr>
         <w:rPr>
           <w:lang w:val="es-US"/>
         </w:rPr>
@@ -1975,70 +2205,156 @@
         <w:rPr>
           <w:lang w:val="es-US"/>
         </w:rPr>
+        <w:t>Conclusiones</w:t>
+      </w:r>
+    </w:p>
+    <w:p>
+      <w:pPr>
+        <w:jc w:val="both"/>
+      </w:pPr>
+      <w:r>
+        <w:t>El m</w:t>
+      </w:r>
+      <w:r>
+        <w:t>e</w:t>
+      </w:r>
+      <w:r>
+        <w:t>jor modelo para</w:t>
+      </w:r>
+      <w:r>
+        <w:rPr>
+          <w:lang w:val="es-US"/>
+        </w:rPr>
+        <w:t xml:space="preserve"> la predicción</w:t>
+      </w:r>
+      <w:r>
+        <w:rPr>
+          <w:lang w:val="es-US"/>
+        </w:rPr>
+        <w:t xml:space="preserve"> </w:t>
+      </w:r>
+      <w:r>
+        <w:rPr>
+          <w:lang w:val="es-US"/>
+        </w:rPr>
+        <w:t xml:space="preserve">de presencia alta y baja de cianobacterias con píxeles originales fue el </w:t>
+      </w:r>
+      <w:proofErr w:type="spellStart"/>
+      <w:r>
+        <w:rPr>
+          <w:lang w:val="es-US"/>
+        </w:rPr>
+        <w:t>XGBost</w:t>
+      </w:r>
+      <w:proofErr w:type="spellEnd"/>
+      <w:r>
+        <w:rPr>
+          <w:lang w:val="es-US"/>
+        </w:rPr>
+        <w:t xml:space="preserve">, para cada una de las métricas usadas. Pero si se desea </w:t>
+      </w:r>
+      <w:proofErr w:type="spellStart"/>
+      <w:r>
+        <w:rPr>
+          <w:lang w:val="es-US"/>
+        </w:rPr>
+        <w:t>expli</w:t>
+      </w:r>
+      <w:r>
+        <w:rPr>
+          <w:lang w:val="es-US"/>
+        </w:rPr>
+        <w:t>c</w:t>
+      </w:r>
+      <w:r>
+        <w:rPr>
+          <w:lang w:val="es-US"/>
+        </w:rPr>
+        <w:t>abilidad</w:t>
+      </w:r>
+      <w:proofErr w:type="spellEnd"/>
+      <w:r>
+        <w:rPr>
+          <w:lang w:val="es-US"/>
+        </w:rPr>
+        <w:t xml:space="preserve"> debe usarse la regresión logística, cuyo rendimiento solo fue </w:t>
+      </w:r>
+      <w:r>
+        <w:rPr>
+          <w:lang w:val="es-US"/>
+        </w:rPr>
+        <w:t xml:space="preserve">0.023 por debajo del </w:t>
+      </w:r>
+      <w:proofErr w:type="spellStart"/>
+      <w:r>
+        <w:rPr>
+          <w:lang w:val="es-US"/>
+        </w:rPr>
+        <w:t>XGBoost</w:t>
+      </w:r>
+      <w:proofErr w:type="spellEnd"/>
+      <w:r>
+        <w:rPr>
+          <w:lang w:val="es-US"/>
+        </w:rPr>
+        <w:t xml:space="preserve"> en la métrica f1-score.</w:t>
+      </w:r>
+    </w:p>
+    <w:p/>
+    <w:p>
+      <w:pPr>
+        <w:rPr>
+          <w:lang w:val="es-US"/>
+        </w:rPr>
+      </w:pPr>
+    </w:p>
+    <w:p>
+      <w:pPr>
+        <w:rPr>
+          <w:lang w:val="es-US"/>
+        </w:rPr>
+      </w:pPr>
+    </w:p>
+    <w:p>
+      <w:pPr>
+        <w:rPr>
+          <w:lang w:val="es-US"/>
+        </w:rPr>
+      </w:pPr>
+    </w:p>
+    <w:p>
+      <w:pPr>
+        <w:rPr>
+          <w:lang w:val="es-US"/>
+        </w:rPr>
+      </w:pPr>
+    </w:p>
+    <w:p>
+      <w:pPr>
+        <w:rPr>
+          <w:lang w:val="es-US"/>
+        </w:rPr>
+      </w:pPr>
+    </w:p>
+    <w:p>
+      <w:pPr>
+        <w:rPr>
+          <w:lang w:val="es-US"/>
+        </w:rPr>
+      </w:pPr>
+    </w:p>
+    <w:p>
+      <w:pPr>
+        <w:pStyle w:val="Ttulo2"/>
+        <w:rPr>
+          <w:lang w:val="es-US"/>
+        </w:rPr>
+      </w:pPr>
+      <w:r>
+        <w:rPr>
+          <w:lang w:val="es-US"/>
+        </w:rPr>
         <w:lastRenderedPageBreak/>
-        <w:t>Conclusiones</w:t>
-      </w:r>
-    </w:p>
-    <w:p>
-      <w:pPr>
-        <w:rPr>
-          <w:lang w:val="es-US"/>
-        </w:rPr>
-      </w:pPr>
-    </w:p>
-    <w:p>
-      <w:pPr>
-        <w:rPr>
-          <w:lang w:val="es-US"/>
-        </w:rPr>
-      </w:pPr>
-    </w:p>
-    <w:p>
-      <w:pPr>
-        <w:rPr>
-          <w:lang w:val="es-US"/>
-        </w:rPr>
-      </w:pPr>
-    </w:p>
-    <w:p>
-      <w:pPr>
-        <w:rPr>
-          <w:lang w:val="es-US"/>
-        </w:rPr>
-      </w:pPr>
-    </w:p>
-    <w:p>
-      <w:pPr>
-        <w:rPr>
-          <w:lang w:val="es-US"/>
-        </w:rPr>
-      </w:pPr>
-    </w:p>
-    <w:p>
-      <w:pPr>
-        <w:rPr>
-          <w:lang w:val="es-US"/>
-        </w:rPr>
-      </w:pPr>
-    </w:p>
-    <w:p>
-      <w:pPr>
-        <w:rPr>
-          <w:lang w:val="es-US"/>
-        </w:rPr>
-      </w:pPr>
-    </w:p>
-    <w:p>
-      <w:pPr>
-        <w:pStyle w:val="Ttulo2"/>
-        <w:rPr>
-          <w:lang w:val="es-US"/>
-        </w:rPr>
-      </w:pPr>
-      <w:r>
-        <w:rPr>
-          <w:lang w:val="es-US"/>
-        </w:rPr>
         <w:t>Referencia</w:t>
       </w:r>
     </w:p>
@@ -2046,18 +2362,26 @@
       <w:pPr>
         <w:jc w:val="both"/>
         <w:rPr>
-          <w:lang w:val="es-US"/>
-        </w:rPr>
-      </w:pPr>
-      <w:r>
-        <w:rPr>
           <w:lang w:val="en-US"/>
         </w:rPr>
-        <w:t xml:space="preserve">Chorus, I., &amp; Welker, M. (2021). Exposure to cyanotoxins: Understanding it and short-term interventions to prevent it. In I. Chorus &amp; M. Welker (Eds.), Toxic cyanobacteria in water: A guide to their public health consequences, monitoring and management (2nd ed., pp. 295–400). </w:t>
-      </w:r>
-      <w:r>
-        <w:rPr>
-          <w:lang w:val="es-US"/>
+      </w:pPr>
+      <w:proofErr w:type="spellStart"/>
+      <w:r>
+        <w:t>Chorus</w:t>
+      </w:r>
+      <w:proofErr w:type="spellEnd"/>
+      <w:r>
+        <w:t xml:space="preserve">, I., &amp; Welker, M. (2021). </w:t>
+      </w:r>
+      <w:r>
+        <w:rPr>
+          <w:lang w:val="en-US"/>
+        </w:rPr>
+        <w:t xml:space="preserve">Exposure to cyanotoxins: Understanding it and short-term interventions to prevent it. In I. Chorus &amp; M. Welker (Eds.), Toxic cyanobacteria in water: A guide to their public health consequences, monitoring and management (2nd ed., pp. 295–400). </w:t>
+      </w:r>
+      <w:r>
+        <w:rPr>
+          <w:lang w:val="en-US"/>
         </w:rPr>
         <w:t>CRC Press. https://doi.org/10.1201/9781003081449-5</w:t>
       </w:r>
@@ -2069,105 +2393,45 @@
           <w:lang w:val="en-US"/>
         </w:rPr>
       </w:pPr>
-      <w:proofErr w:type="spellStart"/>
-      <w:r>
-        <w:rPr>
-          <w:lang w:val="es-US"/>
-        </w:rPr>
-        <w:t>European</w:t>
-      </w:r>
-      <w:proofErr w:type="spellEnd"/>
-      <w:r>
-        <w:rPr>
-          <w:lang w:val="es-US"/>
-        </w:rPr>
-        <w:t xml:space="preserve"> Space Agency. (2025–2026). </w:t>
+      <w:r>
+        <w:rPr>
+          <w:lang w:val="en-US"/>
+        </w:rPr>
+        <w:t>European Space Agency. (2025–2026). </w:t>
       </w:r>
       <w:r>
         <w:rPr>
           <w:i/>
           <w:iCs/>
-          <w:lang w:val="es-US"/>
-        </w:rPr>
-        <w:t xml:space="preserve">Sentinel-2 Level-1C </w:t>
+          <w:lang w:val="en-US"/>
+        </w:rPr>
+        <w:t>Sentinel-2 Level-1C multispectral imagery of lakes Atitlán and Amatitlán, Guatemala</w:t>
+      </w:r>
+      <w:r>
+        <w:rPr>
+          <w:lang w:val="en-US"/>
+        </w:rPr>
+        <w:t xml:space="preserve"> [Conjunto de </w:t>
       </w:r>
       <w:proofErr w:type="spellStart"/>
       <w:r>
         <w:rPr>
-          <w:i/>
-          <w:iCs/>
-          <w:lang w:val="es-US"/>
-        </w:rPr>
-        <w:t>multispectral</w:t>
+          <w:lang w:val="en-US"/>
+        </w:rPr>
+        <w:t>datos</w:t>
       </w:r>
       <w:proofErr w:type="spellEnd"/>
       <w:r>
         <w:rPr>
-          <w:i/>
-          <w:iCs/>
-          <w:lang w:val="es-US"/>
-        </w:rPr>
-        <w:t xml:space="preserve"> </w:t>
-      </w:r>
-      <w:proofErr w:type="spellStart"/>
-      <w:r>
-        <w:rPr>
-          <w:i/>
-          <w:iCs/>
-          <w:lang w:val="es-US"/>
-        </w:rPr>
-        <w:t>imagery</w:t>
-      </w:r>
-      <w:proofErr w:type="spellEnd"/>
-      <w:r>
-        <w:rPr>
-          <w:i/>
-          <w:iCs/>
-          <w:lang w:val="es-US"/>
-        </w:rPr>
-        <w:t xml:space="preserve"> </w:t>
-      </w:r>
-      <w:proofErr w:type="spellStart"/>
-      <w:r>
-        <w:rPr>
-          <w:i/>
-          <w:iCs/>
-          <w:lang w:val="es-US"/>
-        </w:rPr>
-        <w:t>of</w:t>
-      </w:r>
-      <w:proofErr w:type="spellEnd"/>
-      <w:r>
-        <w:rPr>
-          <w:i/>
-          <w:iCs/>
-          <w:lang w:val="es-US"/>
-        </w:rPr>
-        <w:t xml:space="preserve"> </w:t>
-      </w:r>
-      <w:proofErr w:type="spellStart"/>
-      <w:r>
-        <w:rPr>
-          <w:i/>
-          <w:iCs/>
-          <w:lang w:val="es-US"/>
-        </w:rPr>
-        <w:t>lakes</w:t>
-      </w:r>
-      <w:proofErr w:type="spellEnd"/>
-      <w:r>
-        <w:rPr>
-          <w:i/>
-          <w:iCs/>
-          <w:lang w:val="es-US"/>
-        </w:rPr>
-        <w:t xml:space="preserve"> Atitlán and Amatitlán, Guatemala</w:t>
-      </w:r>
-      <w:r>
-        <w:rPr>
-          <w:lang w:val="es-US"/>
-        </w:rPr>
-        <w:t xml:space="preserve"> [Conjunto de datos]. Copernicus Data Space </w:t>
+          <w:lang w:val="en-US"/>
+        </w:rPr>
+        <w:t xml:space="preserve">]. </w:t>
+      </w:r>
+      <w:r>
+        <w:rPr>
+          <w:lang w:val="es-US"/>
+        </w:rPr>
+        <w:t xml:space="preserve">Copernicus Data Space </w:t>
       </w:r>
       <w:proofErr w:type="spellStart"/>
       <w:r>
@@ -3086,6 +3350,7 @@
   <w:style w:type="character" w:default="1" w:styleId="Fuentedeprrafopredeter">
     <w:name w:val="Default Paragraph Font"/>
     <w:uiPriority w:val="1"/>
+    <w:semiHidden/>
     <w:unhideWhenUsed/>
   </w:style>
   <w:style w:type="table" w:default="1" w:styleId="Tablanormal">

</xml_diff>

<commit_message>
Informe resultados y modelos espaciales
</commit_message>
<xml_diff>
--- a/INFORME.docx
+++ b/INFORME.docx
@@ -460,21 +460,40 @@
         </w:rPr>
         <w:t xml:space="preserve"> entrenado con píxeles agrupados en </w:t>
       </w:r>
-      <w:proofErr w:type="gramStart"/>
       <w:r>
         <w:rPr>
           <w:highlight w:val="yellow"/>
           <w:lang w:val="es-US"/>
         </w:rPr>
-        <w:t>( m</w:t>
-      </w:r>
-      <w:proofErr w:type="gramEnd"/>
+        <w:t>(</w:t>
+      </w:r>
       <w:r>
         <w:rPr>
           <w:highlight w:val="yellow"/>
           <w:lang w:val="es-US"/>
         </w:rPr>
-        <w:t xml:space="preserve"> x m).</w:t>
+        <w:t xml:space="preserve">1000 </w:t>
+      </w:r>
+      <w:r>
+        <w:rPr>
+          <w:highlight w:val="yellow"/>
+          <w:lang w:val="es-US"/>
+        </w:rPr>
+        <w:t xml:space="preserve">m x </w:t>
+      </w:r>
+      <w:r>
+        <w:rPr>
+          <w:highlight w:val="yellow"/>
+          <w:lang w:val="es-US"/>
+        </w:rPr>
+        <w:t xml:space="preserve">1000 </w:t>
+      </w:r>
+      <w:r>
+        <w:rPr>
+          <w:highlight w:val="yellow"/>
+          <w:lang w:val="es-US"/>
+        </w:rPr>
+        <w:t>m).</w:t>
       </w:r>
     </w:p>
     <w:p>
@@ -965,8 +984,9 @@
     </w:p>
     <w:p>
       <w:pPr>
-        <w:pStyle w:val="Ttulo2"/>
-        <w:rPr>
+        <w:jc w:val="both"/>
+        <w:rPr>
+          <w:rFonts w:eastAsiaTheme="minorEastAsia"/>
           <w:lang w:val="es-US"/>
         </w:rPr>
       </w:pPr>
@@ -975,7 +995,46 @@
           <w:lang w:val="es-US"/>
         </w:rPr>
         <w:lastRenderedPageBreak/>
-        <w:t>Resultados</w:t>
+        <w:t xml:space="preserve">El segundo grupo de tipos de modelos ha consistido en aquellos sobre los que se ha realizado una validación espacial. En este caso, se ha dividido cada lago en una cuadrícula de </w:t>
+      </w:r>
+      <m:oMath>
+        <m:r>
+          <w:rPr>
+            <w:rFonts w:ascii="Cambria Math" w:hAnsi="Cambria Math"/>
+            <w:lang w:val="es-US"/>
+          </w:rPr>
+          <m:t>1000m×1000m</m:t>
+        </m:r>
+      </m:oMath>
+      <w:r>
+        <w:rPr>
+          <w:rFonts w:eastAsiaTheme="minorEastAsia"/>
+          <w:lang w:val="es-US"/>
+        </w:rPr>
+        <w:t>;</w:t>
+      </w:r>
+      <w:r>
+        <w:rPr>
+          <w:rFonts w:eastAsiaTheme="minorEastAsia"/>
+          <w:lang w:val="es-US"/>
+        </w:rPr>
+        <w:t xml:space="preserve"> los datos se han proyectado al sistema de coordenadas WGS 84 / UTM zona 15N (EPSG:322615), la cual abarca parte del hemisferio norte entre 96° O - 90°O y entre el ecuador y 84°N, abarcando partes del este de Canadá, Estados Unidos, el sur de México y Guatemala. </w:t>
+      </w:r>
+    </w:p>
+    <w:p>
+      <w:pPr>
+        <w:jc w:val="both"/>
+        <w:rPr>
+          <w:rFonts w:eastAsiaTheme="minorEastAsia"/>
+          <w:lang w:val="es-US"/>
+        </w:rPr>
+      </w:pPr>
+      <w:r>
+        <w:rPr>
+          <w:rFonts w:eastAsiaTheme="minorEastAsia"/>
+          <w:lang w:val="es-US"/>
+        </w:rPr>
+        <w:t>Con esta base se han implementado nuevamente los modelos:</w:t>
       </w:r>
     </w:p>
     <w:p>
@@ -991,7 +1050,1086 @@
           <w:bCs/>
           <w:lang w:val="es-US"/>
         </w:rPr>
-        <w:t>Cuadro x:</w:t>
+        <w:t xml:space="preserve">Cuadro </w:t>
+      </w:r>
+      <w:r>
+        <w:rPr>
+          <w:b/>
+          <w:bCs/>
+          <w:lang w:val="es-US"/>
+        </w:rPr>
+        <w:t>2</w:t>
+      </w:r>
+      <w:r>
+        <w:rPr>
+          <w:b/>
+          <w:bCs/>
+          <w:lang w:val="es-US"/>
+        </w:rPr>
+        <w:t>:</w:t>
+      </w:r>
+      <w:r>
+        <w:rPr>
+          <w:lang w:val="es-US"/>
+        </w:rPr>
+        <w:t xml:space="preserve"> Modelos usados en la predicción de presencia alta y baja de cianobacterias, en píxele</w:t>
+      </w:r>
+      <w:r>
+        <w:rPr>
+          <w:lang w:val="es-US"/>
+        </w:rPr>
+        <w:t>s proyectados a WGS 84 / UTM zona 15N (EPSG:322615).</w:t>
+      </w:r>
+    </w:p>
+    <w:tbl>
+      <w:tblPr>
+        <w:tblStyle w:val="Tablaconcuadrcula"/>
+        <w:tblW w:w="0" w:type="auto"/>
+        <w:jc w:val="center"/>
+        <w:tblLook w:val="04A0" w:firstRow="1" w:lastRow="0" w:firstColumn="1" w:lastColumn="0" w:noHBand="0" w:noVBand="1"/>
+      </w:tblPr>
+      <w:tblGrid>
+        <w:gridCol w:w="2405"/>
+        <w:gridCol w:w="4111"/>
+      </w:tblGrid>
+      <w:tr>
+        <w:trPr>
+          <w:jc w:val="center"/>
+        </w:trPr>
+        <w:tc>
+          <w:tcPr>
+            <w:tcW w:w="2405" w:type="dxa"/>
+            <w:vAlign w:val="center"/>
+          </w:tcPr>
+          <w:p>
+            <w:pPr>
+              <w:jc w:val="center"/>
+              <w:rPr>
+                <w:b/>
+                <w:bCs/>
+                <w:lang w:val="es-US"/>
+              </w:rPr>
+            </w:pPr>
+            <w:r>
+              <w:rPr>
+                <w:b/>
+                <w:bCs/>
+                <w:lang w:val="es-US"/>
+              </w:rPr>
+              <w:t>Modelo</w:t>
+            </w:r>
+          </w:p>
+        </w:tc>
+        <w:tc>
+          <w:tcPr>
+            <w:tcW w:w="4111" w:type="dxa"/>
+            <w:vAlign w:val="center"/>
+          </w:tcPr>
+          <w:p>
+            <w:pPr>
+              <w:jc w:val="center"/>
+              <w:rPr>
+                <w:b/>
+                <w:bCs/>
+                <w:lang w:val="es-US"/>
+              </w:rPr>
+            </w:pPr>
+            <w:proofErr w:type="spellStart"/>
+            <w:r>
+              <w:rPr>
+                <w:b/>
+                <w:bCs/>
+                <w:lang w:val="es-US"/>
+              </w:rPr>
+              <w:t>Hiperparámetros</w:t>
+            </w:r>
+            <w:proofErr w:type="spellEnd"/>
+            <w:r>
+              <w:rPr>
+                <w:b/>
+                <w:bCs/>
+                <w:lang w:val="es-US"/>
+              </w:rPr>
+              <w:t xml:space="preserve"> del mejor modelo</w:t>
+            </w:r>
+          </w:p>
+        </w:tc>
+      </w:tr>
+      <w:tr>
+        <w:trPr>
+          <w:jc w:val="center"/>
+        </w:trPr>
+        <w:tc>
+          <w:tcPr>
+            <w:tcW w:w="2405" w:type="dxa"/>
+            <w:vAlign w:val="center"/>
+          </w:tcPr>
+          <w:p>
+            <w:pPr>
+              <w:jc w:val="center"/>
+              <w:rPr>
+                <w:lang w:val="es-US"/>
+              </w:rPr>
+            </w:pPr>
+            <w:r>
+              <w:rPr>
+                <w:lang w:val="es-US"/>
+              </w:rPr>
+              <w:t>Regresión logística</w:t>
+            </w:r>
+          </w:p>
+        </w:tc>
+        <w:tc>
+          <w:tcPr>
+            <w:tcW w:w="4111" w:type="dxa"/>
+            <w:vAlign w:val="center"/>
+          </w:tcPr>
+          <w:p>
+            <w:pPr>
+              <w:jc w:val="center"/>
+              <w:rPr>
+                <w:lang w:val="en-US"/>
+              </w:rPr>
+            </w:pPr>
+            <w:r>
+              <w:rPr>
+                <w:lang w:val="en-US"/>
+              </w:rPr>
+              <w:t>C: 10</w:t>
+            </w:r>
+          </w:p>
+          <w:p>
+            <w:pPr>
+              <w:jc w:val="center"/>
+              <w:rPr>
+                <w:lang w:val="en-US"/>
+              </w:rPr>
+            </w:pPr>
+            <w:r>
+              <w:rPr>
+                <w:lang w:val="en-US"/>
+              </w:rPr>
+              <w:t>penalty: l2</w:t>
+            </w:r>
+          </w:p>
+          <w:p>
+            <w:pPr>
+              <w:jc w:val="center"/>
+              <w:rPr>
+                <w:lang w:val="en-US"/>
+              </w:rPr>
+            </w:pPr>
+            <w:r>
+              <w:rPr>
+                <w:lang w:val="en-US"/>
+              </w:rPr>
+              <w:t xml:space="preserve">solver': </w:t>
+            </w:r>
+            <w:proofErr w:type="spellStart"/>
+            <w:r>
+              <w:rPr>
+                <w:lang w:val="en-US"/>
+              </w:rPr>
+              <w:t>liblinear</w:t>
+            </w:r>
+            <w:proofErr w:type="spellEnd"/>
+          </w:p>
+        </w:tc>
+      </w:tr>
+      <w:tr>
+        <w:trPr>
+          <w:jc w:val="center"/>
+        </w:trPr>
+        <w:tc>
+          <w:tcPr>
+            <w:tcW w:w="2405" w:type="dxa"/>
+            <w:vAlign w:val="center"/>
+          </w:tcPr>
+          <w:p>
+            <w:pPr>
+              <w:jc w:val="center"/>
+              <w:rPr>
+                <w:lang w:val="es-US"/>
+              </w:rPr>
+            </w:pPr>
+            <w:r>
+              <w:rPr>
+                <w:lang w:val="es-US"/>
+              </w:rPr>
+              <w:t>Random Forest</w:t>
+            </w:r>
+          </w:p>
+        </w:tc>
+        <w:tc>
+          <w:tcPr>
+            <w:tcW w:w="4111" w:type="dxa"/>
+            <w:vAlign w:val="center"/>
+          </w:tcPr>
+          <w:p>
+            <w:pPr>
+              <w:jc w:val="center"/>
+              <w:rPr>
+                <w:lang w:val="en-US"/>
+              </w:rPr>
+            </w:pPr>
+            <w:proofErr w:type="spellStart"/>
+            <w:r>
+              <w:rPr>
+                <w:lang w:val="en-US"/>
+              </w:rPr>
+              <w:t>max_depth</w:t>
+            </w:r>
+            <w:proofErr w:type="spellEnd"/>
+            <w:r>
+              <w:rPr>
+                <w:lang w:val="en-US"/>
+              </w:rPr>
+              <w:t>: 7</w:t>
+            </w:r>
+          </w:p>
+          <w:p>
+            <w:pPr>
+              <w:jc w:val="center"/>
+              <w:rPr>
+                <w:lang w:val="en-US"/>
+              </w:rPr>
+            </w:pPr>
+            <w:proofErr w:type="spellStart"/>
+            <w:r>
+              <w:rPr>
+                <w:lang w:val="en-US"/>
+              </w:rPr>
+              <w:t>max_features</w:t>
+            </w:r>
+            <w:proofErr w:type="spellEnd"/>
+            <w:r>
+              <w:rPr>
+                <w:lang w:val="en-US"/>
+              </w:rPr>
+              <w:t xml:space="preserve">': sqrt </w:t>
+            </w:r>
+            <w:proofErr w:type="spellStart"/>
+            <w:r>
+              <w:rPr>
+                <w:lang w:val="en-US"/>
+              </w:rPr>
+              <w:t>min_samples_leaf</w:t>
+            </w:r>
+            <w:proofErr w:type="spellEnd"/>
+            <w:r>
+              <w:rPr>
+                <w:lang w:val="en-US"/>
+              </w:rPr>
+              <w:t xml:space="preserve">: 1 </w:t>
+            </w:r>
+            <w:proofErr w:type="spellStart"/>
+            <w:r>
+              <w:rPr>
+                <w:lang w:val="en-US"/>
+              </w:rPr>
+              <w:t>min_samples_split</w:t>
+            </w:r>
+            <w:proofErr w:type="spellEnd"/>
+            <w:r>
+              <w:rPr>
+                <w:lang w:val="en-US"/>
+              </w:rPr>
+              <w:t>: 5</w:t>
+            </w:r>
+          </w:p>
+          <w:p>
+            <w:pPr>
+              <w:jc w:val="center"/>
+              <w:rPr>
+                <w:lang w:val="en-US"/>
+              </w:rPr>
+            </w:pPr>
+            <w:proofErr w:type="spellStart"/>
+            <w:r>
+              <w:rPr>
+                <w:lang w:val="en-US"/>
+              </w:rPr>
+              <w:t>n_estimators</w:t>
+            </w:r>
+            <w:proofErr w:type="spellEnd"/>
+            <w:r>
+              <w:rPr>
+                <w:lang w:val="en-US"/>
+              </w:rPr>
+              <w:t>: 200</w:t>
+            </w:r>
+          </w:p>
+        </w:tc>
+      </w:tr>
+      <w:tr>
+        <w:trPr>
+          <w:jc w:val="center"/>
+        </w:trPr>
+        <w:tc>
+          <w:tcPr>
+            <w:tcW w:w="2405" w:type="dxa"/>
+            <w:vAlign w:val="center"/>
+          </w:tcPr>
+          <w:p>
+            <w:pPr>
+              <w:jc w:val="center"/>
+              <w:rPr>
+                <w:lang w:val="es-US"/>
+              </w:rPr>
+            </w:pPr>
+            <w:proofErr w:type="spellStart"/>
+            <w:r>
+              <w:rPr>
+                <w:lang w:val="es-US"/>
+              </w:rPr>
+              <w:t>XGBoost</w:t>
+            </w:r>
+            <w:proofErr w:type="spellEnd"/>
+          </w:p>
+        </w:tc>
+        <w:tc>
+          <w:tcPr>
+            <w:tcW w:w="4111" w:type="dxa"/>
+            <w:vAlign w:val="center"/>
+          </w:tcPr>
+          <w:p>
+            <w:pPr>
+              <w:jc w:val="center"/>
+              <w:rPr>
+                <w:lang w:val="en-US"/>
+              </w:rPr>
+            </w:pPr>
+            <w:proofErr w:type="spellStart"/>
+            <w:r>
+              <w:rPr>
+                <w:lang w:val="en-US"/>
+              </w:rPr>
+              <w:t>colsample_bytree</w:t>
+            </w:r>
+            <w:proofErr w:type="spellEnd"/>
+            <w:r>
+              <w:rPr>
+                <w:lang w:val="en-US"/>
+              </w:rPr>
+              <w:t>: 1</w:t>
+            </w:r>
+            <w:r>
+              <w:rPr>
+                <w:lang w:val="en-US"/>
+              </w:rPr>
+              <w:t>.0</w:t>
+            </w:r>
+          </w:p>
+          <w:p>
+            <w:pPr>
+              <w:jc w:val="center"/>
+              <w:rPr>
+                <w:lang w:val="en-US"/>
+              </w:rPr>
+            </w:pPr>
+            <w:proofErr w:type="spellStart"/>
+            <w:r>
+              <w:rPr>
+                <w:lang w:val="en-US"/>
+              </w:rPr>
+              <w:t>learning_rate</w:t>
+            </w:r>
+            <w:proofErr w:type="spellEnd"/>
+            <w:r>
+              <w:rPr>
+                <w:lang w:val="en-US"/>
+              </w:rPr>
+              <w:t>: 0.1</w:t>
+            </w:r>
+          </w:p>
+          <w:p>
+            <w:pPr>
+              <w:jc w:val="center"/>
+              <w:rPr>
+                <w:lang w:val="en-US"/>
+              </w:rPr>
+            </w:pPr>
+            <w:proofErr w:type="spellStart"/>
+            <w:r>
+              <w:rPr>
+                <w:lang w:val="en-US"/>
+              </w:rPr>
+              <w:t>max_depth</w:t>
+            </w:r>
+            <w:proofErr w:type="spellEnd"/>
+            <w:r>
+              <w:rPr>
+                <w:lang w:val="en-US"/>
+              </w:rPr>
+              <w:t>': 5</w:t>
+            </w:r>
+          </w:p>
+          <w:p>
+            <w:pPr>
+              <w:jc w:val="center"/>
+              <w:rPr>
+                <w:lang w:val="en-US"/>
+              </w:rPr>
+            </w:pPr>
+            <w:proofErr w:type="spellStart"/>
+            <w:r>
+              <w:rPr>
+                <w:lang w:val="en-US"/>
+              </w:rPr>
+              <w:t>n_estimators</w:t>
+            </w:r>
+            <w:proofErr w:type="spellEnd"/>
+            <w:r>
+              <w:rPr>
+                <w:lang w:val="en-US"/>
+              </w:rPr>
+              <w:t>': 300</w:t>
+            </w:r>
+          </w:p>
+          <w:p>
+            <w:pPr>
+              <w:jc w:val="center"/>
+              <w:rPr>
+                <w:lang w:val="en-US"/>
+              </w:rPr>
+            </w:pPr>
+            <w:r>
+              <w:rPr>
+                <w:lang w:val="en-US"/>
+              </w:rPr>
+              <w:t>subsample: 1</w:t>
+            </w:r>
+            <w:r>
+              <w:rPr>
+                <w:lang w:val="en-US"/>
+              </w:rPr>
+              <w:t>.0</w:t>
+            </w:r>
+          </w:p>
+        </w:tc>
+      </w:tr>
+    </w:tbl>
+    <w:p>
+      <w:pPr>
+        <w:jc w:val="both"/>
+        <w:rPr>
+          <w:lang w:val="es-US"/>
+        </w:rPr>
+      </w:pPr>
+    </w:p>
+    <w:p>
+      <w:pPr>
+        <w:jc w:val="both"/>
+        <w:rPr>
+          <w:lang w:val="es-US"/>
+        </w:rPr>
+      </w:pPr>
+      <w:r>
+        <w:rPr>
+          <w:lang w:val="es-US"/>
+        </w:rPr>
+        <w:t>Con estos datos se han implementado dos modelos más, en los que el entrenamiento fue hecho a base de datos exclusivos de un lago mientras que la prueba fue hecha con datos exclusivos del otro lago. Esto con el fin de observar su capacidad de generalización.</w:t>
+      </w:r>
+    </w:p>
+    <w:p>
+      <w:pPr>
+        <w:jc w:val="both"/>
+        <w:rPr>
+          <w:b/>
+          <w:bCs/>
+          <w:lang w:val="es-US"/>
+        </w:rPr>
+      </w:pPr>
+    </w:p>
+    <w:p>
+      <w:pPr>
+        <w:jc w:val="both"/>
+        <w:rPr>
+          <w:b/>
+          <w:bCs/>
+          <w:lang w:val="es-US"/>
+        </w:rPr>
+      </w:pPr>
+    </w:p>
+    <w:p>
+      <w:pPr>
+        <w:jc w:val="both"/>
+        <w:rPr>
+          <w:b/>
+          <w:bCs/>
+          <w:lang w:val="es-US"/>
+        </w:rPr>
+      </w:pPr>
+    </w:p>
+    <w:p>
+      <w:pPr>
+        <w:jc w:val="both"/>
+        <w:rPr>
+          <w:b/>
+          <w:bCs/>
+          <w:lang w:val="es-US"/>
+        </w:rPr>
+      </w:pPr>
+    </w:p>
+    <w:p>
+      <w:pPr>
+        <w:jc w:val="both"/>
+        <w:rPr>
+          <w:b/>
+          <w:bCs/>
+          <w:lang w:val="es-US"/>
+        </w:rPr>
+      </w:pPr>
+    </w:p>
+    <w:p>
+      <w:pPr>
+        <w:jc w:val="both"/>
+        <w:rPr>
+          <w:lang w:val="es-US"/>
+        </w:rPr>
+      </w:pPr>
+      <w:r>
+        <w:rPr>
+          <w:b/>
+          <w:bCs/>
+          <w:lang w:val="es-US"/>
+        </w:rPr>
+        <w:lastRenderedPageBreak/>
+        <w:t xml:space="preserve">Cuadro </w:t>
+      </w:r>
+      <w:r>
+        <w:rPr>
+          <w:b/>
+          <w:bCs/>
+          <w:lang w:val="es-US"/>
+        </w:rPr>
+        <w:t>3</w:t>
+      </w:r>
+      <w:r>
+        <w:rPr>
+          <w:b/>
+          <w:bCs/>
+          <w:lang w:val="es-US"/>
+        </w:rPr>
+        <w:t>:</w:t>
+      </w:r>
+      <w:r>
+        <w:rPr>
+          <w:lang w:val="es-US"/>
+        </w:rPr>
+        <w:t xml:space="preserve"> Modelos usados </w:t>
+      </w:r>
+      <w:r>
+        <w:rPr>
+          <w:lang w:val="es-US"/>
+        </w:rPr>
+        <w:t>en el experimento A</w:t>
+      </w:r>
+      <w:r>
+        <w:rPr>
+          <w:lang w:val="es-US"/>
+        </w:rPr>
+        <w:t>, en el que los datos del entrenamiento corresponden al lago de Atitlán, mientras que la prueba corresponde al lago de Amatitlán.</w:t>
+      </w:r>
+    </w:p>
+    <w:tbl>
+      <w:tblPr>
+        <w:tblStyle w:val="Tablaconcuadrcula"/>
+        <w:tblW w:w="0" w:type="auto"/>
+        <w:jc w:val="center"/>
+        <w:tblLook w:val="04A0" w:firstRow="1" w:lastRow="0" w:firstColumn="1" w:lastColumn="0" w:noHBand="0" w:noVBand="1"/>
+      </w:tblPr>
+      <w:tblGrid>
+        <w:gridCol w:w="2405"/>
+        <w:gridCol w:w="4111"/>
+      </w:tblGrid>
+      <w:tr>
+        <w:trPr>
+          <w:jc w:val="center"/>
+        </w:trPr>
+        <w:tc>
+          <w:tcPr>
+            <w:tcW w:w="2405" w:type="dxa"/>
+            <w:vAlign w:val="center"/>
+          </w:tcPr>
+          <w:p>
+            <w:pPr>
+              <w:jc w:val="center"/>
+              <w:rPr>
+                <w:b/>
+                <w:bCs/>
+                <w:lang w:val="es-US"/>
+              </w:rPr>
+            </w:pPr>
+            <w:r>
+              <w:rPr>
+                <w:b/>
+                <w:bCs/>
+                <w:lang w:val="es-US"/>
+              </w:rPr>
+              <w:t>Modelo</w:t>
+            </w:r>
+          </w:p>
+        </w:tc>
+        <w:tc>
+          <w:tcPr>
+            <w:tcW w:w="4111" w:type="dxa"/>
+            <w:vAlign w:val="center"/>
+          </w:tcPr>
+          <w:p>
+            <w:pPr>
+              <w:jc w:val="center"/>
+              <w:rPr>
+                <w:b/>
+                <w:bCs/>
+                <w:lang w:val="es-US"/>
+              </w:rPr>
+            </w:pPr>
+            <w:proofErr w:type="spellStart"/>
+            <w:r>
+              <w:rPr>
+                <w:b/>
+                <w:bCs/>
+                <w:lang w:val="es-US"/>
+              </w:rPr>
+              <w:t>Hiperparámetros</w:t>
+            </w:r>
+            <w:proofErr w:type="spellEnd"/>
+            <w:r>
+              <w:rPr>
+                <w:b/>
+                <w:bCs/>
+                <w:lang w:val="es-US"/>
+              </w:rPr>
+              <w:t xml:space="preserve"> del mejor modelo</w:t>
+            </w:r>
+          </w:p>
+        </w:tc>
+      </w:tr>
+      <w:tr>
+        <w:trPr>
+          <w:jc w:val="center"/>
+        </w:trPr>
+        <w:tc>
+          <w:tcPr>
+            <w:tcW w:w="2405" w:type="dxa"/>
+            <w:vAlign w:val="center"/>
+          </w:tcPr>
+          <w:p>
+            <w:pPr>
+              <w:jc w:val="center"/>
+              <w:rPr>
+                <w:lang w:val="es-US"/>
+              </w:rPr>
+            </w:pPr>
+            <w:r>
+              <w:rPr>
+                <w:lang w:val="es-US"/>
+              </w:rPr>
+              <w:t>Regresión logística</w:t>
+            </w:r>
+          </w:p>
+        </w:tc>
+        <w:tc>
+          <w:tcPr>
+            <w:tcW w:w="4111" w:type="dxa"/>
+            <w:vAlign w:val="center"/>
+          </w:tcPr>
+          <w:p>
+            <w:pPr>
+              <w:jc w:val="center"/>
+              <w:rPr>
+                <w:lang w:val="en-US"/>
+              </w:rPr>
+            </w:pPr>
+            <w:r>
+              <w:rPr>
+                <w:lang w:val="en-US"/>
+              </w:rPr>
+              <w:t>C: 10</w:t>
+            </w:r>
+          </w:p>
+          <w:p>
+            <w:pPr>
+              <w:jc w:val="center"/>
+              <w:rPr>
+                <w:lang w:val="en-US"/>
+              </w:rPr>
+            </w:pPr>
+            <w:r>
+              <w:rPr>
+                <w:lang w:val="en-US"/>
+              </w:rPr>
+              <w:t>penalty: l2</w:t>
+            </w:r>
+          </w:p>
+          <w:p>
+            <w:pPr>
+              <w:jc w:val="center"/>
+              <w:rPr>
+                <w:lang w:val="en-US"/>
+              </w:rPr>
+            </w:pPr>
+            <w:r>
+              <w:rPr>
+                <w:lang w:val="en-US"/>
+              </w:rPr>
+              <w:t xml:space="preserve">solver': </w:t>
+            </w:r>
+            <w:proofErr w:type="spellStart"/>
+            <w:r>
+              <w:rPr>
+                <w:lang w:val="en-US"/>
+              </w:rPr>
+              <w:t>liblinear</w:t>
+            </w:r>
+            <w:proofErr w:type="spellEnd"/>
+          </w:p>
+        </w:tc>
+      </w:tr>
+      <w:tr>
+        <w:trPr>
+          <w:jc w:val="center"/>
+        </w:trPr>
+        <w:tc>
+          <w:tcPr>
+            <w:tcW w:w="2405" w:type="dxa"/>
+            <w:vAlign w:val="center"/>
+          </w:tcPr>
+          <w:p>
+            <w:pPr>
+              <w:jc w:val="center"/>
+              <w:rPr>
+                <w:lang w:val="es-US"/>
+              </w:rPr>
+            </w:pPr>
+            <w:r>
+              <w:rPr>
+                <w:lang w:val="es-US"/>
+              </w:rPr>
+              <w:t>Random Forest</w:t>
+            </w:r>
+          </w:p>
+        </w:tc>
+        <w:tc>
+          <w:tcPr>
+            <w:tcW w:w="4111" w:type="dxa"/>
+            <w:vAlign w:val="center"/>
+          </w:tcPr>
+          <w:p>
+            <w:pPr>
+              <w:jc w:val="center"/>
+              <w:rPr>
+                <w:lang w:val="en-US"/>
+              </w:rPr>
+            </w:pPr>
+            <w:proofErr w:type="spellStart"/>
+            <w:r>
+              <w:rPr>
+                <w:lang w:val="en-US"/>
+              </w:rPr>
+              <w:t>max_depth</w:t>
+            </w:r>
+            <w:proofErr w:type="spellEnd"/>
+            <w:r>
+              <w:rPr>
+                <w:lang w:val="en-US"/>
+              </w:rPr>
+              <w:t>: 7</w:t>
+            </w:r>
+          </w:p>
+          <w:p>
+            <w:pPr>
+              <w:jc w:val="center"/>
+              <w:rPr>
+                <w:lang w:val="en-US"/>
+              </w:rPr>
+            </w:pPr>
+            <w:proofErr w:type="spellStart"/>
+            <w:r>
+              <w:rPr>
+                <w:lang w:val="en-US"/>
+              </w:rPr>
+              <w:t>max_features</w:t>
+            </w:r>
+            <w:proofErr w:type="spellEnd"/>
+            <w:r>
+              <w:rPr>
+                <w:lang w:val="en-US"/>
+              </w:rPr>
+              <w:t xml:space="preserve">': sqrt </w:t>
+            </w:r>
+            <w:proofErr w:type="spellStart"/>
+            <w:r>
+              <w:rPr>
+                <w:lang w:val="en-US"/>
+              </w:rPr>
+              <w:t>min_samples_leaf</w:t>
+            </w:r>
+            <w:proofErr w:type="spellEnd"/>
+            <w:r>
+              <w:rPr>
+                <w:lang w:val="en-US"/>
+              </w:rPr>
+              <w:t xml:space="preserve">: 1 </w:t>
+            </w:r>
+            <w:proofErr w:type="spellStart"/>
+            <w:r>
+              <w:rPr>
+                <w:lang w:val="en-US"/>
+              </w:rPr>
+              <w:t>min_samples_split</w:t>
+            </w:r>
+            <w:proofErr w:type="spellEnd"/>
+            <w:r>
+              <w:rPr>
+                <w:lang w:val="en-US"/>
+              </w:rPr>
+              <w:t>: 5</w:t>
+            </w:r>
+          </w:p>
+          <w:p>
+            <w:pPr>
+              <w:jc w:val="center"/>
+              <w:rPr>
+                <w:lang w:val="en-US"/>
+              </w:rPr>
+            </w:pPr>
+            <w:proofErr w:type="spellStart"/>
+            <w:r>
+              <w:rPr>
+                <w:lang w:val="en-US"/>
+              </w:rPr>
+              <w:t>n_estimators</w:t>
+            </w:r>
+            <w:proofErr w:type="spellEnd"/>
+            <w:r>
+              <w:rPr>
+                <w:lang w:val="en-US"/>
+              </w:rPr>
+              <w:t>: 200</w:t>
+            </w:r>
+          </w:p>
+        </w:tc>
+      </w:tr>
+      <w:tr>
+        <w:trPr>
+          <w:jc w:val="center"/>
+        </w:trPr>
+        <w:tc>
+          <w:tcPr>
+            <w:tcW w:w="2405" w:type="dxa"/>
+            <w:vAlign w:val="center"/>
+          </w:tcPr>
+          <w:p>
+            <w:pPr>
+              <w:jc w:val="center"/>
+              <w:rPr>
+                <w:lang w:val="es-US"/>
+              </w:rPr>
+            </w:pPr>
+            <w:proofErr w:type="spellStart"/>
+            <w:r>
+              <w:rPr>
+                <w:lang w:val="es-US"/>
+              </w:rPr>
+              <w:t>XGBoost</w:t>
+            </w:r>
+            <w:proofErr w:type="spellEnd"/>
+          </w:p>
+        </w:tc>
+        <w:tc>
+          <w:tcPr>
+            <w:tcW w:w="4111" w:type="dxa"/>
+            <w:vAlign w:val="center"/>
+          </w:tcPr>
+          <w:p>
+            <w:pPr>
+              <w:jc w:val="center"/>
+              <w:rPr>
+                <w:lang w:val="en-US"/>
+              </w:rPr>
+            </w:pPr>
+            <w:proofErr w:type="spellStart"/>
+            <w:r>
+              <w:rPr>
+                <w:lang w:val="en-US"/>
+              </w:rPr>
+              <w:t>colsample_bytree</w:t>
+            </w:r>
+            <w:proofErr w:type="spellEnd"/>
+            <w:r>
+              <w:rPr>
+                <w:lang w:val="en-US"/>
+              </w:rPr>
+              <w:t xml:space="preserve">: </w:t>
+            </w:r>
+            <w:r>
+              <w:rPr>
+                <w:lang w:val="en-US"/>
+              </w:rPr>
+              <w:t>None</w:t>
+            </w:r>
+          </w:p>
+          <w:p>
+            <w:pPr>
+              <w:jc w:val="center"/>
+              <w:rPr>
+                <w:lang w:val="en-US"/>
+              </w:rPr>
+            </w:pPr>
+            <w:proofErr w:type="spellStart"/>
+            <w:r>
+              <w:rPr>
+                <w:lang w:val="en-US"/>
+              </w:rPr>
+              <w:t>learning_rate</w:t>
+            </w:r>
+            <w:proofErr w:type="spellEnd"/>
+            <w:r>
+              <w:rPr>
+                <w:lang w:val="en-US"/>
+              </w:rPr>
+              <w:t xml:space="preserve">: </w:t>
+            </w:r>
+            <w:r>
+              <w:rPr>
+                <w:lang w:val="en-US"/>
+              </w:rPr>
+              <w:t>None</w:t>
+            </w:r>
+          </w:p>
+          <w:p>
+            <w:pPr>
+              <w:jc w:val="center"/>
+              <w:rPr>
+                <w:lang w:val="en-US"/>
+              </w:rPr>
+            </w:pPr>
+            <w:proofErr w:type="spellStart"/>
+            <w:r>
+              <w:rPr>
+                <w:lang w:val="en-US"/>
+              </w:rPr>
+              <w:t>max_depth</w:t>
+            </w:r>
+            <w:proofErr w:type="spellEnd"/>
+            <w:r>
+              <w:rPr>
+                <w:lang w:val="en-US"/>
+              </w:rPr>
+              <w:t xml:space="preserve">': </w:t>
+            </w:r>
+            <w:r>
+              <w:rPr>
+                <w:lang w:val="en-US"/>
+              </w:rPr>
+              <w:t>None</w:t>
+            </w:r>
+          </w:p>
+          <w:p>
+            <w:pPr>
+              <w:jc w:val="center"/>
+              <w:rPr>
+                <w:lang w:val="en-US"/>
+              </w:rPr>
+            </w:pPr>
+            <w:proofErr w:type="spellStart"/>
+            <w:r>
+              <w:rPr>
+                <w:lang w:val="en-US"/>
+              </w:rPr>
+              <w:t>n_estimators</w:t>
+            </w:r>
+            <w:proofErr w:type="spellEnd"/>
+            <w:r>
+              <w:rPr>
+                <w:lang w:val="en-US"/>
+              </w:rPr>
+              <w:t xml:space="preserve">': </w:t>
+            </w:r>
+            <w:r>
+              <w:rPr>
+                <w:lang w:val="en-US"/>
+              </w:rPr>
+              <w:t>None</w:t>
+            </w:r>
+          </w:p>
+          <w:p>
+            <w:pPr>
+              <w:jc w:val="center"/>
+              <w:rPr>
+                <w:lang w:val="en-US"/>
+              </w:rPr>
+            </w:pPr>
+            <w:r>
+              <w:rPr>
+                <w:lang w:val="en-US"/>
+              </w:rPr>
+              <w:t xml:space="preserve">subsample: </w:t>
+            </w:r>
+            <w:r>
+              <w:rPr>
+                <w:lang w:val="en-US"/>
+              </w:rPr>
+              <w:t>None</w:t>
+            </w:r>
+          </w:p>
+        </w:tc>
+      </w:tr>
+    </w:tbl>
+    <w:p>
+      <w:pPr>
+        <w:jc w:val="both"/>
+        <w:rPr>
+          <w:lang w:val="es-US"/>
+        </w:rPr>
+      </w:pPr>
+    </w:p>
+    <w:p>
+      <w:pPr>
+        <w:pStyle w:val="Ttulo2"/>
+        <w:rPr>
+          <w:lang w:val="es-US"/>
+        </w:rPr>
+      </w:pPr>
+      <w:r>
+        <w:rPr>
+          <w:lang w:val="es-US"/>
+        </w:rPr>
+        <w:t>Resultados</w:t>
+      </w:r>
+    </w:p>
+    <w:p>
+      <w:pPr>
+        <w:jc w:val="both"/>
+        <w:rPr>
+          <w:lang w:val="es-US"/>
+        </w:rPr>
+      </w:pPr>
+      <w:r>
+        <w:rPr>
+          <w:b/>
+          <w:bCs/>
+          <w:lang w:val="es-US"/>
+        </w:rPr>
+        <w:t xml:space="preserve">Cuadro </w:t>
+      </w:r>
+      <w:r>
+        <w:rPr>
+          <w:b/>
+          <w:bCs/>
+          <w:lang w:val="es-US"/>
+        </w:rPr>
+        <w:t>3</w:t>
+      </w:r>
+      <w:r>
+        <w:rPr>
+          <w:b/>
+          <w:bCs/>
+          <w:lang w:val="es-US"/>
+        </w:rPr>
+        <w:t>:</w:t>
       </w:r>
       <w:r>
         <w:rPr>
@@ -1472,7 +2610,23 @@
           <w:bCs/>
           <w:lang w:val="es-US"/>
         </w:rPr>
-        <w:t>Figura x:</w:t>
+        <w:t xml:space="preserve">Figura </w:t>
+      </w:r>
+      <w:r>
+        <w:rPr>
+          <w:b/>
+          <w:bCs/>
+          <w:lang w:val="es-US"/>
+        </w:rPr>
+        <w:t>1</w:t>
+      </w:r>
+      <w:r>
+        <w:rPr>
+          <w:b/>
+          <w:bCs/>
+          <w:lang w:val="es-US"/>
+        </w:rPr>
+        <w:t>:</w:t>
       </w:r>
       <w:r>
         <w:rPr>
@@ -1492,6 +2646,7 @@
           <w:noProof/>
           <w:lang w:val="es-US"/>
         </w:rPr>
+        <w:lastRenderedPageBreak/>
         <w:drawing>
           <wp:anchor distT="0" distB="0" distL="114300" distR="114300" simplePos="0" relativeHeight="251658240" behindDoc="0" locked="0" layoutInCell="1" allowOverlap="1" wp14:anchorId="195AC736" wp14:editId="60EC6ADA">
             <wp:simplePos x="0" y="0"/>
@@ -1695,112 +2850,144 @@
           <w:bCs/>
           <w:lang w:val="es-US"/>
         </w:rPr>
-        <w:t>Figura x:</w:t>
-      </w:r>
-      <w:r>
-        <w:rPr>
-          <w:lang w:val="es-US"/>
-        </w:rPr>
-        <w:t xml:space="preserve"> Matriz de confusión del algoritmo de Random Forest para el modelo entrenado con píxeles originales.</w:t>
-      </w:r>
-    </w:p>
-    <w:p>
-      <w:pPr>
-        <w:rPr>
-          <w:lang w:val="es-US"/>
-        </w:rPr>
-      </w:pPr>
-    </w:p>
-    <w:p>
-      <w:pPr>
-        <w:rPr>
-          <w:lang w:val="es-US"/>
-        </w:rPr>
-      </w:pPr>
-    </w:p>
-    <w:p>
-      <w:pPr>
-        <w:rPr>
-          <w:lang w:val="es-US"/>
-        </w:rPr>
-      </w:pPr>
-    </w:p>
-    <w:p>
-      <w:pPr>
-        <w:rPr>
-          <w:lang w:val="es-US"/>
-        </w:rPr>
-      </w:pPr>
-    </w:p>
-    <w:p>
-      <w:pPr>
-        <w:rPr>
-          <w:lang w:val="es-US"/>
-        </w:rPr>
-      </w:pPr>
-    </w:p>
-    <w:p>
-      <w:pPr>
-        <w:rPr>
-          <w:lang w:val="es-US"/>
-        </w:rPr>
-      </w:pPr>
-    </w:p>
-    <w:p>
-      <w:pPr>
-        <w:rPr>
-          <w:lang w:val="es-US"/>
-        </w:rPr>
-      </w:pPr>
-    </w:p>
-    <w:p>
-      <w:pPr>
-        <w:jc w:val="both"/>
-        <w:rPr>
-          <w:lang w:val="es-US"/>
-        </w:rPr>
-      </w:pPr>
+        <w:t xml:space="preserve">Figura </w:t>
+      </w:r>
       <w:r>
         <w:rPr>
           <w:b/>
           <w:bCs/>
           <w:lang w:val="es-US"/>
         </w:rPr>
+        <w:t>2</w:t>
+      </w:r>
+      <w:r>
+        <w:rPr>
+          <w:b/>
+          <w:bCs/>
+          <w:lang w:val="es-US"/>
+        </w:rPr>
+        <w:t>:</w:t>
+      </w:r>
+      <w:r>
+        <w:rPr>
+          <w:lang w:val="es-US"/>
+        </w:rPr>
+        <w:t xml:space="preserve"> Matriz de confusión del algoritmo de Random Forest para el modelo entrenado con píxeles originales.</w:t>
+      </w:r>
+    </w:p>
+    <w:p>
+      <w:pPr>
+        <w:rPr>
+          <w:lang w:val="es-US"/>
+        </w:rPr>
+      </w:pPr>
+    </w:p>
+    <w:p>
+      <w:pPr>
+        <w:rPr>
+          <w:lang w:val="es-US"/>
+        </w:rPr>
+      </w:pPr>
+    </w:p>
+    <w:p>
+      <w:pPr>
+        <w:rPr>
+          <w:lang w:val="es-US"/>
+        </w:rPr>
+      </w:pPr>
+    </w:p>
+    <w:p>
+      <w:pPr>
+        <w:rPr>
+          <w:lang w:val="es-US"/>
+        </w:rPr>
+      </w:pPr>
+    </w:p>
+    <w:p>
+      <w:pPr>
+        <w:rPr>
+          <w:lang w:val="es-US"/>
+        </w:rPr>
+      </w:pPr>
+    </w:p>
+    <w:p>
+      <w:pPr>
+        <w:rPr>
+          <w:lang w:val="es-US"/>
+        </w:rPr>
+      </w:pPr>
+    </w:p>
+    <w:p>
+      <w:pPr>
+        <w:rPr>
+          <w:lang w:val="es-US"/>
+        </w:rPr>
+      </w:pPr>
+    </w:p>
+    <w:p>
+      <w:pPr>
+        <w:jc w:val="both"/>
+        <w:rPr>
+          <w:lang w:val="es-US"/>
+        </w:rPr>
+      </w:pPr>
+      <w:r>
+        <w:rPr>
+          <w:b/>
+          <w:bCs/>
+          <w:lang w:val="es-US"/>
+        </w:rPr>
+        <w:t xml:space="preserve">Figura </w:t>
+      </w:r>
+      <w:r>
+        <w:rPr>
+          <w:b/>
+          <w:bCs/>
+          <w:lang w:val="es-US"/>
+        </w:rPr>
+        <w:t>3</w:t>
+      </w:r>
+      <w:r>
+        <w:rPr>
+          <w:b/>
+          <w:bCs/>
+          <w:lang w:val="es-US"/>
+        </w:rPr>
+        <w:t>:</w:t>
+      </w:r>
+      <w:r>
+        <w:rPr>
+          <w:lang w:val="es-US"/>
+        </w:rPr>
+        <w:t xml:space="preserve"> Matriz de confusión del algoritmo de </w:t>
+      </w:r>
+      <w:proofErr w:type="spellStart"/>
+      <w:r>
+        <w:rPr>
+          <w:lang w:val="es-US"/>
+        </w:rPr>
+        <w:t>XGBoost</w:t>
+      </w:r>
+      <w:proofErr w:type="spellEnd"/>
+      <w:r>
+        <w:rPr>
+          <w:lang w:val="es-US"/>
+        </w:rPr>
+        <w:t xml:space="preserve"> para el modelo entrenado con píxeles originales.</w:t>
+      </w:r>
+    </w:p>
+    <w:p>
+      <w:pPr>
+        <w:rPr>
+          <w:lang w:val="es-US"/>
+        </w:rPr>
+      </w:pPr>
+      <w:r>
+        <w:rPr>
+          <w:noProof/>
+          <w:lang w:val="es-US"/>
+        </w:rPr>
         <w:lastRenderedPageBreak/>
-        <w:t>Figura x:</w:t>
-      </w:r>
-      <w:r>
-        <w:rPr>
-          <w:lang w:val="es-US"/>
-        </w:rPr>
-        <w:t xml:space="preserve"> Matriz de confusión del algoritmo de </w:t>
-      </w:r>
-      <w:proofErr w:type="spellStart"/>
-      <w:r>
-        <w:rPr>
-          <w:lang w:val="es-US"/>
-        </w:rPr>
-        <w:t>XGBoost</w:t>
-      </w:r>
-      <w:proofErr w:type="spellEnd"/>
-      <w:r>
-        <w:rPr>
-          <w:lang w:val="es-US"/>
-        </w:rPr>
-        <w:t xml:space="preserve"> para el modelo entrenado con píxeles originales.</w:t>
-      </w:r>
-    </w:p>
-    <w:p>
-      <w:pPr>
-        <w:rPr>
-          <w:lang w:val="es-US"/>
-        </w:rPr>
-      </w:pPr>
-      <w:r>
-        <w:rPr>
-          <w:noProof/>
-          <w:lang w:val="es-US"/>
-        </w:rPr>
         <w:drawing>
           <wp:anchor distT="0" distB="0" distL="114300" distR="114300" simplePos="0" relativeHeight="251660288" behindDoc="0" locked="0" layoutInCell="1" allowOverlap="1" wp14:anchorId="3BAB4013" wp14:editId="6E33287D">
             <wp:simplePos x="0" y="0"/>
@@ -1935,6 +3122,1040 @@
           <w:lang w:val="es-US"/>
         </w:rPr>
       </w:pPr>
+      <w:r>
+        <w:rPr>
+          <w:b/>
+          <w:bCs/>
+          <w:lang w:val="es-US"/>
+        </w:rPr>
+        <w:t xml:space="preserve">Cuadro </w:t>
+      </w:r>
+      <w:r>
+        <w:rPr>
+          <w:b/>
+          <w:bCs/>
+          <w:lang w:val="es-US"/>
+        </w:rPr>
+        <w:t>4</w:t>
+      </w:r>
+      <w:r>
+        <w:rPr>
+          <w:b/>
+          <w:bCs/>
+          <w:lang w:val="es-US"/>
+        </w:rPr>
+        <w:t>:</w:t>
+      </w:r>
+      <w:r>
+        <w:rPr>
+          <w:lang w:val="es-US"/>
+        </w:rPr>
+        <w:t xml:space="preserve"> Métricas de los modelos usados en la predicción de presencia alta y baja de cianobacterias con </w:t>
+      </w:r>
+      <w:r>
+        <w:rPr>
+          <w:lang w:val="es-US"/>
+        </w:rPr>
+        <w:t>proyectados.</w:t>
+      </w:r>
+    </w:p>
+    <w:tbl>
+      <w:tblPr>
+        <w:tblStyle w:val="Tablaconcuadrcula"/>
+        <w:tblW w:w="0" w:type="auto"/>
+        <w:tblLook w:val="04A0" w:firstRow="1" w:lastRow="0" w:firstColumn="1" w:lastColumn="0" w:noHBand="0" w:noVBand="1"/>
+      </w:tblPr>
+      <w:tblGrid>
+        <w:gridCol w:w="2263"/>
+        <w:gridCol w:w="1701"/>
+        <w:gridCol w:w="1843"/>
+        <w:gridCol w:w="1490"/>
+        <w:gridCol w:w="1531"/>
+      </w:tblGrid>
+      <w:tr>
+        <w:tc>
+          <w:tcPr>
+            <w:tcW w:w="2263" w:type="dxa"/>
+          </w:tcPr>
+          <w:p>
+            <w:pPr>
+              <w:jc w:val="center"/>
+              <w:rPr>
+                <w:b/>
+                <w:bCs/>
+                <w:lang w:val="es-US"/>
+              </w:rPr>
+            </w:pPr>
+            <w:r>
+              <w:rPr>
+                <w:b/>
+                <w:bCs/>
+                <w:lang w:val="es-US"/>
+              </w:rPr>
+              <w:t>Modelos</w:t>
+            </w:r>
+          </w:p>
+        </w:tc>
+        <w:tc>
+          <w:tcPr>
+            <w:tcW w:w="1701" w:type="dxa"/>
+          </w:tcPr>
+          <w:p>
+            <w:pPr>
+              <w:jc w:val="center"/>
+              <w:rPr>
+                <w:b/>
+                <w:bCs/>
+                <w:lang w:val="es-US"/>
+              </w:rPr>
+            </w:pPr>
+            <w:proofErr w:type="spellStart"/>
+            <w:r>
+              <w:rPr>
+                <w:b/>
+                <w:bCs/>
+                <w:lang w:val="es-US"/>
+              </w:rPr>
+              <w:t>Precision</w:t>
+            </w:r>
+            <w:proofErr w:type="spellEnd"/>
+          </w:p>
+        </w:tc>
+        <w:tc>
+          <w:tcPr>
+            <w:tcW w:w="1843" w:type="dxa"/>
+          </w:tcPr>
+          <w:p>
+            <w:pPr>
+              <w:jc w:val="center"/>
+              <w:rPr>
+                <w:b/>
+                <w:bCs/>
+                <w:lang w:val="es-US"/>
+              </w:rPr>
+            </w:pPr>
+            <w:proofErr w:type="spellStart"/>
+            <w:r>
+              <w:rPr>
+                <w:b/>
+                <w:bCs/>
+                <w:lang w:val="es-US"/>
+              </w:rPr>
+              <w:t>Recall</w:t>
+            </w:r>
+            <w:proofErr w:type="spellEnd"/>
+          </w:p>
+        </w:tc>
+        <w:tc>
+          <w:tcPr>
+            <w:tcW w:w="1490" w:type="dxa"/>
+          </w:tcPr>
+          <w:p>
+            <w:pPr>
+              <w:jc w:val="center"/>
+              <w:rPr>
+                <w:b/>
+                <w:bCs/>
+                <w:lang w:val="es-US"/>
+              </w:rPr>
+            </w:pPr>
+            <w:r>
+              <w:rPr>
+                <w:b/>
+                <w:bCs/>
+                <w:lang w:val="es-US"/>
+              </w:rPr>
+              <w:t>F1-score</w:t>
+            </w:r>
+          </w:p>
+        </w:tc>
+        <w:tc>
+          <w:tcPr>
+            <w:tcW w:w="1531" w:type="dxa"/>
+          </w:tcPr>
+          <w:p>
+            <w:pPr>
+              <w:jc w:val="center"/>
+              <w:rPr>
+                <w:b/>
+                <w:bCs/>
+                <w:lang w:val="es-US"/>
+              </w:rPr>
+            </w:pPr>
+            <w:r>
+              <w:rPr>
+                <w:b/>
+                <w:bCs/>
+                <w:lang w:val="es-US"/>
+              </w:rPr>
+              <w:t>ROC-AUC</w:t>
+            </w:r>
+          </w:p>
+        </w:tc>
+      </w:tr>
+      <w:tr>
+        <w:tc>
+          <w:tcPr>
+            <w:tcW w:w="2263" w:type="dxa"/>
+          </w:tcPr>
+          <w:p>
+            <w:pPr>
+              <w:jc w:val="center"/>
+              <w:rPr>
+                <w:lang w:val="es-US"/>
+              </w:rPr>
+            </w:pPr>
+            <w:r>
+              <w:rPr>
+                <w:lang w:val="es-US"/>
+              </w:rPr>
+              <w:t>Regresión logística</w:t>
+            </w:r>
+          </w:p>
+        </w:tc>
+        <w:tc>
+          <w:tcPr>
+            <w:tcW w:w="1701" w:type="dxa"/>
+          </w:tcPr>
+          <w:p>
+            <w:pPr>
+              <w:jc w:val="center"/>
+              <w:rPr>
+                <w:lang w:val="es-US"/>
+              </w:rPr>
+            </w:pPr>
+            <w:r>
+              <w:rPr>
+                <w:lang w:val="es-US"/>
+              </w:rPr>
+              <w:t>0.</w:t>
+            </w:r>
+            <w:r>
+              <w:rPr>
+                <w:lang w:val="es-US"/>
+              </w:rPr>
+              <w:t>7500</w:t>
+            </w:r>
+          </w:p>
+        </w:tc>
+        <w:tc>
+          <w:tcPr>
+            <w:tcW w:w="1843" w:type="dxa"/>
+          </w:tcPr>
+          <w:p>
+            <w:pPr>
+              <w:jc w:val="center"/>
+              <w:rPr>
+                <w:lang w:val="es-US"/>
+              </w:rPr>
+            </w:pPr>
+            <w:r>
+              <w:rPr>
+                <w:lang w:val="es-US"/>
+              </w:rPr>
+              <w:t>0.9</w:t>
+            </w:r>
+          </w:p>
+        </w:tc>
+        <w:tc>
+          <w:tcPr>
+            <w:tcW w:w="1490" w:type="dxa"/>
+          </w:tcPr>
+          <w:p>
+            <w:pPr>
+              <w:jc w:val="center"/>
+              <w:rPr>
+                <w:lang w:val="es-US"/>
+              </w:rPr>
+            </w:pPr>
+            <w:r>
+              <w:rPr>
+                <w:lang w:val="es-US"/>
+              </w:rPr>
+              <w:t>0.</w:t>
+            </w:r>
+            <w:r>
+              <w:rPr>
+                <w:lang w:val="es-US"/>
+              </w:rPr>
+              <w:t>8182</w:t>
+            </w:r>
+          </w:p>
+        </w:tc>
+        <w:tc>
+          <w:tcPr>
+            <w:tcW w:w="1531" w:type="dxa"/>
+          </w:tcPr>
+          <w:p>
+            <w:pPr>
+              <w:jc w:val="center"/>
+              <w:rPr>
+                <w:lang w:val="es-US"/>
+              </w:rPr>
+            </w:pPr>
+            <w:r>
+              <w:rPr>
+                <w:lang w:val="es-US"/>
+              </w:rPr>
+              <w:t>0.9</w:t>
+            </w:r>
+            <w:r>
+              <w:rPr>
+                <w:lang w:val="es-US"/>
+              </w:rPr>
+              <w:t>091</w:t>
+            </w:r>
+          </w:p>
+        </w:tc>
+      </w:tr>
+      <w:tr>
+        <w:tc>
+          <w:tcPr>
+            <w:tcW w:w="2263" w:type="dxa"/>
+          </w:tcPr>
+          <w:p>
+            <w:pPr>
+              <w:jc w:val="center"/>
+              <w:rPr>
+                <w:lang w:val="es-US"/>
+              </w:rPr>
+            </w:pPr>
+            <w:r>
+              <w:rPr>
+                <w:lang w:val="es-US"/>
+              </w:rPr>
+              <w:t>Random Forest</w:t>
+            </w:r>
+          </w:p>
+        </w:tc>
+        <w:tc>
+          <w:tcPr>
+            <w:tcW w:w="1701" w:type="dxa"/>
+          </w:tcPr>
+          <w:p>
+            <w:pPr>
+              <w:jc w:val="center"/>
+              <w:rPr>
+                <w:lang w:val="es-US"/>
+              </w:rPr>
+            </w:pPr>
+            <w:r>
+              <w:rPr>
+                <w:lang w:val="es-US"/>
+              </w:rPr>
+              <w:t>0.</w:t>
+            </w:r>
+            <w:r>
+              <w:rPr>
+                <w:lang w:val="es-US"/>
+              </w:rPr>
+              <w:t>7692</w:t>
+            </w:r>
+          </w:p>
+        </w:tc>
+        <w:tc>
+          <w:tcPr>
+            <w:tcW w:w="1843" w:type="dxa"/>
+          </w:tcPr>
+          <w:p>
+            <w:pPr>
+              <w:jc w:val="center"/>
+              <w:rPr>
+                <w:lang w:val="es-US"/>
+              </w:rPr>
+            </w:pPr>
+            <w:r>
+              <w:rPr>
+                <w:lang w:val="es-US"/>
+              </w:rPr>
+              <w:t>1.0</w:t>
+            </w:r>
+          </w:p>
+        </w:tc>
+        <w:tc>
+          <w:tcPr>
+            <w:tcW w:w="1490" w:type="dxa"/>
+          </w:tcPr>
+          <w:p>
+            <w:pPr>
+              <w:jc w:val="center"/>
+              <w:rPr>
+                <w:lang w:val="es-US"/>
+              </w:rPr>
+            </w:pPr>
+            <w:r>
+              <w:rPr>
+                <w:lang w:val="es-US"/>
+              </w:rPr>
+              <w:t>0.</w:t>
+            </w:r>
+            <w:r>
+              <w:rPr>
+                <w:lang w:val="es-US"/>
+              </w:rPr>
+              <w:t>9091</w:t>
+            </w:r>
+          </w:p>
+        </w:tc>
+        <w:tc>
+          <w:tcPr>
+            <w:tcW w:w="1531" w:type="dxa"/>
+          </w:tcPr>
+          <w:p>
+            <w:pPr>
+              <w:jc w:val="center"/>
+              <w:rPr>
+                <w:lang w:val="es-US"/>
+              </w:rPr>
+            </w:pPr>
+            <w:r>
+              <w:rPr>
+                <w:lang w:val="es-US"/>
+              </w:rPr>
+              <w:t>0.9</w:t>
+            </w:r>
+            <w:r>
+              <w:rPr>
+                <w:lang w:val="es-US"/>
+              </w:rPr>
+              <w:t>091</w:t>
+            </w:r>
+          </w:p>
+        </w:tc>
+      </w:tr>
+      <w:tr>
+        <w:tc>
+          <w:tcPr>
+            <w:tcW w:w="2263" w:type="dxa"/>
+          </w:tcPr>
+          <w:p>
+            <w:pPr>
+              <w:jc w:val="center"/>
+              <w:rPr>
+                <w:lang w:val="es-US"/>
+              </w:rPr>
+            </w:pPr>
+            <w:proofErr w:type="spellStart"/>
+            <w:r>
+              <w:rPr>
+                <w:lang w:val="es-US"/>
+              </w:rPr>
+              <w:t>XGBoost</w:t>
+            </w:r>
+            <w:proofErr w:type="spellEnd"/>
+          </w:p>
+        </w:tc>
+        <w:tc>
+          <w:tcPr>
+            <w:tcW w:w="1701" w:type="dxa"/>
+          </w:tcPr>
+          <w:p>
+            <w:pPr>
+              <w:jc w:val="center"/>
+              <w:rPr>
+                <w:lang w:val="es-US"/>
+              </w:rPr>
+            </w:pPr>
+            <w:r>
+              <w:rPr>
+                <w:lang w:val="es-US"/>
+              </w:rPr>
+              <w:t>0.</w:t>
+            </w:r>
+            <w:r>
+              <w:rPr>
+                <w:lang w:val="es-US"/>
+              </w:rPr>
+              <w:t>7692</w:t>
+            </w:r>
+          </w:p>
+        </w:tc>
+        <w:tc>
+          <w:tcPr>
+            <w:tcW w:w="1843" w:type="dxa"/>
+          </w:tcPr>
+          <w:p>
+            <w:pPr>
+              <w:jc w:val="center"/>
+              <w:rPr>
+                <w:lang w:val="es-US"/>
+              </w:rPr>
+            </w:pPr>
+            <w:r>
+              <w:rPr>
+                <w:lang w:val="es-US"/>
+              </w:rPr>
+              <w:t>1.0</w:t>
+            </w:r>
+          </w:p>
+        </w:tc>
+        <w:tc>
+          <w:tcPr>
+            <w:tcW w:w="1490" w:type="dxa"/>
+          </w:tcPr>
+          <w:p>
+            <w:pPr>
+              <w:jc w:val="center"/>
+              <w:rPr>
+                <w:lang w:val="es-US"/>
+              </w:rPr>
+            </w:pPr>
+            <w:r>
+              <w:rPr>
+                <w:lang w:val="es-US"/>
+              </w:rPr>
+              <w:t>0.</w:t>
+            </w:r>
+            <w:r>
+              <w:rPr>
+                <w:lang w:val="es-US"/>
+              </w:rPr>
+              <w:t>9000</w:t>
+            </w:r>
+          </w:p>
+        </w:tc>
+        <w:tc>
+          <w:tcPr>
+            <w:tcW w:w="1531" w:type="dxa"/>
+          </w:tcPr>
+          <w:p>
+            <w:pPr>
+              <w:jc w:val="center"/>
+              <w:rPr>
+                <w:lang w:val="es-US"/>
+              </w:rPr>
+            </w:pPr>
+            <w:r>
+              <w:rPr>
+                <w:lang w:val="es-US"/>
+              </w:rPr>
+              <w:t>0.9</w:t>
+            </w:r>
+            <w:r>
+              <w:rPr>
+                <w:lang w:val="es-US"/>
+              </w:rPr>
+              <w:t>000</w:t>
+            </w:r>
+          </w:p>
+        </w:tc>
+      </w:tr>
+    </w:tbl>
+    <w:p>
+      <w:pPr>
+        <w:rPr>
+          <w:lang w:val="es-US"/>
+        </w:rPr>
+      </w:pPr>
+    </w:p>
+    <w:p>
+      <w:pPr>
+        <w:rPr>
+          <w:lang w:val="es-US"/>
+        </w:rPr>
+      </w:pPr>
+      <w:r>
+        <w:rPr>
+          <w:b/>
+          <w:bCs/>
+          <w:lang w:val="es-US"/>
+        </w:rPr>
+        <w:t xml:space="preserve">Cuadro </w:t>
+      </w:r>
+      <w:r>
+        <w:rPr>
+          <w:b/>
+          <w:bCs/>
+          <w:lang w:val="es-US"/>
+        </w:rPr>
+        <w:t>5</w:t>
+      </w:r>
+      <w:r>
+        <w:rPr>
+          <w:b/>
+          <w:bCs/>
+          <w:lang w:val="es-US"/>
+        </w:rPr>
+        <w:t>:</w:t>
+      </w:r>
+      <w:r>
+        <w:rPr>
+          <w:lang w:val="es-US"/>
+        </w:rPr>
+        <w:t xml:space="preserve"> </w:t>
+      </w:r>
+      <w:r>
+        <w:rPr>
+          <w:lang w:val="es-US"/>
+        </w:rPr>
+        <w:t>Diferencia de las m</w:t>
+      </w:r>
+      <w:r>
+        <w:rPr>
+          <w:lang w:val="es-US"/>
+        </w:rPr>
+        <w:t>étricas de l</w:t>
+      </w:r>
+      <w:r>
+        <w:rPr>
+          <w:lang w:val="es-US"/>
+        </w:rPr>
+        <w:t>os</w:t>
+      </w:r>
+      <w:r>
+        <w:rPr>
+          <w:lang w:val="es-US"/>
+        </w:rPr>
+        <w:t xml:space="preserve"> modelos usados en la predicción de presencia alta y baja de cianobacterias</w:t>
+      </w:r>
+      <w:r>
+        <w:rPr>
+          <w:lang w:val="es-US"/>
+        </w:rPr>
+        <w:t>. Se ha restado la versión original a la versión espacial.</w:t>
+      </w:r>
+    </w:p>
+    <w:tbl>
+      <w:tblPr>
+        <w:tblStyle w:val="Tablaconcuadrcula"/>
+        <w:tblW w:w="0" w:type="auto"/>
+        <w:tblLook w:val="04A0" w:firstRow="1" w:lastRow="0" w:firstColumn="1" w:lastColumn="0" w:noHBand="0" w:noVBand="1"/>
+      </w:tblPr>
+      <w:tblGrid>
+        <w:gridCol w:w="2263"/>
+        <w:gridCol w:w="1701"/>
+        <w:gridCol w:w="1843"/>
+        <w:gridCol w:w="1490"/>
+        <w:gridCol w:w="1531"/>
+      </w:tblGrid>
+      <w:tr>
+        <w:tc>
+          <w:tcPr>
+            <w:tcW w:w="2263" w:type="dxa"/>
+          </w:tcPr>
+          <w:p>
+            <w:pPr>
+              <w:jc w:val="center"/>
+              <w:rPr>
+                <w:b/>
+                <w:bCs/>
+                <w:lang w:val="es-US"/>
+              </w:rPr>
+            </w:pPr>
+            <w:r>
+              <w:rPr>
+                <w:b/>
+                <w:bCs/>
+                <w:lang w:val="es-US"/>
+              </w:rPr>
+              <w:t>Modelos</w:t>
+            </w:r>
+          </w:p>
+        </w:tc>
+        <w:tc>
+          <w:tcPr>
+            <w:tcW w:w="1701" w:type="dxa"/>
+          </w:tcPr>
+          <w:p>
+            <w:pPr>
+              <w:jc w:val="center"/>
+              <w:rPr>
+                <w:b/>
+                <w:bCs/>
+                <w:lang w:val="es-US"/>
+              </w:rPr>
+            </w:pPr>
+            <w:proofErr w:type="spellStart"/>
+            <w:r>
+              <w:rPr>
+                <w:b/>
+                <w:bCs/>
+                <w:lang w:val="es-US"/>
+              </w:rPr>
+              <w:t>Precision</w:t>
+            </w:r>
+            <w:proofErr w:type="spellEnd"/>
+          </w:p>
+        </w:tc>
+        <w:tc>
+          <w:tcPr>
+            <w:tcW w:w="1843" w:type="dxa"/>
+          </w:tcPr>
+          <w:p>
+            <w:pPr>
+              <w:jc w:val="center"/>
+              <w:rPr>
+                <w:b/>
+                <w:bCs/>
+                <w:lang w:val="es-US"/>
+              </w:rPr>
+            </w:pPr>
+            <w:proofErr w:type="spellStart"/>
+            <w:r>
+              <w:rPr>
+                <w:b/>
+                <w:bCs/>
+                <w:lang w:val="es-US"/>
+              </w:rPr>
+              <w:t>Recall</w:t>
+            </w:r>
+            <w:proofErr w:type="spellEnd"/>
+          </w:p>
+        </w:tc>
+        <w:tc>
+          <w:tcPr>
+            <w:tcW w:w="1490" w:type="dxa"/>
+          </w:tcPr>
+          <w:p>
+            <w:pPr>
+              <w:jc w:val="center"/>
+              <w:rPr>
+                <w:b/>
+                <w:bCs/>
+                <w:lang w:val="es-US"/>
+              </w:rPr>
+            </w:pPr>
+            <w:r>
+              <w:rPr>
+                <w:b/>
+                <w:bCs/>
+                <w:lang w:val="es-US"/>
+              </w:rPr>
+              <w:t>F1-score</w:t>
+            </w:r>
+          </w:p>
+        </w:tc>
+        <w:tc>
+          <w:tcPr>
+            <w:tcW w:w="1531" w:type="dxa"/>
+          </w:tcPr>
+          <w:p>
+            <w:pPr>
+              <w:jc w:val="center"/>
+              <w:rPr>
+                <w:b/>
+                <w:bCs/>
+                <w:lang w:val="es-US"/>
+              </w:rPr>
+            </w:pPr>
+            <w:r>
+              <w:rPr>
+                <w:b/>
+                <w:bCs/>
+                <w:lang w:val="es-US"/>
+              </w:rPr>
+              <w:t>ROC-AUC</w:t>
+            </w:r>
+          </w:p>
+        </w:tc>
+      </w:tr>
+      <w:tr>
+        <w:tc>
+          <w:tcPr>
+            <w:tcW w:w="2263" w:type="dxa"/>
+          </w:tcPr>
+          <w:p>
+            <w:pPr>
+              <w:jc w:val="center"/>
+              <w:rPr>
+                <w:lang w:val="es-US"/>
+              </w:rPr>
+            </w:pPr>
+            <w:r>
+              <w:rPr>
+                <w:lang w:val="es-US"/>
+              </w:rPr>
+              <w:t>Regresión logística</w:t>
+            </w:r>
+          </w:p>
+        </w:tc>
+        <w:tc>
+          <w:tcPr>
+            <w:tcW w:w="1701" w:type="dxa"/>
+          </w:tcPr>
+          <w:p>
+            <w:pPr>
+              <w:jc w:val="center"/>
+              <w:rPr>
+                <w:lang w:val="es-US"/>
+              </w:rPr>
+            </w:pPr>
+            <w:r>
+              <w:rPr>
+                <w:lang w:val="es-US"/>
+              </w:rPr>
+              <w:t>-0.083</w:t>
+            </w:r>
+          </w:p>
+        </w:tc>
+        <w:tc>
+          <w:tcPr>
+            <w:tcW w:w="1843" w:type="dxa"/>
+          </w:tcPr>
+          <w:p>
+            <w:pPr>
+              <w:jc w:val="center"/>
+              <w:rPr>
+                <w:lang w:val="es-US"/>
+              </w:rPr>
+            </w:pPr>
+            <w:r>
+              <w:rPr>
+                <w:lang w:val="es-US"/>
+              </w:rPr>
+              <w:t>-0.1</w:t>
+            </w:r>
+          </w:p>
+        </w:tc>
+        <w:tc>
+          <w:tcPr>
+            <w:tcW w:w="1490" w:type="dxa"/>
+          </w:tcPr>
+          <w:p>
+            <w:pPr>
+              <w:jc w:val="center"/>
+              <w:rPr>
+                <w:lang w:val="es-US"/>
+              </w:rPr>
+            </w:pPr>
+            <w:r>
+              <w:rPr>
+                <w:lang w:val="es-US"/>
+              </w:rPr>
+              <w:t>-0.091</w:t>
+            </w:r>
+          </w:p>
+        </w:tc>
+        <w:tc>
+          <w:tcPr>
+            <w:tcW w:w="1531" w:type="dxa"/>
+          </w:tcPr>
+          <w:p>
+            <w:pPr>
+              <w:jc w:val="center"/>
+              <w:rPr>
+                <w:lang w:val="es-US"/>
+              </w:rPr>
+            </w:pPr>
+            <w:r>
+              <w:rPr>
+                <w:lang w:val="es-US"/>
+              </w:rPr>
+              <w:t>-0.041</w:t>
+            </w:r>
+          </w:p>
+        </w:tc>
+      </w:tr>
+      <w:tr>
+        <w:tc>
+          <w:tcPr>
+            <w:tcW w:w="2263" w:type="dxa"/>
+          </w:tcPr>
+          <w:p>
+            <w:pPr>
+              <w:jc w:val="center"/>
+              <w:rPr>
+                <w:lang w:val="es-US"/>
+              </w:rPr>
+            </w:pPr>
+            <w:r>
+              <w:rPr>
+                <w:lang w:val="es-US"/>
+              </w:rPr>
+              <w:t>Random Forest</w:t>
+            </w:r>
+          </w:p>
+        </w:tc>
+        <w:tc>
+          <w:tcPr>
+            <w:tcW w:w="1701" w:type="dxa"/>
+          </w:tcPr>
+          <w:p>
+            <w:pPr>
+              <w:jc w:val="center"/>
+              <w:rPr>
+                <w:lang w:val="es-US"/>
+              </w:rPr>
+            </w:pPr>
+            <w:r>
+              <w:rPr>
+                <w:lang w:val="es-US"/>
+              </w:rPr>
+              <w:t>-0.064</w:t>
+            </w:r>
+          </w:p>
+        </w:tc>
+        <w:tc>
+          <w:tcPr>
+            <w:tcW w:w="1843" w:type="dxa"/>
+          </w:tcPr>
+          <w:p>
+            <w:pPr>
+              <w:jc w:val="center"/>
+              <w:rPr>
+                <w:lang w:val="es-US"/>
+              </w:rPr>
+            </w:pPr>
+            <w:r>
+              <w:rPr>
+                <w:lang w:val="es-US"/>
+              </w:rPr>
+              <w:t>0.0</w:t>
+            </w:r>
+          </w:p>
+        </w:tc>
+        <w:tc>
+          <w:tcPr>
+            <w:tcW w:w="1490" w:type="dxa"/>
+          </w:tcPr>
+          <w:p>
+            <w:pPr>
+              <w:jc w:val="center"/>
+              <w:rPr>
+                <w:lang w:val="es-US"/>
+              </w:rPr>
+            </w:pPr>
+            <w:r>
+              <w:rPr>
+                <w:lang w:val="es-US"/>
+              </w:rPr>
+              <w:t>-0.040</w:t>
+            </w:r>
+          </w:p>
+        </w:tc>
+        <w:tc>
+          <w:tcPr>
+            <w:tcW w:w="1531" w:type="dxa"/>
+          </w:tcPr>
+          <w:p>
+            <w:pPr>
+              <w:jc w:val="center"/>
+              <w:rPr>
+                <w:lang w:val="es-US"/>
+              </w:rPr>
+            </w:pPr>
+            <w:r>
+              <w:rPr>
+                <w:lang w:val="es-US"/>
+              </w:rPr>
+              <w:t>-0.074</w:t>
+            </w:r>
+          </w:p>
+        </w:tc>
+      </w:tr>
+      <w:tr>
+        <w:tc>
+          <w:tcPr>
+            <w:tcW w:w="2263" w:type="dxa"/>
+          </w:tcPr>
+          <w:p>
+            <w:pPr>
+              <w:jc w:val="center"/>
+              <w:rPr>
+                <w:lang w:val="es-US"/>
+              </w:rPr>
+            </w:pPr>
+            <w:proofErr w:type="spellStart"/>
+            <w:r>
+              <w:rPr>
+                <w:lang w:val="es-US"/>
+              </w:rPr>
+              <w:t>XGBoost</w:t>
+            </w:r>
+            <w:proofErr w:type="spellEnd"/>
+          </w:p>
+        </w:tc>
+        <w:tc>
+          <w:tcPr>
+            <w:tcW w:w="1701" w:type="dxa"/>
+          </w:tcPr>
+          <w:p>
+            <w:pPr>
+              <w:jc w:val="center"/>
+              <w:rPr>
+                <w:lang w:val="es-US"/>
+              </w:rPr>
+            </w:pPr>
+            <w:r>
+              <w:rPr>
+                <w:lang w:val="es-US"/>
+              </w:rPr>
+              <w:t>-0.140</w:t>
+            </w:r>
+          </w:p>
+        </w:tc>
+        <w:tc>
+          <w:tcPr>
+            <w:tcW w:w="1843" w:type="dxa"/>
+          </w:tcPr>
+          <w:p>
+            <w:pPr>
+              <w:jc w:val="center"/>
+              <w:rPr>
+                <w:lang w:val="es-US"/>
+              </w:rPr>
+            </w:pPr>
+            <w:r>
+              <w:rPr>
+                <w:lang w:val="es-US"/>
+              </w:rPr>
+              <w:t>0.0</w:t>
+            </w:r>
+          </w:p>
+        </w:tc>
+        <w:tc>
+          <w:tcPr>
+            <w:tcW w:w="1490" w:type="dxa"/>
+          </w:tcPr>
+          <w:p>
+            <w:pPr>
+              <w:jc w:val="center"/>
+              <w:rPr>
+                <w:lang w:val="es-US"/>
+              </w:rPr>
+            </w:pPr>
+            <w:r>
+              <w:rPr>
+                <w:lang w:val="es-US"/>
+              </w:rPr>
+              <w:t>-0.083</w:t>
+            </w:r>
+          </w:p>
+        </w:tc>
+        <w:tc>
+          <w:tcPr>
+            <w:tcW w:w="1531" w:type="dxa"/>
+          </w:tcPr>
+          <w:p>
+            <w:pPr>
+              <w:jc w:val="center"/>
+              <w:rPr>
+                <w:lang w:val="es-US"/>
+              </w:rPr>
+            </w:pPr>
+            <w:r>
+              <w:rPr>
+                <w:lang w:val="es-US"/>
+              </w:rPr>
+              <w:t>-0.050</w:t>
+            </w:r>
+          </w:p>
+        </w:tc>
+      </w:tr>
+    </w:tbl>
+    <w:p>
+      <w:pPr>
+        <w:rPr>
+          <w:lang w:val="es-US"/>
+        </w:rPr>
+      </w:pPr>
+    </w:p>
+    <w:p>
+      <w:pPr>
+        <w:rPr>
+          <w:lang w:val="es-US"/>
+        </w:rPr>
+      </w:pPr>
     </w:p>
     <w:p>
       <w:pPr>
@@ -1987,7 +4208,14 @@
         <w:rPr>
           <w:lang w:val="es-US"/>
         </w:rPr>
-        <w:t xml:space="preserve">, respecto a la métrica F1-score, la cual fue elegida debido a que se tenía un desbalance leve entre las etiquetas y se les decidió dar el mismo valor a ambas. </w:t>
+        <w:t xml:space="preserve">, respecto a la métrica F1-score, la cual fue elegida debido a que </w:t>
+      </w:r>
+      <w:r>
+        <w:rPr>
+          <w:lang w:val="es-US"/>
+        </w:rPr>
+        <w:lastRenderedPageBreak/>
+        <w:t xml:space="preserve">se tenía un desbalance leve entre las etiquetas y se les decidió dar el mismo valor a ambas. </w:t>
       </w:r>
     </w:p>
     <w:p>
@@ -2085,28 +4313,199 @@
         <w:rPr>
           <w:lang w:val="es-US"/>
         </w:rPr>
+        <w:t xml:space="preserve">Consideramos que se debe dar más importancia a no predecir incorrectamente las zonas de alta presencia, ya que estas pueden ocasionar problemas de salud o de pérdida de flora y fauna. La métrica más útil sería el </w:t>
+      </w:r>
+      <w:proofErr w:type="spellStart"/>
+      <w:r>
+        <w:rPr>
+          <w:lang w:val="es-US"/>
+        </w:rPr>
+        <w:t>recall</w:t>
+      </w:r>
+      <w:proofErr w:type="spellEnd"/>
+      <w:r>
+        <w:rPr>
+          <w:lang w:val="es-US"/>
+        </w:rPr>
+        <w:t xml:space="preserve">, (tomando alta presencia como positiva), en este caso el modelo </w:t>
+      </w:r>
+      <w:proofErr w:type="spellStart"/>
+      <w:r>
+        <w:rPr>
+          <w:lang w:val="es-US"/>
+        </w:rPr>
+        <w:t>XGBoost</w:t>
+      </w:r>
+      <w:proofErr w:type="spellEnd"/>
+      <w:r>
+        <w:rPr>
+          <w:lang w:val="es-US"/>
+        </w:rPr>
+        <w:t xml:space="preserve"> es considerado el mejor.</w:t>
+      </w:r>
+    </w:p>
+    <w:p>
+      <w:pPr>
+        <w:rPr>
+          <w:lang w:val="es-US"/>
+        </w:rPr>
+      </w:pPr>
+    </w:p>
+    <w:p>
+      <w:pPr>
+        <w:rPr>
+          <w:lang w:val="es-US"/>
+        </w:rPr>
+      </w:pPr>
+    </w:p>
+    <w:p>
+      <w:pPr>
+        <w:rPr>
+          <w:lang w:val="es-US"/>
+        </w:rPr>
+      </w:pPr>
+    </w:p>
+    <w:p>
+      <w:pPr>
+        <w:rPr>
+          <w:lang w:val="es-US"/>
+        </w:rPr>
+      </w:pPr>
+    </w:p>
+    <w:p>
+      <w:pPr>
+        <w:rPr>
+          <w:lang w:val="es-US"/>
+        </w:rPr>
+      </w:pPr>
+    </w:p>
+    <w:p>
+      <w:pPr>
+        <w:rPr>
+          <w:lang w:val="es-US"/>
+        </w:rPr>
+      </w:pPr>
+    </w:p>
+    <w:p>
+      <w:pPr>
+        <w:rPr>
+          <w:lang w:val="es-US"/>
+        </w:rPr>
+      </w:pPr>
+    </w:p>
+    <w:p>
+      <w:pPr>
+        <w:rPr>
+          <w:lang w:val="es-US"/>
+        </w:rPr>
+      </w:pPr>
+    </w:p>
+    <w:p>
+      <w:pPr>
+        <w:rPr>
+          <w:lang w:val="es-US"/>
+        </w:rPr>
+      </w:pPr>
+    </w:p>
+    <w:p>
+      <w:pPr>
+        <w:rPr>
+          <w:lang w:val="es-US"/>
+        </w:rPr>
+      </w:pPr>
+    </w:p>
+    <w:p>
+      <w:pPr>
+        <w:rPr>
+          <w:lang w:val="es-US"/>
+        </w:rPr>
+      </w:pPr>
+    </w:p>
+    <w:p>
+      <w:pPr>
+        <w:pStyle w:val="Ttulo2"/>
+        <w:rPr>
+          <w:lang w:val="es-US"/>
+        </w:rPr>
+      </w:pPr>
+      <w:r>
+        <w:rPr>
+          <w:lang w:val="es-US"/>
+        </w:rPr>
         <w:lastRenderedPageBreak/>
-        <w:t xml:space="preserve">Consideramos que se debe dar más importancia a no predecir incorrectamente las zonas de alta presencia, ya que estas pueden ocasionar problemas de salud o de pérdida de flora y fauna. La métrica más útil sería el </w:t>
+        <w:t>Conclusiones</w:t>
+      </w:r>
+    </w:p>
+    <w:p>
+      <w:pPr>
+        <w:jc w:val="both"/>
+      </w:pPr>
+      <w:r>
+        <w:t>El m</w:t>
+      </w:r>
+      <w:r>
+        <w:t>e</w:t>
+      </w:r>
+      <w:r>
+        <w:t>jor modelo para</w:t>
+      </w:r>
+      <w:r>
+        <w:rPr>
+          <w:lang w:val="es-US"/>
+        </w:rPr>
+        <w:t xml:space="preserve"> la predicción</w:t>
+      </w:r>
+      <w:r>
+        <w:rPr>
+          <w:lang w:val="es-US"/>
+        </w:rPr>
+        <w:t xml:space="preserve"> </w:t>
+      </w:r>
+      <w:r>
+        <w:rPr>
+          <w:lang w:val="es-US"/>
+        </w:rPr>
+        <w:t xml:space="preserve">de presencia alta y baja de cianobacterias con píxeles originales fue el </w:t>
       </w:r>
       <w:proofErr w:type="spellStart"/>
       <w:r>
         <w:rPr>
           <w:lang w:val="es-US"/>
         </w:rPr>
-        <w:t>recall</w:t>
+        <w:t>XGBost</w:t>
       </w:r>
       <w:proofErr w:type="spellEnd"/>
       <w:r>
         <w:rPr>
           <w:lang w:val="es-US"/>
         </w:rPr>
-        <w:t xml:space="preserve">, (tomando alta presencia como positiva), en este caso el modelo </w:t>
+        <w:t xml:space="preserve">, para cada una de las métricas usadas. Pero si se desea </w:t>
       </w:r>
       <w:proofErr w:type="spellStart"/>
       <w:r>
         <w:rPr>
           <w:lang w:val="es-US"/>
         </w:rPr>
+        <w:t>explicabilidad</w:t>
+      </w:r>
+      <w:proofErr w:type="spellEnd"/>
+      <w:r>
+        <w:rPr>
+          <w:lang w:val="es-US"/>
+        </w:rPr>
+        <w:t xml:space="preserve"> debe usarse la regresión logística, cuyo rendimiento solo fue </w:t>
+      </w:r>
+      <w:r>
+        <w:rPr>
+          <w:lang w:val="es-US"/>
+        </w:rPr>
+        <w:t xml:space="preserve">0.023 por debajo del </w:t>
+      </w:r>
+      <w:proofErr w:type="spellStart"/>
+      <w:r>
+        <w:rPr>
+          <w:lang w:val="es-US"/>
+        </w:rPr>
         <w:t>XGBoost</w:t>
       </w:r>
       <w:proofErr w:type="spellEnd"/>
@@ -2114,44 +4513,10 @@
         <w:rPr>
           <w:lang w:val="es-US"/>
         </w:rPr>
-        <w:t xml:space="preserve"> es considerado el mejor.</w:t>
-      </w:r>
-    </w:p>
-    <w:p>
-      <w:pPr>
-        <w:rPr>
-          <w:lang w:val="es-US"/>
-        </w:rPr>
-      </w:pPr>
-    </w:p>
-    <w:p>
-      <w:pPr>
-        <w:rPr>
-          <w:lang w:val="es-US"/>
-        </w:rPr>
-      </w:pPr>
-    </w:p>
-    <w:p>
-      <w:pPr>
-        <w:rPr>
-          <w:lang w:val="es-US"/>
-        </w:rPr>
-      </w:pPr>
-    </w:p>
-    <w:p>
-      <w:pPr>
-        <w:rPr>
-          <w:lang w:val="es-US"/>
-        </w:rPr>
-      </w:pPr>
-    </w:p>
-    <w:p>
-      <w:pPr>
-        <w:rPr>
-          <w:lang w:val="es-US"/>
-        </w:rPr>
-      </w:pPr>
-    </w:p>
+        <w:t xml:space="preserve"> en la métrica f1-score.</w:t>
+      </w:r>
+    </w:p>
+    <w:p/>
     <w:p>
       <w:pPr>
         <w:rPr>
@@ -2198,180 +4563,28 @@
       <w:pPr>
         <w:pStyle w:val="Ttulo2"/>
         <w:rPr>
-          <w:lang w:val="es-US"/>
-        </w:rPr>
-      </w:pPr>
-      <w:r>
-        <w:rPr>
-          <w:lang w:val="es-US"/>
-        </w:rPr>
-        <w:t>Conclusiones</w:t>
+          <w:lang w:val="de-DE"/>
+        </w:rPr>
+      </w:pPr>
+      <w:r>
+        <w:rPr>
+          <w:lang w:val="de-DE"/>
+        </w:rPr>
+        <w:t>Referencia</w:t>
       </w:r>
     </w:p>
     <w:p>
       <w:pPr>
         <w:jc w:val="both"/>
-      </w:pPr>
-      <w:r>
-        <w:t>El m</w:t>
-      </w:r>
-      <w:r>
-        <w:t>e</w:t>
-      </w:r>
-      <w:r>
-        <w:t>jor modelo para</w:t>
-      </w:r>
-      <w:r>
-        <w:rPr>
-          <w:lang w:val="es-US"/>
-        </w:rPr>
-        <w:t xml:space="preserve"> la predicción</w:t>
-      </w:r>
-      <w:r>
-        <w:rPr>
-          <w:lang w:val="es-US"/>
-        </w:rPr>
-        <w:t xml:space="preserve"> </w:t>
-      </w:r>
-      <w:r>
-        <w:rPr>
-          <w:lang w:val="es-US"/>
-        </w:rPr>
-        <w:t xml:space="preserve">de presencia alta y baja de cianobacterias con píxeles originales fue el </w:t>
-      </w:r>
-      <w:proofErr w:type="spellStart"/>
-      <w:r>
-        <w:rPr>
-          <w:lang w:val="es-US"/>
-        </w:rPr>
-        <w:t>XGBost</w:t>
-      </w:r>
-      <w:proofErr w:type="spellEnd"/>
-      <w:r>
-        <w:rPr>
-          <w:lang w:val="es-US"/>
-        </w:rPr>
-        <w:t xml:space="preserve">, para cada una de las métricas usadas. Pero si se desea </w:t>
-      </w:r>
-      <w:proofErr w:type="spellStart"/>
-      <w:r>
-        <w:rPr>
-          <w:lang w:val="es-US"/>
-        </w:rPr>
-        <w:t>expli</w:t>
-      </w:r>
-      <w:r>
-        <w:rPr>
-          <w:lang w:val="es-US"/>
-        </w:rPr>
-        <w:t>c</w:t>
-      </w:r>
-      <w:r>
-        <w:rPr>
-          <w:lang w:val="es-US"/>
-        </w:rPr>
-        <w:t>abilidad</w:t>
-      </w:r>
-      <w:proofErr w:type="spellEnd"/>
-      <w:r>
-        <w:rPr>
-          <w:lang w:val="es-US"/>
-        </w:rPr>
-        <w:t xml:space="preserve"> debe usarse la regresión logística, cuyo rendimiento solo fue </w:t>
-      </w:r>
-      <w:r>
-        <w:rPr>
-          <w:lang w:val="es-US"/>
-        </w:rPr>
-        <w:t xml:space="preserve">0.023 por debajo del </w:t>
-      </w:r>
-      <w:proofErr w:type="spellStart"/>
-      <w:r>
-        <w:rPr>
-          <w:lang w:val="es-US"/>
-        </w:rPr>
-        <w:t>XGBoost</w:t>
-      </w:r>
-      <w:proofErr w:type="spellEnd"/>
-      <w:r>
-        <w:rPr>
-          <w:lang w:val="es-US"/>
-        </w:rPr>
-        <w:t xml:space="preserve"> en la métrica f1-score.</w:t>
-      </w:r>
-    </w:p>
-    <w:p/>
-    <w:p>
-      <w:pPr>
-        <w:rPr>
-          <w:lang w:val="es-US"/>
-        </w:rPr>
-      </w:pPr>
-    </w:p>
-    <w:p>
-      <w:pPr>
-        <w:rPr>
-          <w:lang w:val="es-US"/>
-        </w:rPr>
-      </w:pPr>
-    </w:p>
-    <w:p>
-      <w:pPr>
-        <w:rPr>
-          <w:lang w:val="es-US"/>
-        </w:rPr>
-      </w:pPr>
-    </w:p>
-    <w:p>
-      <w:pPr>
-        <w:rPr>
-          <w:lang w:val="es-US"/>
-        </w:rPr>
-      </w:pPr>
-    </w:p>
-    <w:p>
-      <w:pPr>
-        <w:rPr>
-          <w:lang w:val="es-US"/>
-        </w:rPr>
-      </w:pPr>
-    </w:p>
-    <w:p>
-      <w:pPr>
-        <w:rPr>
-          <w:lang w:val="es-US"/>
-        </w:rPr>
-      </w:pPr>
-    </w:p>
-    <w:p>
-      <w:pPr>
-        <w:pStyle w:val="Ttulo2"/>
-        <w:rPr>
-          <w:lang w:val="es-US"/>
-        </w:rPr>
-      </w:pPr>
-      <w:r>
-        <w:rPr>
-          <w:lang w:val="es-US"/>
-        </w:rPr>
-        <w:lastRenderedPageBreak/>
-        <w:t>Referencia</w:t>
-      </w:r>
-    </w:p>
-    <w:p>
-      <w:pPr>
-        <w:jc w:val="both"/>
         <w:rPr>
           <w:lang w:val="en-US"/>
         </w:rPr>
       </w:pPr>
-      <w:proofErr w:type="spellStart"/>
-      <w:r>
-        <w:t>Chorus</w:t>
-      </w:r>
-      <w:proofErr w:type="spellEnd"/>
-      <w:r>
-        <w:t xml:space="preserve">, I., &amp; Welker, M. (2021). </w:t>
+      <w:r>
+        <w:rPr>
+          <w:lang w:val="de-DE"/>
+        </w:rPr>
+        <w:t xml:space="preserve">Chorus, I., &amp; Welker, M. (2021). </w:t>
       </w:r>
       <w:r>
         <w:rPr>
@@ -3717,6 +5930,16 @@
       </w:tblBorders>
     </w:tblPr>
   </w:style>
+  <w:style w:type="character" w:styleId="Textodelmarcadordeposicin">
+    <w:name w:val="Placeholder Text"/>
+    <w:basedOn w:val="Fuentedeprrafopredeter"/>
+    <w:uiPriority w:val="99"/>
+    <w:semiHidden/>
+    <w:rsid w:val="0011301A"/>
+    <w:rPr>
+      <w:color w:val="666666"/>
+    </w:rPr>
+  </w:style>
 </w:styles>
 </file>
 

</xml_diff>

<commit_message>
Ajustes para el informe
</commit_message>
<xml_diff>
--- a/INFORME.docx
+++ b/INFORME.docx
@@ -23,7 +23,29 @@
           <w:szCs w:val="56"/>
           <w:lang w:val="es-US"/>
         </w:rPr>
-        <w:t>Algoritmos de Machine Learning aplicados a la p</w:t>
+        <w:t xml:space="preserve">Algoritmos de Machine </w:t>
+      </w:r>
+      <w:proofErr w:type="spellStart"/>
+      <w:r>
+        <w:rPr>
+          <w:rStyle w:val="normaltextrun"/>
+          <w:rFonts w:ascii="Aptos Display" w:hAnsi="Aptos Display" w:cs="Segoe UI"/>
+          <w:sz w:val="56"/>
+          <w:szCs w:val="56"/>
+          <w:lang w:val="es-US"/>
+        </w:rPr>
+        <w:t>Learning</w:t>
+      </w:r>
+      <w:proofErr w:type="spellEnd"/>
+      <w:r>
+        <w:rPr>
+          <w:rStyle w:val="normaltextrun"/>
+          <w:rFonts w:ascii="Aptos Display" w:hAnsi="Aptos Display" w:cs="Segoe UI"/>
+          <w:sz w:val="56"/>
+          <w:szCs w:val="56"/>
+          <w:lang w:val="es-US"/>
+        </w:rPr>
+        <w:t xml:space="preserve"> aplicados a la p</w:t>
       </w:r>
       <w:r>
         <w:rPr>
@@ -118,7 +140,7 @@
     </w:p>
     <w:p>
       <w:pPr>
-        <w:pStyle w:val="Ttulo2"/>
+        <w:pStyle w:val="Heading2"/>
         <w:rPr>
           <w:lang w:val="es-US"/>
         </w:rPr>
@@ -146,7 +168,7 @@
     </w:p>
     <w:p>
       <w:pPr>
-        <w:pStyle w:val="Ttulo2"/>
+        <w:pStyle w:val="Heading2"/>
         <w:rPr>
           <w:lang w:val="es-US"/>
         </w:rPr>
@@ -187,7 +209,21 @@
         <w:rPr>
           <w:lang w:val="es-US"/>
         </w:rPr>
-        <w:t>Estimación de clorofila-a asociada a cianobacteria (cyanobacteria_chla, µg/L);</w:t>
+        <w:t>Estimación de clorofila-a asociada a cianobacteria (</w:t>
+      </w:r>
+      <w:proofErr w:type="spellStart"/>
+      <w:r>
+        <w:rPr>
+          <w:lang w:val="es-US"/>
+        </w:rPr>
+        <w:t>cyanobacteria_chla</w:t>
+      </w:r>
+      <w:proofErr w:type="spellEnd"/>
+      <w:r>
+        <w:rPr>
+          <w:lang w:val="es-US"/>
+        </w:rPr>
+        <w:t>, µg/L);</w:t>
       </w:r>
     </w:p>
     <w:p>
@@ -259,7 +295,7 @@
     </w:p>
     <w:p>
       <w:pPr>
-        <w:pStyle w:val="Prrafodelista"/>
+        <w:pStyle w:val="ListParagraph"/>
         <w:numPr>
           <w:ilvl w:val="0"/>
           <w:numId w:val="2"/>
@@ -278,7 +314,7 @@
     </w:p>
     <w:p>
       <w:pPr>
-        <w:pStyle w:val="Prrafodelista"/>
+        <w:pStyle w:val="ListParagraph"/>
         <w:numPr>
           <w:ilvl w:val="0"/>
           <w:numId w:val="2"/>
@@ -342,9 +378,11 @@
         </w:rPr>
         <w:t xml:space="preserve"> (</w:t>
       </w:r>
+      <w:proofErr w:type="spellStart"/>
       <w:r>
         <w:t>Chorus</w:t>
       </w:r>
+      <w:proofErr w:type="spellEnd"/>
       <w:r>
         <w:t xml:space="preserve"> y</w:t>
       </w:r>
@@ -379,7 +417,7 @@
     </w:p>
     <w:p>
       <w:pPr>
-        <w:pStyle w:val="Ttulo2"/>
+        <w:pStyle w:val="Heading2"/>
         <w:rPr>
           <w:lang w:val="es-US"/>
         </w:rPr>
@@ -502,7 +540,7 @@
     </w:p>
     <w:tbl>
       <w:tblPr>
-        <w:tblStyle w:val="Tablaconcuadrcula"/>
+        <w:tblStyle w:val="TableGrid"/>
         <w:tblW w:w="0" w:type="auto"/>
         <w:jc w:val="center"/>
         <w:tblLook w:val="04A0" w:firstRow="1" w:lastRow="0" w:firstColumn="1" w:lastColumn="0" w:noHBand="0" w:noVBand="1"/>
@@ -553,13 +591,23 @@
                 <w:lang w:val="es-US"/>
               </w:rPr>
             </w:pPr>
+            <w:proofErr w:type="spellStart"/>
             <w:r>
               <w:rPr>
                 <w:b/>
                 <w:bCs/>
                 <w:lang w:val="es-US"/>
               </w:rPr>
-              <w:t>Hiperparámetros del mejor modelo</w:t>
+              <w:t>Hiperparámetros</w:t>
+            </w:r>
+            <w:proofErr w:type="spellEnd"/>
+            <w:r>
+              <w:rPr>
+                <w:b/>
+                <w:bCs/>
+                <w:lang w:val="es-US"/>
+              </w:rPr>
+              <w:t xml:space="preserve"> del mejor modelo</w:t>
             </w:r>
           </w:p>
         </w:tc>
@@ -632,8 +680,16 @@
               <w:rPr>
                 <w:lang w:val="en-US"/>
               </w:rPr>
-              <w:t>solver': liblinear</w:t>
-            </w:r>
+              <w:t xml:space="preserve">solver': </w:t>
+            </w:r>
+            <w:proofErr w:type="spellStart"/>
+            <w:r>
+              <w:rPr>
+                <w:lang w:val="en-US"/>
+              </w:rPr>
+              <w:t>liblinear</w:t>
+            </w:r>
+            <w:proofErr w:type="spellEnd"/>
           </w:p>
         </w:tc>
       </w:tr>
@@ -673,39 +729,91 @@
                 <w:lang w:val="en-US"/>
               </w:rPr>
             </w:pPr>
-            <w:r>
-              <w:rPr>
-                <w:lang w:val="en-US"/>
-              </w:rPr>
-              <w:t>max_depth: 7</w:t>
-            </w:r>
-          </w:p>
-          <w:p>
-            <w:pPr>
-              <w:jc w:val="center"/>
-              <w:rPr>
-                <w:lang w:val="en-US"/>
-              </w:rPr>
-            </w:pPr>
-            <w:r>
-              <w:rPr>
-                <w:lang w:val="en-US"/>
-              </w:rPr>
-              <w:t>max_features': sqrt min_samples_leaf: 1 min_samples_split: 5</w:t>
-            </w:r>
-          </w:p>
-          <w:p>
-            <w:pPr>
-              <w:jc w:val="center"/>
-              <w:rPr>
-                <w:lang w:val="en-US"/>
-              </w:rPr>
-            </w:pPr>
-            <w:r>
-              <w:rPr>
-                <w:lang w:val="en-US"/>
-              </w:rPr>
-              <w:t>n_estimators: 200</w:t>
+            <w:proofErr w:type="spellStart"/>
+            <w:r>
+              <w:rPr>
+                <w:lang w:val="en-US"/>
+              </w:rPr>
+              <w:t>max_depth</w:t>
+            </w:r>
+            <w:proofErr w:type="spellEnd"/>
+            <w:r>
+              <w:rPr>
+                <w:lang w:val="en-US"/>
+              </w:rPr>
+              <w:t>: 7</w:t>
+            </w:r>
+          </w:p>
+          <w:p>
+            <w:pPr>
+              <w:jc w:val="center"/>
+              <w:rPr>
+                <w:lang w:val="en-US"/>
+              </w:rPr>
+            </w:pPr>
+            <w:proofErr w:type="spellStart"/>
+            <w:r>
+              <w:rPr>
+                <w:lang w:val="en-US"/>
+              </w:rPr>
+              <w:t>max_features</w:t>
+            </w:r>
+            <w:proofErr w:type="spellEnd"/>
+            <w:r>
+              <w:rPr>
+                <w:lang w:val="en-US"/>
+              </w:rPr>
+              <w:t xml:space="preserve">': sqrt </w:t>
+            </w:r>
+            <w:proofErr w:type="spellStart"/>
+            <w:r>
+              <w:rPr>
+                <w:lang w:val="en-US"/>
+              </w:rPr>
+              <w:t>min_samples_leaf</w:t>
+            </w:r>
+            <w:proofErr w:type="spellEnd"/>
+            <w:r>
+              <w:rPr>
+                <w:lang w:val="en-US"/>
+              </w:rPr>
+              <w:t xml:space="preserve">: 1 </w:t>
+            </w:r>
+            <w:proofErr w:type="spellStart"/>
+            <w:r>
+              <w:rPr>
+                <w:lang w:val="en-US"/>
+              </w:rPr>
+              <w:t>min_samples_split</w:t>
+            </w:r>
+            <w:proofErr w:type="spellEnd"/>
+            <w:r>
+              <w:rPr>
+                <w:lang w:val="en-US"/>
+              </w:rPr>
+              <w:t>: 5</w:t>
+            </w:r>
+          </w:p>
+          <w:p>
+            <w:pPr>
+              <w:jc w:val="center"/>
+              <w:rPr>
+                <w:lang w:val="en-US"/>
+              </w:rPr>
+            </w:pPr>
+            <w:proofErr w:type="spellStart"/>
+            <w:r>
+              <w:rPr>
+                <w:lang w:val="en-US"/>
+              </w:rPr>
+              <w:t>n_estimators</w:t>
+            </w:r>
+            <w:proofErr w:type="spellEnd"/>
+            <w:r>
+              <w:rPr>
+                <w:lang w:val="en-US"/>
+              </w:rPr>
+              <w:t>: 200</w:t>
             </w:r>
           </w:p>
         </w:tc>
@@ -726,12 +834,14 @@
                 <w:lang w:val="es-US"/>
               </w:rPr>
             </w:pPr>
+            <w:proofErr w:type="spellStart"/>
             <w:r>
               <w:rPr>
                 <w:lang w:val="es-US"/>
               </w:rPr>
               <w:t>XGBoost</w:t>
             </w:r>
+            <w:proofErr w:type="spellEnd"/>
           </w:p>
         </w:tc>
         <w:tc>
@@ -746,53 +856,85 @@
                 <w:lang w:val="en-US"/>
               </w:rPr>
             </w:pPr>
-            <w:r>
-              <w:rPr>
-                <w:lang w:val="en-US"/>
-              </w:rPr>
-              <w:t>colsample_bytree: 1</w:t>
-            </w:r>
-          </w:p>
-          <w:p>
-            <w:pPr>
-              <w:jc w:val="center"/>
-              <w:rPr>
-                <w:lang w:val="en-US"/>
-              </w:rPr>
-            </w:pPr>
-            <w:r>
-              <w:rPr>
-                <w:lang w:val="en-US"/>
-              </w:rPr>
-              <w:t>learning_rate: 0.1</w:t>
-            </w:r>
-          </w:p>
-          <w:p>
-            <w:pPr>
-              <w:jc w:val="center"/>
-              <w:rPr>
-                <w:lang w:val="en-US"/>
-              </w:rPr>
-            </w:pPr>
-            <w:r>
-              <w:rPr>
-                <w:lang w:val="en-US"/>
-              </w:rPr>
-              <w:t>max_depth': 5</w:t>
-            </w:r>
-          </w:p>
-          <w:p>
-            <w:pPr>
-              <w:jc w:val="center"/>
-              <w:rPr>
-                <w:lang w:val="en-US"/>
-              </w:rPr>
-            </w:pPr>
-            <w:r>
-              <w:rPr>
-                <w:lang w:val="en-US"/>
-              </w:rPr>
-              <w:t>n_estimators': 300</w:t>
+            <w:proofErr w:type="spellStart"/>
+            <w:r>
+              <w:rPr>
+                <w:lang w:val="en-US"/>
+              </w:rPr>
+              <w:t>colsample_bytree</w:t>
+            </w:r>
+            <w:proofErr w:type="spellEnd"/>
+            <w:r>
+              <w:rPr>
+                <w:lang w:val="en-US"/>
+              </w:rPr>
+              <w:t>: 1</w:t>
+            </w:r>
+          </w:p>
+          <w:p>
+            <w:pPr>
+              <w:jc w:val="center"/>
+              <w:rPr>
+                <w:lang w:val="en-US"/>
+              </w:rPr>
+            </w:pPr>
+            <w:proofErr w:type="spellStart"/>
+            <w:r>
+              <w:rPr>
+                <w:lang w:val="en-US"/>
+              </w:rPr>
+              <w:t>learning_rate</w:t>
+            </w:r>
+            <w:proofErr w:type="spellEnd"/>
+            <w:r>
+              <w:rPr>
+                <w:lang w:val="en-US"/>
+              </w:rPr>
+              <w:t>: 0.1</w:t>
+            </w:r>
+          </w:p>
+          <w:p>
+            <w:pPr>
+              <w:jc w:val="center"/>
+              <w:rPr>
+                <w:lang w:val="en-US"/>
+              </w:rPr>
+            </w:pPr>
+            <w:proofErr w:type="spellStart"/>
+            <w:r>
+              <w:rPr>
+                <w:lang w:val="en-US"/>
+              </w:rPr>
+              <w:t>max_depth</w:t>
+            </w:r>
+            <w:proofErr w:type="spellEnd"/>
+            <w:r>
+              <w:rPr>
+                <w:lang w:val="en-US"/>
+              </w:rPr>
+              <w:t>': 5</w:t>
+            </w:r>
+          </w:p>
+          <w:p>
+            <w:pPr>
+              <w:jc w:val="center"/>
+              <w:rPr>
+                <w:lang w:val="en-US"/>
+              </w:rPr>
+            </w:pPr>
+            <w:proofErr w:type="spellStart"/>
+            <w:r>
+              <w:rPr>
+                <w:lang w:val="en-US"/>
+              </w:rPr>
+              <w:t>n_estimators</w:t>
+            </w:r>
+            <w:proofErr w:type="spellEnd"/>
+            <w:r>
+              <w:rPr>
+                <w:lang w:val="en-US"/>
+              </w:rPr>
+              <w:t>': 300</w:t>
             </w:r>
           </w:p>
           <w:p>
@@ -930,18 +1072,12 @@
         <w:rPr>
           <w:lang w:val="es-US"/>
         </w:rPr>
-        <w:t xml:space="preserve"> Modelos usados en la predicción de presencia alta y baja de cianobacterias, en píxele</w:t>
-      </w:r>
-      <w:r>
-        <w:rPr>
-          <w:lang w:val="es-US"/>
-        </w:rPr>
-        <w:t>s proyectados a WGS 84 / UTM zona 15N (EPSG:322615).</w:t>
+        <w:t xml:space="preserve"> Modelos usados en la predicción de presencia alta y baja de cianobacterias, en píxeles proyectados a WGS 84 / UTM zona 15N (EPSG:322615).</w:t>
       </w:r>
     </w:p>
     <w:tbl>
       <w:tblPr>
-        <w:tblStyle w:val="Tablaconcuadrcula"/>
+        <w:tblStyle w:val="TableGrid"/>
         <w:tblW w:w="0" w:type="auto"/>
         <w:jc w:val="center"/>
         <w:tblLook w:val="04A0" w:firstRow="1" w:lastRow="0" w:firstColumn="1" w:lastColumn="0" w:noHBand="0" w:noVBand="1"/>
@@ -992,13 +1128,23 @@
                 <w:lang w:val="es-US"/>
               </w:rPr>
             </w:pPr>
+            <w:proofErr w:type="spellStart"/>
             <w:r>
               <w:rPr>
                 <w:b/>
                 <w:bCs/>
                 <w:lang w:val="es-US"/>
               </w:rPr>
-              <w:t>Hiperparámetros del mejor modelo</w:t>
+              <w:t>Hiperparámetros</w:t>
+            </w:r>
+            <w:proofErr w:type="spellEnd"/>
+            <w:r>
+              <w:rPr>
+                <w:b/>
+                <w:bCs/>
+                <w:lang w:val="es-US"/>
+              </w:rPr>
+              <w:t xml:space="preserve"> del mejor modelo</w:t>
             </w:r>
           </w:p>
         </w:tc>
@@ -1071,8 +1217,16 @@
               <w:rPr>
                 <w:lang w:val="en-US"/>
               </w:rPr>
-              <w:t>solver': liblinear</w:t>
-            </w:r>
+              <w:t xml:space="preserve">solver': </w:t>
+            </w:r>
+            <w:proofErr w:type="spellStart"/>
+            <w:r>
+              <w:rPr>
+                <w:lang w:val="en-US"/>
+              </w:rPr>
+              <w:t>liblinear</w:t>
+            </w:r>
+            <w:proofErr w:type="spellEnd"/>
           </w:p>
         </w:tc>
       </w:tr>
@@ -1112,39 +1266,91 @@
                 <w:lang w:val="en-US"/>
               </w:rPr>
             </w:pPr>
-            <w:r>
-              <w:rPr>
-                <w:lang w:val="en-US"/>
-              </w:rPr>
-              <w:t>max_depth: 7</w:t>
-            </w:r>
-          </w:p>
-          <w:p>
-            <w:pPr>
-              <w:jc w:val="center"/>
-              <w:rPr>
-                <w:lang w:val="en-US"/>
-              </w:rPr>
-            </w:pPr>
-            <w:r>
-              <w:rPr>
-                <w:lang w:val="en-US"/>
-              </w:rPr>
-              <w:t>max_features': sqrt min_samples_leaf: 1 min_samples_split: 5</w:t>
-            </w:r>
-          </w:p>
-          <w:p>
-            <w:pPr>
-              <w:jc w:val="center"/>
-              <w:rPr>
-                <w:lang w:val="en-US"/>
-              </w:rPr>
-            </w:pPr>
-            <w:r>
-              <w:rPr>
-                <w:lang w:val="en-US"/>
-              </w:rPr>
-              <w:t>n_estimators: 200</w:t>
+            <w:proofErr w:type="spellStart"/>
+            <w:r>
+              <w:rPr>
+                <w:lang w:val="en-US"/>
+              </w:rPr>
+              <w:t>max_depth</w:t>
+            </w:r>
+            <w:proofErr w:type="spellEnd"/>
+            <w:r>
+              <w:rPr>
+                <w:lang w:val="en-US"/>
+              </w:rPr>
+              <w:t>: 7</w:t>
+            </w:r>
+          </w:p>
+          <w:p>
+            <w:pPr>
+              <w:jc w:val="center"/>
+              <w:rPr>
+                <w:lang w:val="en-US"/>
+              </w:rPr>
+            </w:pPr>
+            <w:proofErr w:type="spellStart"/>
+            <w:r>
+              <w:rPr>
+                <w:lang w:val="en-US"/>
+              </w:rPr>
+              <w:t>max_features</w:t>
+            </w:r>
+            <w:proofErr w:type="spellEnd"/>
+            <w:r>
+              <w:rPr>
+                <w:lang w:val="en-US"/>
+              </w:rPr>
+              <w:t xml:space="preserve">': sqrt </w:t>
+            </w:r>
+            <w:proofErr w:type="spellStart"/>
+            <w:r>
+              <w:rPr>
+                <w:lang w:val="en-US"/>
+              </w:rPr>
+              <w:t>min_samples_leaf</w:t>
+            </w:r>
+            <w:proofErr w:type="spellEnd"/>
+            <w:r>
+              <w:rPr>
+                <w:lang w:val="en-US"/>
+              </w:rPr>
+              <w:t xml:space="preserve">: 1 </w:t>
+            </w:r>
+            <w:proofErr w:type="spellStart"/>
+            <w:r>
+              <w:rPr>
+                <w:lang w:val="en-US"/>
+              </w:rPr>
+              <w:t>min_samples_split</w:t>
+            </w:r>
+            <w:proofErr w:type="spellEnd"/>
+            <w:r>
+              <w:rPr>
+                <w:lang w:val="en-US"/>
+              </w:rPr>
+              <w:t>: 5</w:t>
+            </w:r>
+          </w:p>
+          <w:p>
+            <w:pPr>
+              <w:jc w:val="center"/>
+              <w:rPr>
+                <w:lang w:val="en-US"/>
+              </w:rPr>
+            </w:pPr>
+            <w:proofErr w:type="spellStart"/>
+            <w:r>
+              <w:rPr>
+                <w:lang w:val="en-US"/>
+              </w:rPr>
+              <w:t>n_estimators</w:t>
+            </w:r>
+            <w:proofErr w:type="spellEnd"/>
+            <w:r>
+              <w:rPr>
+                <w:lang w:val="en-US"/>
+              </w:rPr>
+              <w:t>: 200</w:t>
             </w:r>
           </w:p>
         </w:tc>
@@ -1165,12 +1371,14 @@
                 <w:lang w:val="es-US"/>
               </w:rPr>
             </w:pPr>
+            <w:proofErr w:type="spellStart"/>
             <w:r>
               <w:rPr>
                 <w:lang w:val="es-US"/>
               </w:rPr>
               <w:t>XGBoost</w:t>
             </w:r>
+            <w:proofErr w:type="spellEnd"/>
           </w:p>
         </w:tc>
         <w:tc>
@@ -1185,11 +1393,19 @@
                 <w:lang w:val="en-US"/>
               </w:rPr>
             </w:pPr>
-            <w:r>
-              <w:rPr>
-                <w:lang w:val="en-US"/>
-              </w:rPr>
-              <w:t>colsample_bytree: 1</w:t>
+            <w:proofErr w:type="spellStart"/>
+            <w:r>
+              <w:rPr>
+                <w:lang w:val="en-US"/>
+              </w:rPr>
+              <w:t>colsample_bytree</w:t>
+            </w:r>
+            <w:proofErr w:type="spellEnd"/>
+            <w:r>
+              <w:rPr>
+                <w:lang w:val="en-US"/>
+              </w:rPr>
+              <w:t>: 1</w:t>
             </w:r>
             <w:r>
               <w:rPr>
@@ -1205,39 +1421,63 @@
                 <w:lang w:val="en-US"/>
               </w:rPr>
             </w:pPr>
-            <w:r>
-              <w:rPr>
-                <w:lang w:val="en-US"/>
-              </w:rPr>
-              <w:t>learning_rate: 0.1</w:t>
-            </w:r>
-          </w:p>
-          <w:p>
-            <w:pPr>
-              <w:jc w:val="center"/>
-              <w:rPr>
-                <w:lang w:val="en-US"/>
-              </w:rPr>
-            </w:pPr>
-            <w:r>
-              <w:rPr>
-                <w:lang w:val="en-US"/>
-              </w:rPr>
-              <w:t>max_depth': 5</w:t>
-            </w:r>
-          </w:p>
-          <w:p>
-            <w:pPr>
-              <w:jc w:val="center"/>
-              <w:rPr>
-                <w:lang w:val="en-US"/>
-              </w:rPr>
-            </w:pPr>
-            <w:r>
-              <w:rPr>
-                <w:lang w:val="en-US"/>
-              </w:rPr>
-              <w:t>n_estimators': 300</w:t>
+            <w:proofErr w:type="spellStart"/>
+            <w:r>
+              <w:rPr>
+                <w:lang w:val="en-US"/>
+              </w:rPr>
+              <w:t>learning_rate</w:t>
+            </w:r>
+            <w:proofErr w:type="spellEnd"/>
+            <w:r>
+              <w:rPr>
+                <w:lang w:val="en-US"/>
+              </w:rPr>
+              <w:t>: 0.1</w:t>
+            </w:r>
+          </w:p>
+          <w:p>
+            <w:pPr>
+              <w:jc w:val="center"/>
+              <w:rPr>
+                <w:lang w:val="en-US"/>
+              </w:rPr>
+            </w:pPr>
+            <w:proofErr w:type="spellStart"/>
+            <w:r>
+              <w:rPr>
+                <w:lang w:val="en-US"/>
+              </w:rPr>
+              <w:t>max_depth</w:t>
+            </w:r>
+            <w:proofErr w:type="spellEnd"/>
+            <w:r>
+              <w:rPr>
+                <w:lang w:val="en-US"/>
+              </w:rPr>
+              <w:t>': 5</w:t>
+            </w:r>
+          </w:p>
+          <w:p>
+            <w:pPr>
+              <w:jc w:val="center"/>
+              <w:rPr>
+                <w:lang w:val="en-US"/>
+              </w:rPr>
+            </w:pPr>
+            <w:proofErr w:type="spellStart"/>
+            <w:r>
+              <w:rPr>
+                <w:lang w:val="en-US"/>
+              </w:rPr>
+              <w:t>n_estimators</w:t>
+            </w:r>
+            <w:proofErr w:type="spellEnd"/>
+            <w:r>
+              <w:rPr>
+                <w:lang w:val="en-US"/>
+              </w:rPr>
+              <w:t>': 300</w:t>
             </w:r>
           </w:p>
           <w:p>
@@ -1371,13 +1611,7 @@
         <w:rPr>
           <w:lang w:val="es-US"/>
         </w:rPr>
-        <w:t xml:space="preserve"> Modelos usados </w:t>
-      </w:r>
-      <w:r>
-        <w:rPr>
-          <w:lang w:val="es-US"/>
-        </w:rPr>
-        <w:t>en el experimento A</w:t>
+        <w:t xml:space="preserve"> Modelos usados en el experimento A</w:t>
       </w:r>
       <w:r>
         <w:rPr>
@@ -1388,7 +1622,7 @@
     </w:p>
     <w:tbl>
       <w:tblPr>
-        <w:tblStyle w:val="Tablaconcuadrcula"/>
+        <w:tblStyle w:val="TableGrid"/>
         <w:tblW w:w="0" w:type="auto"/>
         <w:jc w:val="center"/>
         <w:tblLook w:val="04A0" w:firstRow="1" w:lastRow="0" w:firstColumn="1" w:lastColumn="0" w:noHBand="0" w:noVBand="1"/>
@@ -1439,13 +1673,23 @@
                 <w:lang w:val="es-US"/>
               </w:rPr>
             </w:pPr>
+            <w:proofErr w:type="spellStart"/>
             <w:r>
               <w:rPr>
                 <w:b/>
                 <w:bCs/>
                 <w:lang w:val="es-US"/>
               </w:rPr>
-              <w:t>Hiperparámetros del mejor modelo</w:t>
+              <w:t>Hiperparámetros</w:t>
+            </w:r>
+            <w:proofErr w:type="spellEnd"/>
+            <w:r>
+              <w:rPr>
+                <w:b/>
+                <w:bCs/>
+                <w:lang w:val="es-US"/>
+              </w:rPr>
+              <w:t xml:space="preserve"> del mejor modelo</w:t>
             </w:r>
           </w:p>
         </w:tc>
@@ -1524,7 +1768,14 @@
               <w:rPr>
                 <w:lang w:val="en-US"/>
               </w:rPr>
-              <w:t>solver': l</w:t>
+              <w:t xml:space="preserve">solver': </w:t>
+            </w:r>
+            <w:proofErr w:type="spellStart"/>
+            <w:r>
+              <w:rPr>
+                <w:lang w:val="en-US"/>
+              </w:rPr>
+              <w:t>l</w:t>
             </w:r>
             <w:r>
               <w:rPr>
@@ -1532,6 +1783,7 @@
               </w:rPr>
               <w:t>bfgs</w:t>
             </w:r>
+            <w:proofErr w:type="spellEnd"/>
           </w:p>
         </w:tc>
       </w:tr>
@@ -1571,11 +1823,19 @@
                 <w:lang w:val="en-US"/>
               </w:rPr>
             </w:pPr>
-            <w:r>
-              <w:rPr>
-                <w:lang w:val="en-US"/>
-              </w:rPr>
-              <w:t xml:space="preserve">max_depth: </w:t>
+            <w:proofErr w:type="spellStart"/>
+            <w:r>
+              <w:rPr>
+                <w:lang w:val="en-US"/>
+              </w:rPr>
+              <w:t>max_depth</w:t>
+            </w:r>
+            <w:proofErr w:type="spellEnd"/>
+            <w:r>
+              <w:rPr>
+                <w:lang w:val="en-US"/>
+              </w:rPr>
+              <w:t xml:space="preserve">: </w:t>
             </w:r>
             <w:r>
               <w:rPr>
@@ -1591,11 +1851,47 @@
                 <w:lang w:val="en-US"/>
               </w:rPr>
             </w:pPr>
-            <w:r>
-              <w:rPr>
-                <w:lang w:val="en-US"/>
-              </w:rPr>
-              <w:t xml:space="preserve">max_features': sqrt min_samples_leaf: 1 min_samples_split: </w:t>
+            <w:proofErr w:type="spellStart"/>
+            <w:r>
+              <w:rPr>
+                <w:lang w:val="en-US"/>
+              </w:rPr>
+              <w:t>max_features</w:t>
+            </w:r>
+            <w:proofErr w:type="spellEnd"/>
+            <w:r>
+              <w:rPr>
+                <w:lang w:val="en-US"/>
+              </w:rPr>
+              <w:t xml:space="preserve">': sqrt </w:t>
+            </w:r>
+            <w:proofErr w:type="spellStart"/>
+            <w:r>
+              <w:rPr>
+                <w:lang w:val="en-US"/>
+              </w:rPr>
+              <w:t>min_samples_leaf</w:t>
+            </w:r>
+            <w:proofErr w:type="spellEnd"/>
+            <w:r>
+              <w:rPr>
+                <w:lang w:val="en-US"/>
+              </w:rPr>
+              <w:t xml:space="preserve">: 1 </w:t>
+            </w:r>
+            <w:proofErr w:type="spellStart"/>
+            <w:r>
+              <w:rPr>
+                <w:lang w:val="en-US"/>
+              </w:rPr>
+              <w:t>min_samples_split</w:t>
+            </w:r>
+            <w:proofErr w:type="spellEnd"/>
+            <w:r>
+              <w:rPr>
+                <w:lang w:val="en-US"/>
+              </w:rPr>
+              <w:t xml:space="preserve">: </w:t>
             </w:r>
             <w:r>
               <w:rPr>
@@ -1611,11 +1907,19 @@
                 <w:lang w:val="en-US"/>
               </w:rPr>
             </w:pPr>
-            <w:r>
-              <w:rPr>
-                <w:lang w:val="en-US"/>
-              </w:rPr>
-              <w:t xml:space="preserve">n_estimators: </w:t>
+            <w:proofErr w:type="spellStart"/>
+            <w:r>
+              <w:rPr>
+                <w:lang w:val="en-US"/>
+              </w:rPr>
+              <w:t>n_estimators</w:t>
+            </w:r>
+            <w:proofErr w:type="spellEnd"/>
+            <w:r>
+              <w:rPr>
+                <w:lang w:val="en-US"/>
+              </w:rPr>
+              <w:t xml:space="preserve">: </w:t>
             </w:r>
             <w:r>
               <w:rPr>
@@ -1648,12 +1952,14 @@
                 <w:lang w:val="es-US"/>
               </w:rPr>
             </w:pPr>
+            <w:proofErr w:type="spellStart"/>
             <w:r>
               <w:rPr>
                 <w:lang w:val="es-US"/>
               </w:rPr>
               <w:t>XGBoost</w:t>
             </w:r>
+            <w:proofErr w:type="spellEnd"/>
           </w:p>
         </w:tc>
         <w:tc>
@@ -1668,11 +1974,19 @@
                 <w:lang w:val="en-US"/>
               </w:rPr>
             </w:pPr>
-            <w:r>
-              <w:rPr>
-                <w:lang w:val="en-US"/>
-              </w:rPr>
-              <w:t xml:space="preserve">colsample_bytree: </w:t>
+            <w:proofErr w:type="spellStart"/>
+            <w:r>
+              <w:rPr>
+                <w:lang w:val="en-US"/>
+              </w:rPr>
+              <w:t>colsample_bytree</w:t>
+            </w:r>
+            <w:proofErr w:type="spellEnd"/>
+            <w:r>
+              <w:rPr>
+                <w:lang w:val="en-US"/>
+              </w:rPr>
+              <w:t xml:space="preserve">: </w:t>
             </w:r>
             <w:r>
               <w:rPr>
@@ -1688,11 +2002,19 @@
                 <w:lang w:val="en-US"/>
               </w:rPr>
             </w:pPr>
-            <w:r>
-              <w:rPr>
-                <w:lang w:val="en-US"/>
-              </w:rPr>
-              <w:t xml:space="preserve">learning_rate: </w:t>
+            <w:proofErr w:type="spellStart"/>
+            <w:r>
+              <w:rPr>
+                <w:lang w:val="en-US"/>
+              </w:rPr>
+              <w:t>learning_rate</w:t>
+            </w:r>
+            <w:proofErr w:type="spellEnd"/>
+            <w:r>
+              <w:rPr>
+                <w:lang w:val="en-US"/>
+              </w:rPr>
+              <w:t xml:space="preserve">: </w:t>
             </w:r>
             <w:r>
               <w:rPr>
@@ -1708,11 +2030,19 @@
                 <w:lang w:val="en-US"/>
               </w:rPr>
             </w:pPr>
-            <w:r>
-              <w:rPr>
-                <w:lang w:val="en-US"/>
-              </w:rPr>
-              <w:t xml:space="preserve">max_depth': </w:t>
+            <w:proofErr w:type="spellStart"/>
+            <w:r>
+              <w:rPr>
+                <w:lang w:val="en-US"/>
+              </w:rPr>
+              <w:t>max_depth</w:t>
+            </w:r>
+            <w:proofErr w:type="spellEnd"/>
+            <w:r>
+              <w:rPr>
+                <w:lang w:val="en-US"/>
+              </w:rPr>
+              <w:t xml:space="preserve">': </w:t>
             </w:r>
             <w:r>
               <w:rPr>
@@ -1728,11 +2058,19 @@
                 <w:lang w:val="en-US"/>
               </w:rPr>
             </w:pPr>
-            <w:r>
-              <w:rPr>
-                <w:lang w:val="en-US"/>
-              </w:rPr>
-              <w:t xml:space="preserve">n_estimators': </w:t>
+            <w:proofErr w:type="spellStart"/>
+            <w:r>
+              <w:rPr>
+                <w:lang w:val="en-US"/>
+              </w:rPr>
+              <w:t>n_estimators</w:t>
+            </w:r>
+            <w:proofErr w:type="spellEnd"/>
+            <w:r>
+              <w:rPr>
+                <w:lang w:val="en-US"/>
+              </w:rPr>
+              <w:t xml:space="preserve">': </w:t>
             </w:r>
             <w:r>
               <w:rPr>
@@ -1807,48 +2145,12 @@
         <w:rPr>
           <w:lang w:val="es-US"/>
         </w:rPr>
-        <w:t xml:space="preserve"> Modelos usados en el experimento </w:t>
-      </w:r>
-      <w:r>
-        <w:rPr>
-          <w:lang w:val="es-US"/>
-        </w:rPr>
-        <w:t>B</w:t>
-      </w:r>
-      <w:r>
-        <w:rPr>
-          <w:lang w:val="es-US"/>
-        </w:rPr>
-        <w:t>, en el que los datos del entrenamiento corresponden al lago de A</w:t>
-      </w:r>
-      <w:r>
-        <w:rPr>
-          <w:lang w:val="es-US"/>
-        </w:rPr>
-        <w:t>matitlán</w:t>
-      </w:r>
-      <w:r>
-        <w:rPr>
-          <w:lang w:val="es-US"/>
-        </w:rPr>
-        <w:t>, mientras que la prueba corresponde al lago de A</w:t>
-      </w:r>
-      <w:r>
-        <w:rPr>
-          <w:lang w:val="es-US"/>
-        </w:rPr>
-        <w:t>titlán</w:t>
-      </w:r>
-      <w:r>
-        <w:rPr>
-          <w:lang w:val="es-US"/>
-        </w:rPr>
-        <w:t>.</w:t>
+        <w:t xml:space="preserve"> Modelos usados en el experimento B, en el que los datos del entrenamiento corresponden al lago de Amatitlán, mientras que la prueba corresponde al lago de Atitlán.</w:t>
       </w:r>
     </w:p>
     <w:tbl>
       <w:tblPr>
-        <w:tblStyle w:val="Tablaconcuadrcula"/>
+        <w:tblStyle w:val="TableGrid"/>
         <w:tblW w:w="0" w:type="auto"/>
         <w:jc w:val="center"/>
         <w:tblLook w:val="04A0" w:firstRow="1" w:lastRow="0" w:firstColumn="1" w:lastColumn="0" w:noHBand="0" w:noVBand="1"/>
@@ -1899,13 +2201,23 @@
                 <w:lang w:val="es-US"/>
               </w:rPr>
             </w:pPr>
+            <w:proofErr w:type="spellStart"/>
             <w:r>
               <w:rPr>
                 <w:b/>
                 <w:bCs/>
                 <w:lang w:val="es-US"/>
               </w:rPr>
-              <w:t>Hiperparámetros del mejor modelo</w:t>
+              <w:t>Hiperparámetros</w:t>
+            </w:r>
+            <w:proofErr w:type="spellEnd"/>
+            <w:r>
+              <w:rPr>
+                <w:b/>
+                <w:bCs/>
+                <w:lang w:val="es-US"/>
+              </w:rPr>
+              <w:t xml:space="preserve"> del mejor modelo</w:t>
             </w:r>
           </w:p>
         </w:tc>
@@ -1984,7 +2296,14 @@
               <w:rPr>
                 <w:lang w:val="en-US"/>
               </w:rPr>
-              <w:t>solver': l</w:t>
+              <w:t xml:space="preserve">solver': </w:t>
+            </w:r>
+            <w:proofErr w:type="spellStart"/>
+            <w:r>
+              <w:rPr>
+                <w:lang w:val="en-US"/>
+              </w:rPr>
+              <w:t>l</w:t>
             </w:r>
             <w:r>
               <w:rPr>
@@ -1992,6 +2311,7 @@
               </w:rPr>
               <w:t>bfgs</w:t>
             </w:r>
+            <w:proofErr w:type="spellEnd"/>
           </w:p>
         </w:tc>
       </w:tr>
@@ -2031,11 +2351,19 @@
                 <w:lang w:val="en-US"/>
               </w:rPr>
             </w:pPr>
-            <w:r>
-              <w:rPr>
-                <w:lang w:val="en-US"/>
-              </w:rPr>
-              <w:t xml:space="preserve">max_depth: </w:t>
+            <w:proofErr w:type="spellStart"/>
+            <w:r>
+              <w:rPr>
+                <w:lang w:val="en-US"/>
+              </w:rPr>
+              <w:t>max_depth</w:t>
+            </w:r>
+            <w:proofErr w:type="spellEnd"/>
+            <w:r>
+              <w:rPr>
+                <w:lang w:val="en-US"/>
+              </w:rPr>
+              <w:t xml:space="preserve">: </w:t>
             </w:r>
             <w:r>
               <w:rPr>
@@ -2051,11 +2379,47 @@
                 <w:lang w:val="en-US"/>
               </w:rPr>
             </w:pPr>
-            <w:r>
-              <w:rPr>
-                <w:lang w:val="en-US"/>
-              </w:rPr>
-              <w:t xml:space="preserve">max_features': sqrt min_samples_leaf: 1 min_samples_split: </w:t>
+            <w:proofErr w:type="spellStart"/>
+            <w:r>
+              <w:rPr>
+                <w:lang w:val="en-US"/>
+              </w:rPr>
+              <w:t>max_features</w:t>
+            </w:r>
+            <w:proofErr w:type="spellEnd"/>
+            <w:r>
+              <w:rPr>
+                <w:lang w:val="en-US"/>
+              </w:rPr>
+              <w:t xml:space="preserve">': sqrt </w:t>
+            </w:r>
+            <w:proofErr w:type="spellStart"/>
+            <w:r>
+              <w:rPr>
+                <w:lang w:val="en-US"/>
+              </w:rPr>
+              <w:t>min_samples_leaf</w:t>
+            </w:r>
+            <w:proofErr w:type="spellEnd"/>
+            <w:r>
+              <w:rPr>
+                <w:lang w:val="en-US"/>
+              </w:rPr>
+              <w:t xml:space="preserve">: 1 </w:t>
+            </w:r>
+            <w:proofErr w:type="spellStart"/>
+            <w:r>
+              <w:rPr>
+                <w:lang w:val="en-US"/>
+              </w:rPr>
+              <w:t>min_samples_split</w:t>
+            </w:r>
+            <w:proofErr w:type="spellEnd"/>
+            <w:r>
+              <w:rPr>
+                <w:lang w:val="en-US"/>
+              </w:rPr>
+              <w:t xml:space="preserve">: </w:t>
             </w:r>
             <w:r>
               <w:rPr>
@@ -2071,11 +2435,19 @@
                 <w:lang w:val="en-US"/>
               </w:rPr>
             </w:pPr>
-            <w:r>
-              <w:rPr>
-                <w:lang w:val="en-US"/>
-              </w:rPr>
-              <w:t xml:space="preserve">n_estimators: </w:t>
+            <w:proofErr w:type="spellStart"/>
+            <w:r>
+              <w:rPr>
+                <w:lang w:val="en-US"/>
+              </w:rPr>
+              <w:t>n_estimators</w:t>
+            </w:r>
+            <w:proofErr w:type="spellEnd"/>
+            <w:r>
+              <w:rPr>
+                <w:lang w:val="en-US"/>
+              </w:rPr>
+              <w:t xml:space="preserve">: </w:t>
             </w:r>
             <w:r>
               <w:rPr>
@@ -2108,12 +2480,14 @@
                 <w:lang w:val="es-US"/>
               </w:rPr>
             </w:pPr>
+            <w:proofErr w:type="spellStart"/>
             <w:r>
               <w:rPr>
                 <w:lang w:val="es-US"/>
               </w:rPr>
               <w:t>XGBoost</w:t>
             </w:r>
+            <w:proofErr w:type="spellEnd"/>
           </w:p>
         </w:tc>
         <w:tc>
@@ -2128,11 +2502,19 @@
                 <w:lang w:val="en-US"/>
               </w:rPr>
             </w:pPr>
-            <w:r>
-              <w:rPr>
-                <w:lang w:val="en-US"/>
-              </w:rPr>
-              <w:t xml:space="preserve">colsample_bytree: </w:t>
+            <w:proofErr w:type="spellStart"/>
+            <w:r>
+              <w:rPr>
+                <w:lang w:val="en-US"/>
+              </w:rPr>
+              <w:t>colsample_bytree</w:t>
+            </w:r>
+            <w:proofErr w:type="spellEnd"/>
+            <w:r>
+              <w:rPr>
+                <w:lang w:val="en-US"/>
+              </w:rPr>
+              <w:t xml:space="preserve">: </w:t>
             </w:r>
             <w:r>
               <w:rPr>
@@ -2148,11 +2530,19 @@
                 <w:lang w:val="en-US"/>
               </w:rPr>
             </w:pPr>
-            <w:r>
-              <w:rPr>
-                <w:lang w:val="en-US"/>
-              </w:rPr>
-              <w:t xml:space="preserve">learning_rate: </w:t>
+            <w:proofErr w:type="spellStart"/>
+            <w:r>
+              <w:rPr>
+                <w:lang w:val="en-US"/>
+              </w:rPr>
+              <w:t>learning_rate</w:t>
+            </w:r>
+            <w:proofErr w:type="spellEnd"/>
+            <w:r>
+              <w:rPr>
+                <w:lang w:val="en-US"/>
+              </w:rPr>
+              <w:t xml:space="preserve">: </w:t>
             </w:r>
             <w:r>
               <w:rPr>
@@ -2168,11 +2558,19 @@
                 <w:lang w:val="en-US"/>
               </w:rPr>
             </w:pPr>
-            <w:r>
-              <w:rPr>
-                <w:lang w:val="en-US"/>
-              </w:rPr>
-              <w:t xml:space="preserve">max_depth': </w:t>
+            <w:proofErr w:type="spellStart"/>
+            <w:r>
+              <w:rPr>
+                <w:lang w:val="en-US"/>
+              </w:rPr>
+              <w:t>max_depth</w:t>
+            </w:r>
+            <w:proofErr w:type="spellEnd"/>
+            <w:r>
+              <w:rPr>
+                <w:lang w:val="en-US"/>
+              </w:rPr>
+              <w:t xml:space="preserve">': </w:t>
             </w:r>
             <w:r>
               <w:rPr>
@@ -2188,11 +2586,19 @@
                 <w:lang w:val="en-US"/>
               </w:rPr>
             </w:pPr>
-            <w:r>
-              <w:rPr>
-                <w:lang w:val="en-US"/>
-              </w:rPr>
-              <w:t xml:space="preserve">n_estimators': </w:t>
+            <w:proofErr w:type="spellStart"/>
+            <w:r>
+              <w:rPr>
+                <w:lang w:val="en-US"/>
+              </w:rPr>
+              <w:t>n_estimators</w:t>
+            </w:r>
+            <w:proofErr w:type="spellEnd"/>
+            <w:r>
+              <w:rPr>
+                <w:lang w:val="en-US"/>
+              </w:rPr>
+              <w:t xml:space="preserve">': </w:t>
             </w:r>
             <w:r>
               <w:rPr>
@@ -2234,15 +2640,33 @@
     </w:p>
     <w:p>
       <w:pPr>
-        <w:pStyle w:val="Ttulo2"/>
-        <w:rPr>
-          <w:lang w:val="es-US"/>
-        </w:rPr>
-      </w:pPr>
-      <w:r>
-        <w:rPr>
-          <w:lang w:val="es-US"/>
-        </w:rPr>
+        <w:rPr>
+          <w:rFonts w:asciiTheme="majorHAnsi" w:eastAsiaTheme="majorEastAsia" w:hAnsiTheme="majorHAnsi" w:cstheme="majorBidi"/>
+          <w:color w:val="0F4761" w:themeColor="accent1" w:themeShade="BF"/>
+          <w:sz w:val="32"/>
+          <w:szCs w:val="32"/>
+          <w:lang w:val="es-US"/>
+        </w:rPr>
+      </w:pPr>
+      <w:r>
+        <w:rPr>
+          <w:lang w:val="es-US"/>
+        </w:rPr>
+        <w:br w:type="page"/>
+      </w:r>
+    </w:p>
+    <w:p>
+      <w:pPr>
+        <w:pStyle w:val="Heading2"/>
+        <w:rPr>
+          <w:lang w:val="es-US"/>
+        </w:rPr>
+      </w:pPr>
+      <w:r>
+        <w:rPr>
+          <w:lang w:val="es-US"/>
+        </w:rPr>
+        <w:lastRenderedPageBreak/>
         <w:t>Resultados</w:t>
       </w:r>
     </w:p>
@@ -2310,7 +2734,7 @@
     </w:p>
     <w:tbl>
       <w:tblPr>
-        <w:tblStyle w:val="Tablaconcuadrcula"/>
+        <w:tblStyle w:val="TableGrid"/>
         <w:tblW w:w="0" w:type="auto"/>
         <w:tblLook w:val="04A0" w:firstRow="1" w:lastRow="0" w:firstColumn="1" w:lastColumn="0" w:noHBand="0" w:noVBand="1"/>
       </w:tblPr>
@@ -2341,7 +2765,6 @@
                 <w:bCs/>
                 <w:lang w:val="es-US"/>
               </w:rPr>
-              <w:lastRenderedPageBreak/>
               <w:t>Modelos</w:t>
             </w:r>
           </w:p>
@@ -2359,6 +2782,7 @@
                 <w:lang w:val="es-US"/>
               </w:rPr>
             </w:pPr>
+            <w:proofErr w:type="spellStart"/>
             <w:r>
               <w:rPr>
                 <w:b/>
@@ -2367,6 +2791,7 @@
               </w:rPr>
               <w:t>Precision</w:t>
             </w:r>
+            <w:proofErr w:type="spellEnd"/>
           </w:p>
         </w:tc>
         <w:tc>
@@ -2382,6 +2807,7 @@
                 <w:lang w:val="es-US"/>
               </w:rPr>
             </w:pPr>
+            <w:proofErr w:type="spellStart"/>
             <w:r>
               <w:rPr>
                 <w:b/>
@@ -2390,6 +2816,7 @@
               </w:rPr>
               <w:t>Recall</w:t>
             </w:r>
+            <w:proofErr w:type="spellEnd"/>
           </w:p>
         </w:tc>
         <w:tc>
@@ -2645,12 +3072,14 @@
                 <w:lang w:val="es-US"/>
               </w:rPr>
             </w:pPr>
+            <w:proofErr w:type="spellStart"/>
             <w:r>
               <w:rPr>
                 <w:lang w:val="es-US"/>
               </w:rPr>
               <w:t>XGBoost</w:t>
             </w:r>
+            <w:proofErr w:type="spellEnd"/>
           </w:p>
         </w:tc>
         <w:tc>
@@ -3077,6 +3506,7 @@
           <w:bCs/>
           <w:lang w:val="es-US"/>
         </w:rPr>
+        <w:lastRenderedPageBreak/>
         <w:t xml:space="preserve">Figura </w:t>
       </w:r>
       <w:r>
@@ -3099,7 +3529,21 @@
         <w:rPr>
           <w:lang w:val="es-US"/>
         </w:rPr>
-        <w:t xml:space="preserve"> Matriz de confusión del algoritmo de XGBoost para el modelo entrenado con píxeles originales.</w:t>
+        <w:t xml:space="preserve"> Matriz de confusión del algoritmo de </w:t>
+      </w:r>
+      <w:proofErr w:type="spellStart"/>
+      <w:r>
+        <w:rPr>
+          <w:lang w:val="es-US"/>
+        </w:rPr>
+        <w:t>XGBoost</w:t>
+      </w:r>
+      <w:proofErr w:type="spellEnd"/>
+      <w:r>
+        <w:rPr>
+          <w:lang w:val="es-US"/>
+        </w:rPr>
+        <w:t xml:space="preserve"> para el modelo entrenado con píxeles originales.</w:t>
       </w:r>
     </w:p>
     <w:p>
@@ -3113,7 +3557,6 @@
           <w:noProof/>
           <w:lang w:val="es-US"/>
         </w:rPr>
-        <w:lastRenderedPageBreak/>
         <w:drawing>
           <wp:anchor distT="0" distB="0" distL="114300" distR="114300" simplePos="0" relativeHeight="251660288" behindDoc="0" locked="0" layoutInCell="1" allowOverlap="1" wp14:anchorId="3BAB4013" wp14:editId="6E33287D">
             <wp:simplePos x="0" y="0"/>
@@ -3276,18 +3719,12 @@
         <w:rPr>
           <w:lang w:val="es-US"/>
         </w:rPr>
-        <w:t xml:space="preserve"> Métricas de los modelos usados en la predicción de presencia alta y baja de cianobacterias con </w:t>
-      </w:r>
-      <w:r>
-        <w:rPr>
-          <w:lang w:val="es-US"/>
-        </w:rPr>
-        <w:t>proyectados.</w:t>
+        <w:t xml:space="preserve"> Métricas de los modelos usados en la predicción de presencia alta y baja de cianobacterias con proyectados.</w:t>
       </w:r>
     </w:p>
     <w:tbl>
       <w:tblPr>
-        <w:tblStyle w:val="Tablaconcuadrcula"/>
+        <w:tblStyle w:val="TableGrid"/>
         <w:tblW w:w="0" w:type="auto"/>
         <w:tblLook w:val="04A0" w:firstRow="1" w:lastRow="0" w:firstColumn="1" w:lastColumn="0" w:noHBand="0" w:noVBand="1"/>
       </w:tblPr>
@@ -3335,6 +3772,7 @@
                 <w:lang w:val="es-US"/>
               </w:rPr>
             </w:pPr>
+            <w:proofErr w:type="spellStart"/>
             <w:r>
               <w:rPr>
                 <w:b/>
@@ -3343,6 +3781,7 @@
               </w:rPr>
               <w:t>Precision</w:t>
             </w:r>
+            <w:proofErr w:type="spellEnd"/>
           </w:p>
         </w:tc>
         <w:tc>
@@ -3358,6 +3797,7 @@
                 <w:lang w:val="es-US"/>
               </w:rPr>
             </w:pPr>
+            <w:proofErr w:type="spellStart"/>
             <w:r>
               <w:rPr>
                 <w:b/>
@@ -3366,6 +3806,7 @@
               </w:rPr>
               <w:t>Recall</w:t>
             </w:r>
+            <w:proofErr w:type="spellEnd"/>
           </w:p>
         </w:tc>
         <w:tc>
@@ -3450,13 +3891,7 @@
               <w:rPr>
                 <w:lang w:val="es-US"/>
               </w:rPr>
-              <w:t>0.</w:t>
-            </w:r>
-            <w:r>
-              <w:rPr>
-                <w:lang w:val="es-US"/>
-              </w:rPr>
-              <w:t>7500</w:t>
+              <w:t>0.7500</w:t>
             </w:r>
           </w:p>
         </w:tc>
@@ -3494,13 +3929,7 @@
               <w:rPr>
                 <w:lang w:val="es-US"/>
               </w:rPr>
-              <w:t>0.</w:t>
-            </w:r>
-            <w:r>
-              <w:rPr>
-                <w:lang w:val="es-US"/>
-              </w:rPr>
-              <w:t>8182</w:t>
+              <w:t>0.8182</w:t>
             </w:r>
           </w:p>
         </w:tc>
@@ -3519,13 +3948,7 @@
               <w:rPr>
                 <w:lang w:val="es-US"/>
               </w:rPr>
-              <w:t>0.9</w:t>
-            </w:r>
-            <w:r>
-              <w:rPr>
-                <w:lang w:val="es-US"/>
-              </w:rPr>
-              <w:t>091</w:t>
+              <w:t>0.9091</w:t>
             </w:r>
           </w:p>
         </w:tc>
@@ -3565,13 +3988,7 @@
               <w:rPr>
                 <w:lang w:val="es-US"/>
               </w:rPr>
-              <w:t>0.</w:t>
-            </w:r>
-            <w:r>
-              <w:rPr>
-                <w:lang w:val="es-US"/>
-              </w:rPr>
-              <w:t>7692</w:t>
+              <w:t>0.7692</w:t>
             </w:r>
           </w:p>
         </w:tc>
@@ -3609,13 +4026,7 @@
               <w:rPr>
                 <w:lang w:val="es-US"/>
               </w:rPr>
-              <w:t>0.</w:t>
-            </w:r>
-            <w:r>
-              <w:rPr>
-                <w:lang w:val="es-US"/>
-              </w:rPr>
-              <w:t>9091</w:t>
+              <w:t>0.9091</w:t>
             </w:r>
           </w:p>
         </w:tc>
@@ -3634,13 +4045,7 @@
               <w:rPr>
                 <w:lang w:val="es-US"/>
               </w:rPr>
-              <w:t>0.9</w:t>
-            </w:r>
-            <w:r>
-              <w:rPr>
-                <w:lang w:val="es-US"/>
-              </w:rPr>
-              <w:t>091</w:t>
+              <w:t>0.9091</w:t>
             </w:r>
           </w:p>
         </w:tc>
@@ -3657,12 +4062,14 @@
                 <w:lang w:val="es-US"/>
               </w:rPr>
             </w:pPr>
+            <w:proofErr w:type="spellStart"/>
             <w:r>
               <w:rPr>
                 <w:lang w:val="es-US"/>
               </w:rPr>
               <w:t>XGBoost</w:t>
             </w:r>
+            <w:proofErr w:type="spellEnd"/>
           </w:p>
         </w:tc>
         <w:tc>
@@ -3680,13 +4087,7 @@
               <w:rPr>
                 <w:lang w:val="es-US"/>
               </w:rPr>
-              <w:t>0.</w:t>
-            </w:r>
-            <w:r>
-              <w:rPr>
-                <w:lang w:val="es-US"/>
-              </w:rPr>
-              <w:t>7692</w:t>
+              <w:t>0.7692</w:t>
             </w:r>
           </w:p>
         </w:tc>
@@ -3724,13 +4125,7 @@
               <w:rPr>
                 <w:lang w:val="es-US"/>
               </w:rPr>
-              <w:t>0.</w:t>
-            </w:r>
-            <w:r>
-              <w:rPr>
-                <w:lang w:val="es-US"/>
-              </w:rPr>
-              <w:t>9000</w:t>
+              <w:t>0.9000</w:t>
             </w:r>
           </w:p>
         </w:tc>
@@ -3749,13 +4144,7 @@
               <w:rPr>
                 <w:lang w:val="es-US"/>
               </w:rPr>
-              <w:t>0.9</w:t>
-            </w:r>
-            <w:r>
-              <w:rPr>
-                <w:lang w:val="es-US"/>
-              </w:rPr>
-              <w:t>000</w:t>
+              <w:t>0.9000</w:t>
             </w:r>
           </w:p>
         </w:tc>
@@ -3802,42 +4191,12 @@
         <w:rPr>
           <w:lang w:val="es-US"/>
         </w:rPr>
-        <w:t xml:space="preserve"> </w:t>
-      </w:r>
-      <w:r>
-        <w:rPr>
-          <w:lang w:val="es-US"/>
-        </w:rPr>
-        <w:t>Diferencia de las m</w:t>
-      </w:r>
-      <w:r>
-        <w:rPr>
-          <w:lang w:val="es-US"/>
-        </w:rPr>
-        <w:t>étricas de l</w:t>
-      </w:r>
-      <w:r>
-        <w:rPr>
-          <w:lang w:val="es-US"/>
-        </w:rPr>
-        <w:t>os</w:t>
-      </w:r>
-      <w:r>
-        <w:rPr>
-          <w:lang w:val="es-US"/>
-        </w:rPr>
-        <w:t xml:space="preserve"> modelos usados en la predicción de presencia alta y baja de cianobacterias</w:t>
-      </w:r>
-      <w:r>
-        <w:rPr>
-          <w:lang w:val="es-US"/>
-        </w:rPr>
-        <w:t>. Se ha restado la versión original a la versión espacial.</w:t>
+        <w:t xml:space="preserve"> Diferencia de las métricas de los modelos usados en la predicción de presencia alta y baja de cianobacterias. Se ha restado la versión original a la versión espacial.</w:t>
       </w:r>
     </w:p>
     <w:tbl>
       <w:tblPr>
-        <w:tblStyle w:val="Tablaconcuadrcula"/>
+        <w:tblStyle w:val="TableGrid"/>
         <w:tblW w:w="0" w:type="auto"/>
         <w:tblLook w:val="04A0" w:firstRow="1" w:lastRow="0" w:firstColumn="1" w:lastColumn="0" w:noHBand="0" w:noVBand="1"/>
       </w:tblPr>
@@ -3885,6 +4244,7 @@
                 <w:lang w:val="es-US"/>
               </w:rPr>
             </w:pPr>
+            <w:proofErr w:type="spellStart"/>
             <w:r>
               <w:rPr>
                 <w:b/>
@@ -3893,6 +4253,7 @@
               </w:rPr>
               <w:t>Precision</w:t>
             </w:r>
+            <w:proofErr w:type="spellEnd"/>
           </w:p>
         </w:tc>
         <w:tc>
@@ -3908,6 +4269,7 @@
                 <w:lang w:val="es-US"/>
               </w:rPr>
             </w:pPr>
+            <w:proofErr w:type="spellStart"/>
             <w:r>
               <w:rPr>
                 <w:b/>
@@ -3916,6 +4278,7 @@
               </w:rPr>
               <w:t>Recall</w:t>
             </w:r>
+            <w:proofErr w:type="spellEnd"/>
           </w:p>
         </w:tc>
         <w:tc>
@@ -4171,12 +4534,14 @@
                 <w:lang w:val="es-US"/>
               </w:rPr>
             </w:pPr>
+            <w:proofErr w:type="spellStart"/>
             <w:r>
               <w:rPr>
                 <w:lang w:val="es-US"/>
               </w:rPr>
               <w:t>XGBoost</w:t>
             </w:r>
+            <w:proofErr w:type="spellEnd"/>
           </w:p>
         </w:tc>
         <w:tc>
@@ -4295,7 +4660,7 @@
     </w:p>
     <w:tbl>
       <w:tblPr>
-        <w:tblStyle w:val="Tablaconcuadrcula"/>
+        <w:tblStyle w:val="TableGrid"/>
         <w:tblW w:w="0" w:type="auto"/>
         <w:tblLook w:val="04A0" w:firstRow="1" w:lastRow="0" w:firstColumn="1" w:lastColumn="0" w:noHBand="0" w:noVBand="1"/>
       </w:tblPr>
@@ -4354,12 +4719,14 @@
                 <w:lang w:val="es-US"/>
               </w:rPr>
             </w:pPr>
+            <w:proofErr w:type="spellStart"/>
             <w:r>
               <w:rPr>
                 <w:lang w:val="es-US"/>
               </w:rPr>
               <w:t>Precision</w:t>
             </w:r>
+            <w:proofErr w:type="spellEnd"/>
           </w:p>
         </w:tc>
         <w:tc>
@@ -4372,12 +4739,14 @@
                 <w:lang w:val="es-US"/>
               </w:rPr>
             </w:pPr>
+            <w:proofErr w:type="spellStart"/>
             <w:r>
               <w:rPr>
                 <w:lang w:val="es-US"/>
               </w:rPr>
               <w:t>Recall</w:t>
             </w:r>
+            <w:proofErr w:type="spellEnd"/>
           </w:p>
         </w:tc>
         <w:tc>
@@ -4711,12 +5080,14 @@
                 <w:lang w:val="es-US"/>
               </w:rPr>
             </w:pPr>
+            <w:proofErr w:type="spellStart"/>
             <w:r>
               <w:rPr>
                 <w:lang w:val="es-US"/>
               </w:rPr>
               <w:t>XGBoost</w:t>
             </w:r>
+            <w:proofErr w:type="spellEnd"/>
           </w:p>
         </w:tc>
         <w:tc>
@@ -5170,7 +5541,7 @@
     </w:p>
     <w:p>
       <w:pPr>
-        <w:pStyle w:val="Ttulo2"/>
+        <w:pStyle w:val="Heading2"/>
         <w:rPr>
           <w:lang w:val="es-US"/>
         </w:rPr>
@@ -5205,7 +5576,21 @@
         <w:rPr>
           <w:lang w:val="es-US"/>
         </w:rPr>
-        <w:t xml:space="preserve">de presencia alta y baja de cianobacterias con píxeles originales, el que mejor capacidad predictiva presentó fue el modelo de XGBost, respecto a la métrica F1-score, la cual fue elegida debido a que se tenía un desbalance leve entre las etiquetas y se les decidió dar el mismo valor a ambas. </w:t>
+        <w:t xml:space="preserve">de presencia alta y baja de cianobacterias con píxeles originales, el que mejor capacidad predictiva presentó fue el modelo de </w:t>
+      </w:r>
+      <w:proofErr w:type="spellStart"/>
+      <w:r>
+        <w:rPr>
+          <w:lang w:val="es-US"/>
+        </w:rPr>
+        <w:t>XGBost</w:t>
+      </w:r>
+      <w:proofErr w:type="spellEnd"/>
+      <w:r>
+        <w:rPr>
+          <w:lang w:val="es-US"/>
+        </w:rPr>
+        <w:t xml:space="preserve">, respecto a la métrica F1-score, la cual fue elegida debido a que se tenía un desbalance leve entre las etiquetas y se les decidió dar el mismo valor a ambas. </w:t>
       </w:r>
     </w:p>
     <w:p>
@@ -5219,7 +5604,63 @@
         <w:rPr>
           <w:lang w:val="es-US"/>
         </w:rPr>
-        <w:t>En todas las métricas y en la matriz de confusión analizadas el mejor modelo fue el XGBoost, el cual demostró tener una mejor capacidad de predicción. El resultado tampoco fue mucho mejor que los otros modelos, por lo que si se requier explicabilidad, la regresión logística puede ser una excelente opción, ya que tiene un f1-score solo 0.023 por debajo del XGBoost.</w:t>
+        <w:t xml:space="preserve">En todas las métricas y en la matriz de confusión analizadas el mejor modelo fue el </w:t>
+      </w:r>
+      <w:proofErr w:type="spellStart"/>
+      <w:r>
+        <w:rPr>
+          <w:lang w:val="es-US"/>
+        </w:rPr>
+        <w:t>XGBoost</w:t>
+      </w:r>
+      <w:proofErr w:type="spellEnd"/>
+      <w:r>
+        <w:rPr>
+          <w:lang w:val="es-US"/>
+        </w:rPr>
+        <w:t xml:space="preserve">, el cual demostró tener una mejor capacidad de predicción. El resultado tampoco fue mucho mejor que los otros modelos, por lo que si se </w:t>
+      </w:r>
+      <w:proofErr w:type="spellStart"/>
+      <w:r>
+        <w:rPr>
+          <w:lang w:val="es-US"/>
+        </w:rPr>
+        <w:t>requier</w:t>
+      </w:r>
+      <w:proofErr w:type="spellEnd"/>
+      <w:r>
+        <w:rPr>
+          <w:lang w:val="es-US"/>
+        </w:rPr>
+        <w:t xml:space="preserve"> </w:t>
+      </w:r>
+      <w:proofErr w:type="spellStart"/>
+      <w:r>
+        <w:rPr>
+          <w:lang w:val="es-US"/>
+        </w:rPr>
+        <w:t>explicabilidad</w:t>
+      </w:r>
+      <w:proofErr w:type="spellEnd"/>
+      <w:r>
+        <w:rPr>
+          <w:lang w:val="es-US"/>
+        </w:rPr>
+        <w:t xml:space="preserve">, la regresión logística puede ser una excelente opción, ya que tiene un f1-score solo 0.023 por debajo del </w:t>
+      </w:r>
+      <w:proofErr w:type="spellStart"/>
+      <w:r>
+        <w:rPr>
+          <w:lang w:val="es-US"/>
+        </w:rPr>
+        <w:t>XGBoost</w:t>
+      </w:r>
+      <w:proofErr w:type="spellEnd"/>
+      <w:r>
+        <w:rPr>
+          <w:lang w:val="es-US"/>
+        </w:rPr>
+        <w:t>.</w:t>
       </w:r>
     </w:p>
     <w:p>
@@ -5247,97 +5688,55 @@
         <w:rPr>
           <w:lang w:val="es-US"/>
         </w:rPr>
-        <w:t>Consideramos que se debe dar más importancia a no predecir incorrectamente las zonas de alta presencia, ya que estas pueden ocasionar problemas de salud o de pérdida de flora y fauna. La métrica más útil sería el recall, (tomando alta presencia como positiva), en este caso el modelo XGBoost es considerado el mejor.</w:t>
-      </w:r>
-    </w:p>
-    <w:p>
-      <w:pPr>
-        <w:rPr>
-          <w:lang w:val="es-US"/>
-        </w:rPr>
-      </w:pPr>
-    </w:p>
-    <w:p>
-      <w:pPr>
-        <w:rPr>
-          <w:lang w:val="es-US"/>
-        </w:rPr>
-      </w:pPr>
-    </w:p>
-    <w:p>
-      <w:pPr>
-        <w:rPr>
-          <w:lang w:val="es-US"/>
-        </w:rPr>
-      </w:pPr>
-    </w:p>
-    <w:p>
-      <w:pPr>
-        <w:rPr>
-          <w:lang w:val="es-US"/>
-        </w:rPr>
-      </w:pPr>
-    </w:p>
-    <w:p>
-      <w:pPr>
-        <w:rPr>
-          <w:lang w:val="es-US"/>
-        </w:rPr>
-      </w:pPr>
-    </w:p>
-    <w:p>
-      <w:pPr>
-        <w:rPr>
-          <w:lang w:val="es-US"/>
-        </w:rPr>
-      </w:pPr>
-    </w:p>
-    <w:p>
-      <w:pPr>
-        <w:rPr>
-          <w:lang w:val="es-US"/>
-        </w:rPr>
-      </w:pPr>
-    </w:p>
-    <w:p>
-      <w:pPr>
-        <w:rPr>
-          <w:lang w:val="es-US"/>
-        </w:rPr>
-      </w:pPr>
-    </w:p>
-    <w:p>
-      <w:pPr>
-        <w:rPr>
-          <w:lang w:val="es-US"/>
-        </w:rPr>
-      </w:pPr>
-    </w:p>
-    <w:p>
-      <w:pPr>
-        <w:rPr>
-          <w:lang w:val="es-US"/>
-        </w:rPr>
-      </w:pPr>
-    </w:p>
-    <w:p>
-      <w:pPr>
-        <w:rPr>
-          <w:lang w:val="es-US"/>
-        </w:rPr>
-      </w:pPr>
-    </w:p>
-    <w:p>
-      <w:pPr>
-        <w:pStyle w:val="Ttulo2"/>
-        <w:rPr>
-          <w:lang w:val="es-US"/>
-        </w:rPr>
-      </w:pPr>
-      <w:r>
-        <w:rPr>
-          <w:lang w:val="es-US"/>
-        </w:rPr>
+        <w:t xml:space="preserve">Consideramos que se debe dar más importancia a no predecir incorrectamente las zonas de alta presencia, ya que estas pueden ocasionar problemas de salud o de pérdida de flora y fauna. La métrica más útil sería el </w:t>
+      </w:r>
+      <w:proofErr w:type="spellStart"/>
+      <w:r>
+        <w:rPr>
+          <w:lang w:val="es-US"/>
+        </w:rPr>
+        <w:t>recall</w:t>
+      </w:r>
+      <w:proofErr w:type="spellEnd"/>
+      <w:r>
+        <w:rPr>
+          <w:lang w:val="es-US"/>
+        </w:rPr>
+        <w:t xml:space="preserve">, (tomando alta presencia como positiva), en este caso el modelo </w:t>
+      </w:r>
+      <w:proofErr w:type="spellStart"/>
+      <w:r>
+        <w:rPr>
+          <w:lang w:val="es-US"/>
+        </w:rPr>
+        <w:t>XGBoost</w:t>
+      </w:r>
+      <w:proofErr w:type="spellEnd"/>
+      <w:r>
+        <w:rPr>
+          <w:lang w:val="es-US"/>
+        </w:rPr>
+        <w:t xml:space="preserve"> es considerado el mejor.</w:t>
+      </w:r>
+      <w:r>
+        <w:rPr>
+          <w:lang w:val="es-US"/>
+        </w:rPr>
+        <w:br w:type="page"/>
+      </w:r>
+    </w:p>
+    <w:p>
+      <w:pPr>
+        <w:pStyle w:val="Heading2"/>
+        <w:rPr>
+          <w:lang w:val="es-US"/>
+        </w:rPr>
+      </w:pPr>
+      <w:r>
+        <w:rPr>
+          <w:lang w:val="es-US"/>
+        </w:rPr>
+        <w:lastRenderedPageBreak/>
         <w:t>Conclusiones</w:t>
       </w:r>
     </w:p>
@@ -5370,14 +5769,50 @@
         <w:rPr>
           <w:lang w:val="es-US"/>
         </w:rPr>
-        <w:t xml:space="preserve">de presencia alta y baja de cianobacterias con píxeles originales fue el XGBost, para cada una de las métricas usadas. Pero si se desea explicabilidad debe usarse la regresión logística, cuyo rendimiento solo fue </w:t>
-      </w:r>
-      <w:r>
-        <w:rPr>
-          <w:lang w:val="es-US"/>
-        </w:rPr>
-        <w:t>0.023 por debajo del XGBoost</w:t>
-      </w:r>
+        <w:t xml:space="preserve">de presencia alta y baja de cianobacterias con píxeles originales fue el </w:t>
+      </w:r>
+      <w:proofErr w:type="spellStart"/>
+      <w:r>
+        <w:rPr>
+          <w:lang w:val="es-US"/>
+        </w:rPr>
+        <w:t>XGBost</w:t>
+      </w:r>
+      <w:proofErr w:type="spellEnd"/>
+      <w:r>
+        <w:rPr>
+          <w:lang w:val="es-US"/>
+        </w:rPr>
+        <w:t xml:space="preserve">, para cada una de las métricas usadas. Pero si se desea </w:t>
+      </w:r>
+      <w:proofErr w:type="spellStart"/>
+      <w:r>
+        <w:rPr>
+          <w:lang w:val="es-US"/>
+        </w:rPr>
+        <w:t>explicabilidad</w:t>
+      </w:r>
+      <w:proofErr w:type="spellEnd"/>
+      <w:r>
+        <w:rPr>
+          <w:lang w:val="es-US"/>
+        </w:rPr>
+        <w:t xml:space="preserve"> debe usarse la regresión logística, cuyo rendimiento solo fue </w:t>
+      </w:r>
+      <w:r>
+        <w:rPr>
+          <w:lang w:val="es-US"/>
+        </w:rPr>
+        <w:t xml:space="preserve">0.023 por debajo del </w:t>
+      </w:r>
+      <w:proofErr w:type="spellStart"/>
+      <w:r>
+        <w:rPr>
+          <w:lang w:val="es-US"/>
+        </w:rPr>
+        <w:t>XGBoost</w:t>
+      </w:r>
+      <w:proofErr w:type="spellEnd"/>
       <w:r>
         <w:rPr>
           <w:lang w:val="es-US"/>
@@ -5385,52 +5820,37 @@
         <w:t xml:space="preserve"> en la métrica f1-score.</w:t>
       </w:r>
     </w:p>
-    <w:p/>
-    <w:p>
-      <w:pPr>
-        <w:rPr>
-          <w:lang w:val="es-US"/>
-        </w:rPr>
-      </w:pPr>
-    </w:p>
-    <w:p>
-      <w:pPr>
-        <w:rPr>
-          <w:lang w:val="es-US"/>
-        </w:rPr>
-      </w:pPr>
-    </w:p>
-    <w:p>
-      <w:pPr>
-        <w:rPr>
-          <w:lang w:val="es-US"/>
-        </w:rPr>
-      </w:pPr>
-    </w:p>
-    <w:p>
-      <w:pPr>
-        <w:rPr>
-          <w:lang w:val="es-US"/>
-        </w:rPr>
-      </w:pPr>
-    </w:p>
-    <w:p>
-      <w:pPr>
-        <w:rPr>
-          <w:lang w:val="es-US"/>
-        </w:rPr>
-      </w:pPr>
-    </w:p>
-    <w:p>
-      <w:pPr>
-        <w:rPr>
-          <w:lang w:val="es-US"/>
-        </w:rPr>
-      </w:pPr>
-    </w:p>
-    <w:p>
-      <w:pPr>
-        <w:pStyle w:val="Ttulo2"/>
+    <w:p>
+      <w:pPr>
+        <w:rPr>
+          <w:lang w:val="es-US"/>
+        </w:rPr>
+      </w:pPr>
+    </w:p>
+    <w:p>
+      <w:pPr>
+        <w:rPr>
+          <w:lang w:val="es-US"/>
+        </w:rPr>
+      </w:pPr>
+    </w:p>
+    <w:p>
+      <w:pPr>
+        <w:rPr>
+          <w:lang w:val="es-US"/>
+        </w:rPr>
+      </w:pPr>
+    </w:p>
+    <w:p>
+      <w:pPr>
+        <w:rPr>
+          <w:lang w:val="es-US"/>
+        </w:rPr>
+      </w:pPr>
+    </w:p>
+    <w:p>
+      <w:pPr>
+        <w:pStyle w:val="Heading2"/>
         <w:rPr>
           <w:lang w:val="de-DE"/>
         </w:rPr>
@@ -5479,7 +5899,6 @@
         <w:rPr>
           <w:lang w:val="en-US"/>
         </w:rPr>
-        <w:lastRenderedPageBreak/>
         <w:t>European Space Agency. (2025–2026). </w:t>
       </w:r>
       <w:r>
@@ -5494,18 +5913,46 @@
         <w:rPr>
           <w:lang w:val="en-US"/>
         </w:rPr>
-        <w:t xml:space="preserve"> [Conjunto de datos]. </w:t>
-      </w:r>
-      <w:r>
-        <w:rPr>
-          <w:lang w:val="es-US"/>
-        </w:rPr>
-        <w:t>Copernicus Data Space Ecosystem. </w:t>
+        <w:t xml:space="preserve"> [Conjunto de </w:t>
+      </w:r>
+      <w:proofErr w:type="spellStart"/>
+      <w:r>
+        <w:rPr>
+          <w:lang w:val="en-US"/>
+        </w:rPr>
+        <w:t>datos</w:t>
+      </w:r>
+      <w:proofErr w:type="spellEnd"/>
+      <w:r>
+        <w:rPr>
+          <w:lang w:val="en-US"/>
+        </w:rPr>
+        <w:t xml:space="preserve">]. </w:t>
+      </w:r>
+      <w:r>
+        <w:rPr>
+          <w:lang w:val="es-US"/>
+        </w:rPr>
+        <w:t xml:space="preserve">Copernicus Data Space </w:t>
+      </w:r>
+      <w:proofErr w:type="spellStart"/>
+      <w:r>
+        <w:rPr>
+          <w:lang w:val="es-US"/>
+        </w:rPr>
+        <w:t>Ecosystem</w:t>
+      </w:r>
+      <w:proofErr w:type="spellEnd"/>
+      <w:r>
+        <w:rPr>
+          <w:lang w:val="es-US"/>
+        </w:rPr>
+        <w:t>. </w:t>
       </w:r>
       <w:hyperlink r:id="rId8" w:tgtFrame="_blank" w:history="1">
         <w:r>
           <w:rPr>
-            <w:rStyle w:val="Hipervnculo"/>
+            <w:rStyle w:val="Hyperlink"/>
             <w:lang w:val="en-US"/>
           </w:rPr>
           <w:t>https://dataspace.copernicus.eu/</w:t>
@@ -6204,11 +6651,11 @@
     <w:qFormat/>
     <w:rsid w:val="00B97640"/>
   </w:style>
-  <w:style w:type="paragraph" w:styleId="Ttulo1">
+  <w:style w:type="paragraph" w:styleId="Heading1">
     <w:name w:val="heading 1"/>
     <w:basedOn w:val="Normal"/>
     <w:next w:val="Normal"/>
-    <w:link w:val="Ttulo1Car"/>
+    <w:link w:val="Heading1Char"/>
     <w:uiPriority w:val="9"/>
     <w:qFormat/>
     <w:rsid w:val="00B97640"/>
@@ -6225,11 +6672,11 @@
       <w:szCs w:val="40"/>
     </w:rPr>
   </w:style>
-  <w:style w:type="paragraph" w:styleId="Ttulo2">
+  <w:style w:type="paragraph" w:styleId="Heading2">
     <w:name w:val="heading 2"/>
     <w:basedOn w:val="Normal"/>
     <w:next w:val="Normal"/>
-    <w:link w:val="Ttulo2Car"/>
+    <w:link w:val="Heading2Char"/>
     <w:uiPriority w:val="9"/>
     <w:unhideWhenUsed/>
     <w:qFormat/>
@@ -6247,11 +6694,11 @@
       <w:szCs w:val="32"/>
     </w:rPr>
   </w:style>
-  <w:style w:type="paragraph" w:styleId="Ttulo3">
+  <w:style w:type="paragraph" w:styleId="Heading3">
     <w:name w:val="heading 3"/>
     <w:basedOn w:val="Normal"/>
     <w:next w:val="Normal"/>
-    <w:link w:val="Ttulo3Car"/>
+    <w:link w:val="Heading3Char"/>
     <w:uiPriority w:val="9"/>
     <w:semiHidden/>
     <w:unhideWhenUsed/>
@@ -6270,11 +6717,11 @@
       <w:szCs w:val="28"/>
     </w:rPr>
   </w:style>
-  <w:style w:type="paragraph" w:styleId="Ttulo4">
+  <w:style w:type="paragraph" w:styleId="Heading4">
     <w:name w:val="heading 4"/>
     <w:basedOn w:val="Normal"/>
     <w:next w:val="Normal"/>
-    <w:link w:val="Ttulo4Car"/>
+    <w:link w:val="Heading4Char"/>
     <w:uiPriority w:val="9"/>
     <w:semiHidden/>
     <w:unhideWhenUsed/>
@@ -6293,11 +6740,11 @@
       <w:color w:val="0F4761" w:themeColor="accent1" w:themeShade="BF"/>
     </w:rPr>
   </w:style>
-  <w:style w:type="paragraph" w:styleId="Ttulo5">
+  <w:style w:type="paragraph" w:styleId="Heading5">
     <w:name w:val="heading 5"/>
     <w:basedOn w:val="Normal"/>
     <w:next w:val="Normal"/>
-    <w:link w:val="Ttulo5Car"/>
+    <w:link w:val="Heading5Char"/>
     <w:uiPriority w:val="9"/>
     <w:semiHidden/>
     <w:unhideWhenUsed/>
@@ -6314,11 +6761,11 @@
       <w:color w:val="0F4761" w:themeColor="accent1" w:themeShade="BF"/>
     </w:rPr>
   </w:style>
-  <w:style w:type="paragraph" w:styleId="Ttulo6">
+  <w:style w:type="paragraph" w:styleId="Heading6">
     <w:name w:val="heading 6"/>
     <w:basedOn w:val="Normal"/>
     <w:next w:val="Normal"/>
-    <w:link w:val="Ttulo6Car"/>
+    <w:link w:val="Heading6Char"/>
     <w:uiPriority w:val="9"/>
     <w:semiHidden/>
     <w:unhideWhenUsed/>
@@ -6337,11 +6784,11 @@
       <w:color w:val="595959" w:themeColor="text1" w:themeTint="A6"/>
     </w:rPr>
   </w:style>
-  <w:style w:type="paragraph" w:styleId="Ttulo7">
+  <w:style w:type="paragraph" w:styleId="Heading7">
     <w:name w:val="heading 7"/>
     <w:basedOn w:val="Normal"/>
     <w:next w:val="Normal"/>
-    <w:link w:val="Ttulo7Car"/>
+    <w:link w:val="Heading7Char"/>
     <w:uiPriority w:val="9"/>
     <w:semiHidden/>
     <w:unhideWhenUsed/>
@@ -6358,11 +6805,11 @@
       <w:color w:val="595959" w:themeColor="text1" w:themeTint="A6"/>
     </w:rPr>
   </w:style>
-  <w:style w:type="paragraph" w:styleId="Ttulo8">
+  <w:style w:type="paragraph" w:styleId="Heading8">
     <w:name w:val="heading 8"/>
     <w:basedOn w:val="Normal"/>
     <w:next w:val="Normal"/>
-    <w:link w:val="Ttulo8Car"/>
+    <w:link w:val="Heading8Char"/>
     <w:uiPriority w:val="9"/>
     <w:semiHidden/>
     <w:unhideWhenUsed/>
@@ -6381,11 +6828,11 @@
       <w:color w:val="272727" w:themeColor="text1" w:themeTint="D8"/>
     </w:rPr>
   </w:style>
-  <w:style w:type="paragraph" w:styleId="Ttulo9">
+  <w:style w:type="paragraph" w:styleId="Heading9">
     <w:name w:val="heading 9"/>
     <w:basedOn w:val="Normal"/>
     <w:next w:val="Normal"/>
-    <w:link w:val="Ttulo9Car"/>
+    <w:link w:val="Heading9Char"/>
     <w:uiPriority w:val="9"/>
     <w:semiHidden/>
     <w:unhideWhenUsed/>
@@ -6402,13 +6849,13 @@
       <w:color w:val="272727" w:themeColor="text1" w:themeTint="D8"/>
     </w:rPr>
   </w:style>
-  <w:style w:type="character" w:default="1" w:styleId="Fuentedeprrafopredeter">
+  <w:style w:type="character" w:default="1" w:styleId="DefaultParagraphFont">
     <w:name w:val="Default Paragraph Font"/>
     <w:uiPriority w:val="1"/>
     <w:semiHidden/>
     <w:unhideWhenUsed/>
   </w:style>
-  <w:style w:type="table" w:default="1" w:styleId="Tablanormal">
+  <w:style w:type="table" w:default="1" w:styleId="TableNormal">
     <w:name w:val="Normal Table"/>
     <w:uiPriority w:val="99"/>
     <w:semiHidden/>
@@ -6423,16 +6870,16 @@
       </w:tblCellMar>
     </w:tblPr>
   </w:style>
-  <w:style w:type="numbering" w:default="1" w:styleId="Sinlista">
+  <w:style w:type="numbering" w:default="1" w:styleId="NoList">
     <w:name w:val="No List"/>
     <w:uiPriority w:val="99"/>
     <w:semiHidden/>
     <w:unhideWhenUsed/>
   </w:style>
-  <w:style w:type="character" w:customStyle="1" w:styleId="Ttulo1Car">
-    <w:name w:val="Título 1 Car"/>
-    <w:basedOn w:val="Fuentedeprrafopredeter"/>
-    <w:link w:val="Ttulo1"/>
+  <w:style w:type="character" w:customStyle="1" w:styleId="Heading1Char">
+    <w:name w:val="Heading 1 Char"/>
+    <w:basedOn w:val="DefaultParagraphFont"/>
+    <w:link w:val="Heading1"/>
     <w:uiPriority w:val="9"/>
     <w:rsid w:val="00B97640"/>
     <w:rPr>
@@ -6442,10 +6889,10 @@
       <w:szCs w:val="40"/>
     </w:rPr>
   </w:style>
-  <w:style w:type="character" w:customStyle="1" w:styleId="Ttulo2Car">
-    <w:name w:val="Título 2 Car"/>
-    <w:basedOn w:val="Fuentedeprrafopredeter"/>
-    <w:link w:val="Ttulo2"/>
+  <w:style w:type="character" w:customStyle="1" w:styleId="Heading2Char">
+    <w:name w:val="Heading 2 Char"/>
+    <w:basedOn w:val="DefaultParagraphFont"/>
+    <w:link w:val="Heading2"/>
     <w:uiPriority w:val="9"/>
     <w:rsid w:val="00B97640"/>
     <w:rPr>
@@ -6455,10 +6902,10 @@
       <w:szCs w:val="32"/>
     </w:rPr>
   </w:style>
-  <w:style w:type="character" w:customStyle="1" w:styleId="Ttulo3Car">
-    <w:name w:val="Título 3 Car"/>
-    <w:basedOn w:val="Fuentedeprrafopredeter"/>
-    <w:link w:val="Ttulo3"/>
+  <w:style w:type="character" w:customStyle="1" w:styleId="Heading3Char">
+    <w:name w:val="Heading 3 Char"/>
+    <w:basedOn w:val="DefaultParagraphFont"/>
+    <w:link w:val="Heading3"/>
     <w:uiPriority w:val="9"/>
     <w:semiHidden/>
     <w:rsid w:val="00B97640"/>
@@ -6469,10 +6916,10 @@
       <w:szCs w:val="28"/>
     </w:rPr>
   </w:style>
-  <w:style w:type="character" w:customStyle="1" w:styleId="Ttulo4Car">
-    <w:name w:val="Título 4 Car"/>
-    <w:basedOn w:val="Fuentedeprrafopredeter"/>
-    <w:link w:val="Ttulo4"/>
+  <w:style w:type="character" w:customStyle="1" w:styleId="Heading4Char">
+    <w:name w:val="Heading 4 Char"/>
+    <w:basedOn w:val="DefaultParagraphFont"/>
+    <w:link w:val="Heading4"/>
     <w:uiPriority w:val="9"/>
     <w:semiHidden/>
     <w:rsid w:val="00B97640"/>
@@ -6483,10 +6930,10 @@
       <w:color w:val="0F4761" w:themeColor="accent1" w:themeShade="BF"/>
     </w:rPr>
   </w:style>
-  <w:style w:type="character" w:customStyle="1" w:styleId="Ttulo5Car">
-    <w:name w:val="Título 5 Car"/>
-    <w:basedOn w:val="Fuentedeprrafopredeter"/>
-    <w:link w:val="Ttulo5"/>
+  <w:style w:type="character" w:customStyle="1" w:styleId="Heading5Char">
+    <w:name w:val="Heading 5 Char"/>
+    <w:basedOn w:val="DefaultParagraphFont"/>
+    <w:link w:val="Heading5"/>
     <w:uiPriority w:val="9"/>
     <w:semiHidden/>
     <w:rsid w:val="00B97640"/>
@@ -6495,10 +6942,10 @@
       <w:color w:val="0F4761" w:themeColor="accent1" w:themeShade="BF"/>
     </w:rPr>
   </w:style>
-  <w:style w:type="character" w:customStyle="1" w:styleId="Ttulo6Car">
-    <w:name w:val="Título 6 Car"/>
-    <w:basedOn w:val="Fuentedeprrafopredeter"/>
-    <w:link w:val="Ttulo6"/>
+  <w:style w:type="character" w:customStyle="1" w:styleId="Heading6Char">
+    <w:name w:val="Heading 6 Char"/>
+    <w:basedOn w:val="DefaultParagraphFont"/>
+    <w:link w:val="Heading6"/>
     <w:uiPriority w:val="9"/>
     <w:semiHidden/>
     <w:rsid w:val="00B97640"/>
@@ -6509,10 +6956,10 @@
       <w:color w:val="595959" w:themeColor="text1" w:themeTint="A6"/>
     </w:rPr>
   </w:style>
-  <w:style w:type="character" w:customStyle="1" w:styleId="Ttulo7Car">
-    <w:name w:val="Título 7 Car"/>
-    <w:basedOn w:val="Fuentedeprrafopredeter"/>
-    <w:link w:val="Ttulo7"/>
+  <w:style w:type="character" w:customStyle="1" w:styleId="Heading7Char">
+    <w:name w:val="Heading 7 Char"/>
+    <w:basedOn w:val="DefaultParagraphFont"/>
+    <w:link w:val="Heading7"/>
     <w:uiPriority w:val="9"/>
     <w:semiHidden/>
     <w:rsid w:val="00B97640"/>
@@ -6521,10 +6968,10 @@
       <w:color w:val="595959" w:themeColor="text1" w:themeTint="A6"/>
     </w:rPr>
   </w:style>
-  <w:style w:type="character" w:customStyle="1" w:styleId="Ttulo8Car">
-    <w:name w:val="Título 8 Car"/>
-    <w:basedOn w:val="Fuentedeprrafopredeter"/>
-    <w:link w:val="Ttulo8"/>
+  <w:style w:type="character" w:customStyle="1" w:styleId="Heading8Char">
+    <w:name w:val="Heading 8 Char"/>
+    <w:basedOn w:val="DefaultParagraphFont"/>
+    <w:link w:val="Heading8"/>
     <w:uiPriority w:val="9"/>
     <w:semiHidden/>
     <w:rsid w:val="00B97640"/>
@@ -6535,10 +6982,10 @@
       <w:color w:val="272727" w:themeColor="text1" w:themeTint="D8"/>
     </w:rPr>
   </w:style>
-  <w:style w:type="character" w:customStyle="1" w:styleId="Ttulo9Car">
-    <w:name w:val="Título 9 Car"/>
-    <w:basedOn w:val="Fuentedeprrafopredeter"/>
-    <w:link w:val="Ttulo9"/>
+  <w:style w:type="character" w:customStyle="1" w:styleId="Heading9Char">
+    <w:name w:val="Heading 9 Char"/>
+    <w:basedOn w:val="DefaultParagraphFont"/>
+    <w:link w:val="Heading9"/>
     <w:uiPriority w:val="9"/>
     <w:semiHidden/>
     <w:rsid w:val="00B97640"/>
@@ -6547,11 +6994,11 @@
       <w:color w:val="272727" w:themeColor="text1" w:themeTint="D8"/>
     </w:rPr>
   </w:style>
-  <w:style w:type="paragraph" w:styleId="Ttulo">
+  <w:style w:type="paragraph" w:styleId="Title">
     <w:name w:val="Title"/>
     <w:basedOn w:val="Normal"/>
     <w:next w:val="Normal"/>
-    <w:link w:val="TtuloCar"/>
+    <w:link w:val="TitleChar"/>
     <w:uiPriority w:val="10"/>
     <w:qFormat/>
     <w:rsid w:val="00B97640"/>
@@ -6567,10 +7014,10 @@
       <w:szCs w:val="56"/>
     </w:rPr>
   </w:style>
-  <w:style w:type="character" w:customStyle="1" w:styleId="TtuloCar">
-    <w:name w:val="Título Car"/>
-    <w:basedOn w:val="Fuentedeprrafopredeter"/>
-    <w:link w:val="Ttulo"/>
+  <w:style w:type="character" w:customStyle="1" w:styleId="TitleChar">
+    <w:name w:val="Title Char"/>
+    <w:basedOn w:val="DefaultParagraphFont"/>
+    <w:link w:val="Title"/>
     <w:uiPriority w:val="10"/>
     <w:rsid w:val="00B97640"/>
     <w:rPr>
@@ -6581,11 +7028,11 @@
       <w:szCs w:val="56"/>
     </w:rPr>
   </w:style>
-  <w:style w:type="paragraph" w:styleId="Subttulo">
+  <w:style w:type="paragraph" w:styleId="Subtitle">
     <w:name w:val="Subtitle"/>
     <w:basedOn w:val="Normal"/>
     <w:next w:val="Normal"/>
-    <w:link w:val="SubttuloCar"/>
+    <w:link w:val="SubtitleChar"/>
     <w:uiPriority w:val="11"/>
     <w:qFormat/>
     <w:rsid w:val="00B97640"/>
@@ -6602,10 +7049,10 @@
       <w:szCs w:val="28"/>
     </w:rPr>
   </w:style>
-  <w:style w:type="character" w:customStyle="1" w:styleId="SubttuloCar">
-    <w:name w:val="Subtítulo Car"/>
-    <w:basedOn w:val="Fuentedeprrafopredeter"/>
-    <w:link w:val="Subttulo"/>
+  <w:style w:type="character" w:customStyle="1" w:styleId="SubtitleChar">
+    <w:name w:val="Subtitle Char"/>
+    <w:basedOn w:val="DefaultParagraphFont"/>
+    <w:link w:val="Subtitle"/>
     <w:uiPriority w:val="11"/>
     <w:rsid w:val="00B97640"/>
     <w:rPr>
@@ -6616,11 +7063,11 @@
       <w:szCs w:val="28"/>
     </w:rPr>
   </w:style>
-  <w:style w:type="paragraph" w:styleId="Cita">
+  <w:style w:type="paragraph" w:styleId="Quote">
     <w:name w:val="Quote"/>
     <w:basedOn w:val="Normal"/>
     <w:next w:val="Normal"/>
-    <w:link w:val="CitaCar"/>
+    <w:link w:val="QuoteChar"/>
     <w:uiPriority w:val="29"/>
     <w:qFormat/>
     <w:rsid w:val="00B97640"/>
@@ -6634,10 +7081,10 @@
       <w:color w:val="404040" w:themeColor="text1" w:themeTint="BF"/>
     </w:rPr>
   </w:style>
-  <w:style w:type="character" w:customStyle="1" w:styleId="CitaCar">
-    <w:name w:val="Cita Car"/>
-    <w:basedOn w:val="Fuentedeprrafopredeter"/>
-    <w:link w:val="Cita"/>
+  <w:style w:type="character" w:customStyle="1" w:styleId="QuoteChar">
+    <w:name w:val="Quote Char"/>
+    <w:basedOn w:val="DefaultParagraphFont"/>
+    <w:link w:val="Quote"/>
     <w:uiPriority w:val="29"/>
     <w:rsid w:val="00B97640"/>
     <w:rPr>
@@ -6646,7 +7093,7 @@
       <w:color w:val="404040" w:themeColor="text1" w:themeTint="BF"/>
     </w:rPr>
   </w:style>
-  <w:style w:type="paragraph" w:styleId="Prrafodelista">
+  <w:style w:type="paragraph" w:styleId="ListParagraph">
     <w:name w:val="List Paragraph"/>
     <w:basedOn w:val="Normal"/>
     <w:uiPriority w:val="34"/>
@@ -6657,9 +7104,9 @@
       <w:contextualSpacing/>
     </w:pPr>
   </w:style>
-  <w:style w:type="character" w:styleId="nfasisintenso">
+  <w:style w:type="character" w:styleId="IntenseEmphasis">
     <w:name w:val="Intense Emphasis"/>
-    <w:basedOn w:val="Fuentedeprrafopredeter"/>
+    <w:basedOn w:val="DefaultParagraphFont"/>
     <w:uiPriority w:val="21"/>
     <w:qFormat/>
     <w:rsid w:val="00B97640"/>
@@ -6669,11 +7116,11 @@
       <w:color w:val="0F4761" w:themeColor="accent1" w:themeShade="BF"/>
     </w:rPr>
   </w:style>
-  <w:style w:type="paragraph" w:styleId="Citadestacada">
+  <w:style w:type="paragraph" w:styleId="IntenseQuote">
     <w:name w:val="Intense Quote"/>
     <w:basedOn w:val="Normal"/>
     <w:next w:val="Normal"/>
-    <w:link w:val="CitadestacadaCar"/>
+    <w:link w:val="IntenseQuoteChar"/>
     <w:uiPriority w:val="30"/>
     <w:qFormat/>
     <w:rsid w:val="00B97640"/>
@@ -6692,10 +7139,10 @@
       <w:color w:val="0F4761" w:themeColor="accent1" w:themeShade="BF"/>
     </w:rPr>
   </w:style>
-  <w:style w:type="character" w:customStyle="1" w:styleId="CitadestacadaCar">
-    <w:name w:val="Cita destacada Car"/>
-    <w:basedOn w:val="Fuentedeprrafopredeter"/>
-    <w:link w:val="Citadestacada"/>
+  <w:style w:type="character" w:customStyle="1" w:styleId="IntenseQuoteChar">
+    <w:name w:val="Intense Quote Char"/>
+    <w:basedOn w:val="DefaultParagraphFont"/>
+    <w:link w:val="IntenseQuote"/>
     <w:uiPriority w:val="30"/>
     <w:rsid w:val="00B97640"/>
     <w:rPr>
@@ -6704,9 +7151,9 @@
       <w:color w:val="0F4761" w:themeColor="accent1" w:themeShade="BF"/>
     </w:rPr>
   </w:style>
-  <w:style w:type="character" w:styleId="Referenciaintensa">
+  <w:style w:type="character" w:styleId="IntenseReference">
     <w:name w:val="Intense Reference"/>
-    <w:basedOn w:val="Fuentedeprrafopredeter"/>
+    <w:basedOn w:val="DefaultParagraphFont"/>
     <w:uiPriority w:val="32"/>
     <w:qFormat/>
     <w:rsid w:val="00B97640"/>
@@ -6734,17 +7181,17 @@
   </w:style>
   <w:style w:type="character" w:customStyle="1" w:styleId="normaltextrun">
     <w:name w:val="normaltextrun"/>
-    <w:basedOn w:val="Fuentedeprrafopredeter"/>
+    <w:basedOn w:val="DefaultParagraphFont"/>
     <w:rsid w:val="00B97640"/>
   </w:style>
   <w:style w:type="character" w:customStyle="1" w:styleId="eop">
     <w:name w:val="eop"/>
-    <w:basedOn w:val="Fuentedeprrafopredeter"/>
+    <w:basedOn w:val="DefaultParagraphFont"/>
     <w:rsid w:val="00B97640"/>
   </w:style>
-  <w:style w:type="character" w:styleId="Hipervnculo">
+  <w:style w:type="character" w:styleId="Hyperlink">
     <w:name w:val="Hyperlink"/>
-    <w:basedOn w:val="Fuentedeprrafopredeter"/>
+    <w:basedOn w:val="DefaultParagraphFont"/>
     <w:uiPriority w:val="99"/>
     <w:unhideWhenUsed/>
     <w:rsid w:val="00B97640"/>
@@ -6753,9 +7200,9 @@
       <w:u w:val="single"/>
     </w:rPr>
   </w:style>
-  <w:style w:type="table" w:styleId="Tablaconcuadrcula">
+  <w:style w:type="table" w:styleId="TableGrid">
     <w:name w:val="Table Grid"/>
-    <w:basedOn w:val="Tablanormal"/>
+    <w:basedOn w:val="TableNormal"/>
     <w:uiPriority w:val="39"/>
     <w:rsid w:val="00B97640"/>
     <w:pPr>
@@ -6772,9 +7219,9 @@
       </w:tblBorders>
     </w:tblPr>
   </w:style>
-  <w:style w:type="character" w:styleId="Textodelmarcadordeposicin">
+  <w:style w:type="character" w:styleId="PlaceholderText">
     <w:name w:val="Placeholder Text"/>
-    <w:basedOn w:val="Fuentedeprrafopredeter"/>
+    <w:basedOn w:val="DefaultParagraphFont"/>
     <w:uiPriority w:val="99"/>
     <w:semiHidden/>
     <w:rsid w:val="0011301A"/>

</xml_diff>